<commit_message>
TODO #1 — Personnages pré-tirés : 6 fiches D6 (équipage du Murmure)
Remplace le placeholder de la section 3 par 6 personnages pré-tirés avec
stat-blocks Star Wars D6 (WEG, éd. révisée) : Renna Calder (meneuse/liaison),
Dax « Fil » Orrin (slicer), Yssha Vel (infiltratrice twi'lek), Bren Sarkori
(pilote), Holt Marek (ex-sergent impérial), Ithra Wen (médecin-érudite,
réfugiée d'Alderaan). Synergies intégrées au scénario (slicer↔journal,
Ithra↔indice a & rapport avec Tana, Yssha↔repérage Skarn, Holt↔procédures ISB,
Bren↔exfiltration).

- brouillon source (scenario_fusion_draft.md) : section 3 rédigée
- generate_docx.js : helper pc() + rendu stat-blocks 2 colonnes
- docx régénéré et vérifié (rendu colonnes OK)

Co-Authored-By: Claude Opus 4.8 <noreply@anthropic.com>
</commit_message>
<xml_diff>
--- a/star-wars/scenarios/birth-of-the-death-squadron/docs/scenario_signal_detresse_FUSION.docx
+++ b/star-wars/scenarios/birth-of-the-death-squadron/docs/scenario_signal_detresse_FUSION.docx
@@ -1647,6 +1647,61 @@
         <w:t xml:space="preserve">3. Personnages pré-tirés</w:t>
       </w:r>
     </w:p>
+    <w:p>
+      <w:pPr>
+        <w:spacing w:after="120" w:line="264"/>
+        <w:jc w:val="both"/>
+      </w:pPr>
+      <w:r>
+        <w:t xml:space="preserve">Les personnages forment l'équipage du </w:t>
+      </w:r>
+      <w:r>
+        <w:rPr>
+          <w:b/>
+          <w:bCs/>
+        </w:rPr>
+        <w:t xml:space="preserve">Murmure</w:t>
+      </w:r>
+      <w:r>
+        <w:t xml:space="preserve">, un petit cargo léger qui a capté le signal de détresse chiffré de Tana et mis le cap sur Kessel-Tho. Le MJ les rattache à l'</w:t>
+      </w:r>
+      <w:r>
+        <w:rPr>
+          <w:b/>
+          <w:bCs/>
+        </w:rPr>
+        <w:t xml:space="preserve">Alliance naissante</w:t>
+      </w:r>
+      <w:r>
+        <w:t xml:space="preserve"> (cellule affiliée) ou les garde </w:t>
+      </w:r>
+      <w:r>
+        <w:rPr>
+          <w:b/>
+          <w:bCs/>
+        </w:rPr>
+        <w:t xml:space="preserve">francs-tireurs</w:t>
+      </w:r>
+      <w:r>
+        <w:t xml:space="preserve"> selon sa campagne. Toute sous-partie de 4 à 6 de ces profils forme un groupe jouable.</w:t>
+      </w:r>
+    </w:p>
+    <w:p>
+      <w:pPr>
+        <w:spacing w:after="120" w:line="264"/>
+        <w:jc w:val="both"/>
+      </w:pPr>
+      <w:r>
+        <w:rPr>
+          <w:b/>
+          <w:bCs/>
+        </w:rPr>
+        <w:t xml:space="preserve">Répartition des rôles.</w:t>
+      </w:r>
+      <w:r>
+        <w:t xml:space="preserve"> Meneuse (Renna) · slicer (Dax) · infiltration (Yssha) · pilotage &amp; extraction (Bren) · force &amp; procédures impériales (Holt) · soins, savoir &amp; lien avec Alderaan (Ithra).</w:t>
+      </w:r>
+    </w:p>
     <w:tbl>
       <w:tblPr>
         <w:tblW w:type="dxa" w:w="4592"/>
@@ -1676,30 +1731,6 @@
           </w:tcPr>
           <w:p>
             <w:pPr>
-              <w:spacing w:after="80"/>
-            </w:pPr>
-            <w:r>
-              <w:rPr>
-                <w:b/>
-                <w:bCs/>
-                <w:color w:val="8A1C1C"/>
-                <w:sz w:val="19"/>
-                <w:szCs w:val="19"/>
-              </w:rPr>
-              <w:t xml:space="preserve">À compléter (TODO MJ)</w:t>
-            </w:r>
-          </w:p>
-          <w:p>
-            <w:pPr>
-              <w:spacing w:after="60" w:line="258"/>
-              <w:jc w:val="both"/>
-            </w:pPr>
-            <w:r>
-              <w:t xml:space="preserve">Réservez ici les fiches des personnages pré-tirés (cellule / équipage ayant capté le signal de Tana). Emplacement prévu pour 4 à 6 fiches : identité, motivations, atouts utiles à une enquête d'infiltration (contacts, technique, discrétion, baratin, force).</w:t>
-            </w:r>
-          </w:p>
-          <w:p>
-            <w:pPr>
               <w:spacing w:after="60" w:line="258"/>
               <w:jc w:val="both"/>
             </w:pPr>
@@ -1708,7 +1739,21 @@
                 <w:i/>
                 <w:iCs/>
               </w:rPr>
-              <w:t xml:space="preserve">Section volontairement laissée vierge dans cette version.</w:t>
+              <w:t xml:space="preserve">Profils bâtis sur le gabarit standard </w:t>
+            </w:r>
+            <w:r>
+              <w:rPr>
+                <w:i/>
+                <w:iCs/>
+              </w:rPr>
+              <w:t xml:space="preserve">Star Wars D6</w:t>
+            </w:r>
+            <w:r>
+              <w:rPr>
+                <w:i/>
+                <w:iCs/>
+              </w:rPr>
+              <w:t xml:space="preserve"> (West End Games, édition révisée) : 18D d'attributs, ~7D de compétences, Déplacement 10. Ajustez librement. Attributs : Dextérité, Perception, Savoir, Vigueur, Mécanique, Technique. Les compétences non citées valent la valeur de leur attribut.</w:t>
             </w:r>
           </w:p>
         </w:tc>
@@ -1717,6 +1762,1153 @@
     <w:p>
       <w:pPr>
         <w:spacing w:after="80"/>
+      </w:pPr>
+    </w:p>
+    <w:p>
+      <w:pPr>
+        <w:pStyle w:val="Heading3"/>
+      </w:pPr>
+      <w:r>
+        <w:t xml:space="preserve">Renna Calder — Agent de liaison </w:t>
+      </w:r>
+      <w:r>
+        <w:rPr>
+          <w:i/>
+          <w:iCs/>
+        </w:rPr>
+        <w:t xml:space="preserve">(meneuse)</w:t>
+      </w:r>
+    </w:p>
+    <w:p>
+      <w:pPr>
+        <w:spacing w:after="70"/>
+      </w:pPr>
+      <w:r>
+        <w:rPr>
+          <w:i/>
+          <w:iCs/>
+          <w:color w:val="3A5A7A"/>
+          <w:sz w:val="18"/>
+          <w:szCs w:val="18"/>
+        </w:rPr>
+        <w:t xml:space="preserve">Humaine · femme · Chandrila · commandement, contacts, baratin</w:t>
+      </w:r>
+    </w:p>
+    <w:p>
+      <w:pPr>
+        <w:spacing w:after="24" w:line="246"/>
+        <w:jc w:val="both"/>
+      </w:pPr>
+      <w:r>
+        <w:rPr>
+          <w:b/>
+          <w:bCs/>
+        </w:rPr>
+        <w:t xml:space="preserve">DEXTÉRITÉ 2D+2</w:t>
+      </w:r>
+      <w:r>
+        <w:t xml:space="preserve"> — Blaster 3D+2, Esquive 3D+2</w:t>
+      </w:r>
+    </w:p>
+    <w:p>
+      <w:pPr>
+        <w:spacing w:after="24" w:line="246"/>
+        <w:jc w:val="both"/>
+      </w:pPr>
+      <w:r>
+        <w:rPr>
+          <w:b/>
+          <w:bCs/>
+        </w:rPr>
+        <w:t xml:space="preserve">PERCEPTION 4D</w:t>
+      </w:r>
+      <w:r>
+        <w:t xml:space="preserve"> — Baratin 5D, Commandement 5D, Marchandage 4D+2, Persuasion 4D+2</w:t>
+      </w:r>
+    </w:p>
+    <w:p>
+      <w:pPr>
+        <w:spacing w:after="24" w:line="246"/>
+        <w:jc w:val="both"/>
+      </w:pPr>
+      <w:r>
+        <w:rPr>
+          <w:b/>
+          <w:bCs/>
+        </w:rPr>
+        <w:t xml:space="preserve">SAVOIR 3D</w:t>
+      </w:r>
+      <w:r>
+        <w:t xml:space="preserve"> — Bureaucratie impériale 4D, Cultures 4D, Systèmes planétaires 3D+2</w:t>
+      </w:r>
+    </w:p>
+    <w:p>
+      <w:pPr>
+        <w:spacing w:after="24" w:line="246"/>
+        <w:jc w:val="both"/>
+      </w:pPr>
+      <w:r>
+        <w:rPr>
+          <w:b/>
+          <w:bCs/>
+        </w:rPr>
+        <w:t xml:space="preserve">VIGUEUR 2D</w:t>
+      </w:r>
+    </w:p>
+    <w:p>
+      <w:pPr>
+        <w:spacing w:after="24" w:line="246"/>
+        <w:jc w:val="both"/>
+      </w:pPr>
+      <w:r>
+        <w:rPr>
+          <w:b/>
+          <w:bCs/>
+        </w:rPr>
+        <w:t xml:space="preserve">MÉCANIQUE 3D</w:t>
+      </w:r>
+      <w:r>
+        <w:t xml:space="preserve"> — Communications 4D, Sensoreurs 3D+2</w:t>
+      </w:r>
+    </w:p>
+    <w:p>
+      <w:pPr>
+        <w:spacing w:after="24" w:line="246"/>
+        <w:jc w:val="both"/>
+      </w:pPr>
+      <w:r>
+        <w:rPr>
+          <w:b/>
+          <w:bCs/>
+        </w:rPr>
+        <w:t xml:space="preserve">TECHNIQUE 3D+1</w:t>
+      </w:r>
+      <w:r>
+        <w:t xml:space="preserve"> — Sécurité 3D+2</w:t>
+      </w:r>
+    </w:p>
+    <w:p>
+      <w:pPr>
+        <w:spacing w:after="24" w:line="246"/>
+        <w:jc w:val="both"/>
+      </w:pPr>
+      <w:r>
+        <w:rPr>
+          <w:b/>
+          <w:bCs/>
+        </w:rPr>
+        <w:t xml:space="preserve">Déplacement</w:t>
+      </w:r>
+      <w:r>
+        <w:t xml:space="preserve"> 10 · </w:t>
+      </w:r>
+      <w:r>
+        <w:rPr>
+          <w:b/>
+          <w:bCs/>
+        </w:rPr>
+        <w:t xml:space="preserve">Points de Force</w:t>
+      </w:r>
+      <w:r>
+        <w:t xml:space="preserve"> 1 · </w:t>
+      </w:r>
+      <w:r>
+        <w:rPr>
+          <w:b/>
+          <w:bCs/>
+        </w:rPr>
+        <w:t xml:space="preserve">Points de Personnage</w:t>
+      </w:r>
+      <w:r>
+        <w:t xml:space="preserve"> 5</w:t>
+      </w:r>
+    </w:p>
+    <w:p>
+      <w:pPr>
+        <w:spacing w:after="24" w:line="246"/>
+        <w:jc w:val="both"/>
+      </w:pPr>
+      <w:r>
+        <w:rPr>
+          <w:b/>
+          <w:bCs/>
+        </w:rPr>
+        <w:t xml:space="preserve">Équipement</w:t>
+      </w:r>
+      <w:r>
+        <w:t xml:space="preserve"> — blaster léger (holster discret), comlink chiffré, datapad de faux ordres, code-cylindre volé (périmé)</w:t>
+      </w:r>
+    </w:p>
+    <w:p>
+      <w:pPr>
+        <w:spacing w:after="24" w:line="246"/>
+        <w:jc w:val="both"/>
+      </w:pPr>
+      <w:r>
+        <w:rPr>
+          <w:i/>
+          <w:iCs/>
+        </w:rPr>
+        <w:t xml:space="preserve">Accroche — c'est elle qui a décodé l'en-tête du signal de Tana. Convaincue qu'il y a « plus gros que nous » derrière ; porte le poids de mener vers le danger des gens qu'elle aime.</w:t>
+      </w:r>
+    </w:p>
+    <w:p>
+      <w:pPr>
+        <w:spacing w:after="150"/>
+      </w:pPr>
+    </w:p>
+    <w:p>
+      <w:pPr>
+        <w:pStyle w:val="Heading3"/>
+      </w:pPr>
+      <w:r>
+        <w:t xml:space="preserve">Dax « Fil » Orrin — Slicer / technicien</w:t>
+      </w:r>
+    </w:p>
+    <w:p>
+      <w:pPr>
+        <w:spacing w:after="70"/>
+      </w:pPr>
+      <w:r>
+        <w:rPr>
+          <w:i/>
+          <w:iCs/>
+          <w:color w:val="3A5A7A"/>
+          <w:sz w:val="18"/>
+          <w:szCs w:val="18"/>
+        </w:rPr>
+        <w:t xml:space="preserve">Humain · homme · Corellia · réseaux, déchiffrement, portes verrouillées</w:t>
+      </w:r>
+    </w:p>
+    <w:p>
+      <w:pPr>
+        <w:spacing w:after="24" w:line="246"/>
+        <w:jc w:val="both"/>
+      </w:pPr>
+      <w:r>
+        <w:rPr>
+          <w:b/>
+          <w:bCs/>
+        </w:rPr>
+        <w:t xml:space="preserve">DEXTÉRITÉ 2D</w:t>
+      </w:r>
+      <w:r>
+        <w:t xml:space="preserve"> — Esquive 2D+2</w:t>
+      </w:r>
+    </w:p>
+    <w:p>
+      <w:pPr>
+        <w:spacing w:after="24" w:line="246"/>
+        <w:jc w:val="both"/>
+      </w:pPr>
+      <w:r>
+        <w:rPr>
+          <w:b/>
+          <w:bCs/>
+        </w:rPr>
+        <w:t xml:space="preserve">PERCEPTION 3D</w:t>
+      </w:r>
+      <w:r>
+        <w:t xml:space="preserve"> — Fouille 3D+2, Discrétion 3D+1</w:t>
+      </w:r>
+    </w:p>
+    <w:p>
+      <w:pPr>
+        <w:spacing w:after="24" w:line="246"/>
+        <w:jc w:val="both"/>
+      </w:pPr>
+      <w:r>
+        <w:rPr>
+          <w:b/>
+          <w:bCs/>
+        </w:rPr>
+        <w:t xml:space="preserve">SAVOIR 3D</w:t>
+      </w:r>
+      <w:r>
+        <w:t xml:space="preserve"> — Valeur (milieu) 3D+2, Technologie 4D</w:t>
+      </w:r>
+    </w:p>
+    <w:p>
+      <w:pPr>
+        <w:spacing w:after="24" w:line="246"/>
+        <w:jc w:val="both"/>
+      </w:pPr>
+      <w:r>
+        <w:rPr>
+          <w:b/>
+          <w:bCs/>
+        </w:rPr>
+        <w:t xml:space="preserve">VIGUEUR 2D</w:t>
+      </w:r>
+    </w:p>
+    <w:p>
+      <w:pPr>
+        <w:spacing w:after="24" w:line="246"/>
+        <w:jc w:val="both"/>
+      </w:pPr>
+      <w:r>
+        <w:rPr>
+          <w:b/>
+          <w:bCs/>
+        </w:rPr>
+        <w:t xml:space="preserve">MÉCANIQUE 3D</w:t>
+      </w:r>
+      <w:r>
+        <w:t xml:space="preserve"> — Communications 3D+2</w:t>
+      </w:r>
+    </w:p>
+    <w:p>
+      <w:pPr>
+        <w:spacing w:after="24" w:line="246"/>
+        <w:jc w:val="both"/>
+      </w:pPr>
+      <w:r>
+        <w:rPr>
+          <w:b/>
+          <w:bCs/>
+        </w:rPr>
+        <w:t xml:space="preserve">TECHNIQUE 5D</w:t>
+      </w:r>
+      <w:r>
+        <w:t xml:space="preserve"> — Programmation/réparation d'ordinateurs 6D, Sécurité 5D+2, Réparation de droïdes 5D+1</w:t>
+      </w:r>
+    </w:p>
+    <w:p>
+      <w:pPr>
+        <w:spacing w:after="24" w:line="246"/>
+        <w:jc w:val="both"/>
+      </w:pPr>
+      <w:r>
+        <w:rPr>
+          <w:b/>
+          <w:bCs/>
+        </w:rPr>
+        <w:t xml:space="preserve">Déplacement</w:t>
+      </w:r>
+      <w:r>
+        <w:t xml:space="preserve"> 10 · </w:t>
+      </w:r>
+      <w:r>
+        <w:rPr>
+          <w:b/>
+          <w:bCs/>
+        </w:rPr>
+        <w:t xml:space="preserve">Points de Force</w:t>
+      </w:r>
+      <w:r>
+        <w:t xml:space="preserve"> 1 · </w:t>
+      </w:r>
+      <w:r>
+        <w:rPr>
+          <w:b/>
+          <w:bCs/>
+        </w:rPr>
+        <w:t xml:space="preserve">Points de Personnage</w:t>
+      </w:r>
+      <w:r>
+        <w:t xml:space="preserve"> 5</w:t>
+      </w:r>
+    </w:p>
+    <w:p>
+      <w:pPr>
+        <w:spacing w:after="24" w:line="246"/>
+        <w:jc w:val="both"/>
+      </w:pPr>
+      <w:r>
+        <w:rPr>
+          <w:b/>
+          <w:bCs/>
+        </w:rPr>
+        <w:t xml:space="preserve">Équipement</w:t>
+      </w:r>
+      <w:r>
+        <w:t xml:space="preserve"> — datapad de slicing, kit de crochetage électronique (spikes), multitool, comlink</w:t>
+      </w:r>
+    </w:p>
+    <w:p>
+      <w:pPr>
+        <w:spacing w:after="24" w:line="246"/>
+        <w:jc w:val="both"/>
+      </w:pPr>
+      <w:r>
+        <w:rPr>
+          <w:i/>
+          <w:iCs/>
+        </w:rPr>
+        <w:t xml:space="preserve">Accroche — le seul à pouvoir dialoguer avec Bafouille d'égal à égal, et à mesurer ce qu'implique un déchiffrement Argon2. Tendance à foncer sur un terminal en oubliant la discrétion.</w:t>
+      </w:r>
+    </w:p>
+    <w:p>
+      <w:pPr>
+        <w:spacing w:after="150"/>
+      </w:pPr>
+    </w:p>
+    <w:p>
+      <w:pPr>
+        <w:pStyle w:val="Heading3"/>
+      </w:pPr>
+      <w:r>
+        <w:t xml:space="preserve">Yssha Vel — Éclaireuse / infiltratrice</w:t>
+      </w:r>
+    </w:p>
+    <w:p>
+      <w:pPr>
+        <w:spacing w:after="70"/>
+      </w:pPr>
+      <w:r>
+        <w:rPr>
+          <w:i/>
+          <w:iCs/>
+          <w:color w:val="3A5A7A"/>
+          <w:sz w:val="18"/>
+          <w:szCs w:val="18"/>
+        </w:rPr>
+        <w:t xml:space="preserve">Twi'lek · femme · Ryloth · discrétion, filature, repérage</w:t>
+      </w:r>
+    </w:p>
+    <w:p>
+      <w:pPr>
+        <w:spacing w:after="24" w:line="246"/>
+        <w:jc w:val="both"/>
+      </w:pPr>
+      <w:r>
+        <w:rPr>
+          <w:b/>
+          <w:bCs/>
+        </w:rPr>
+        <w:t xml:space="preserve">DEXTÉRITÉ 4D</w:t>
+      </w:r>
+      <w:r>
+        <w:t xml:space="preserve"> — Blaster 4D+1, Corps à corps 4D+1, Esquive 4D+2</w:t>
+      </w:r>
+    </w:p>
+    <w:p>
+      <w:pPr>
+        <w:spacing w:after="24" w:line="246"/>
+        <w:jc w:val="both"/>
+      </w:pPr>
+      <w:r>
+        <w:rPr>
+          <w:b/>
+          <w:bCs/>
+        </w:rPr>
+        <w:t xml:space="preserve">PERCEPTION 4D</w:t>
+      </w:r>
+      <w:r>
+        <w:t xml:space="preserve"> — Discrétion 5D+1, Fouille 4D+2, Pickpocket 4D+1</w:t>
+      </w:r>
+    </w:p>
+    <w:p>
+      <w:pPr>
+        <w:spacing w:after="24" w:line="246"/>
+        <w:jc w:val="both"/>
+      </w:pPr>
+      <w:r>
+        <w:rPr>
+          <w:b/>
+          <w:bCs/>
+        </w:rPr>
+        <w:t xml:space="preserve">SAVOIR 2D</w:t>
+      </w:r>
+      <w:r>
+        <w:t xml:space="preserve"> — Langues 2D+2</w:t>
+      </w:r>
+    </w:p>
+    <w:p>
+      <w:pPr>
+        <w:spacing w:after="24" w:line="246"/>
+        <w:jc w:val="both"/>
+      </w:pPr>
+      <w:r>
+        <w:rPr>
+          <w:b/>
+          <w:bCs/>
+        </w:rPr>
+        <w:t xml:space="preserve">VIGUEUR 3D</w:t>
+      </w:r>
+      <w:r>
+        <w:t xml:space="preserve"> — Escalade/saut 3D+2</w:t>
+      </w:r>
+    </w:p>
+    <w:p>
+      <w:pPr>
+        <w:spacing w:after="24" w:line="246"/>
+        <w:jc w:val="both"/>
+      </w:pPr>
+      <w:r>
+        <w:rPr>
+          <w:b/>
+          <w:bCs/>
+        </w:rPr>
+        <w:t xml:space="preserve">MÉCANIQUE 2D</w:t>
+      </w:r>
+    </w:p>
+    <w:p>
+      <w:pPr>
+        <w:spacing w:after="24" w:line="246"/>
+        <w:jc w:val="both"/>
+      </w:pPr>
+      <w:r>
+        <w:rPr>
+          <w:b/>
+          <w:bCs/>
+        </w:rPr>
+        <w:t xml:space="preserve">TECHNIQUE 3D</w:t>
+      </w:r>
+      <w:r>
+        <w:t xml:space="preserve"> — Sécurité 3D+2</w:t>
+      </w:r>
+    </w:p>
+    <w:p>
+      <w:pPr>
+        <w:spacing w:after="24" w:line="246"/>
+        <w:jc w:val="both"/>
+      </w:pPr>
+      <w:r>
+        <w:rPr>
+          <w:i/>
+          <w:iCs/>
+        </w:rPr>
+        <w:t xml:space="preserve">Capacité twi'lek — communication discrète par micro-mouvements des lekku.</w:t>
+      </w:r>
+    </w:p>
+    <w:p>
+      <w:pPr>
+        <w:spacing w:after="24" w:line="246"/>
+        <w:jc w:val="both"/>
+      </w:pPr>
+      <w:r>
+        <w:rPr>
+          <w:b/>
+          <w:bCs/>
+        </w:rPr>
+        <w:t xml:space="preserve">Déplacement</w:t>
+      </w:r>
+      <w:r>
+        <w:t xml:space="preserve"> 10 · </w:t>
+      </w:r>
+      <w:r>
+        <w:rPr>
+          <w:b/>
+          <w:bCs/>
+        </w:rPr>
+        <w:t xml:space="preserve">Points de Force</w:t>
+      </w:r>
+      <w:r>
+        <w:t xml:space="preserve"> 1 · </w:t>
+      </w:r>
+      <w:r>
+        <w:rPr>
+          <w:b/>
+          <w:bCs/>
+        </w:rPr>
+        <w:t xml:space="preserve">Points de Personnage</w:t>
+      </w:r>
+      <w:r>
+        <w:t xml:space="preserve"> 5</w:t>
+      </w:r>
+    </w:p>
+    <w:p>
+      <w:pPr>
+        <w:spacing w:after="24" w:line="246"/>
+        <w:jc w:val="both"/>
+      </w:pPr>
+      <w:r>
+        <w:rPr>
+          <w:b/>
+          <w:bCs/>
+        </w:rPr>
+        <w:t xml:space="preserve">Équipement</w:t>
+      </w:r>
+      <w:r>
+        <w:t xml:space="preserve"> — blaster hold-out, combinaison souple sombre, brouilleur de capteurs de proximité, macrojumelles</w:t>
+      </w:r>
+    </w:p>
+    <w:p>
+      <w:pPr>
+        <w:spacing w:after="24" w:line="246"/>
+        <w:jc w:val="both"/>
+      </w:pPr>
+      <w:r>
+        <w:rPr>
+          <w:i/>
+          <w:iCs/>
+        </w:rPr>
+        <w:t xml:space="preserve">Accroche — repère la filature de la commando Skarn avant tout le monde… si on l'écoute. A appris la discrétion en fuyant les rafles impériales de Ryloth.</w:t>
+      </w:r>
+    </w:p>
+    <w:p>
+      <w:pPr>
+        <w:spacing w:after="150"/>
+      </w:pPr>
+    </w:p>
+    <w:p>
+      <w:pPr>
+        <w:pStyle w:val="Heading3"/>
+      </w:pPr>
+      <w:r>
+        <w:t xml:space="preserve">Bren Sarkori — Pilote / franc-tireur</w:t>
+      </w:r>
+    </w:p>
+    <w:p>
+      <w:pPr>
+        <w:spacing w:after="70"/>
+      </w:pPr>
+      <w:r>
+        <w:rPr>
+          <w:i/>
+          <w:iCs/>
+          <w:color w:val="3A5A7A"/>
+          <w:sz w:val="18"/>
+          <w:szCs w:val="18"/>
+        </w:rPr>
+        <w:t xml:space="preserve">Humain · homme · Nar Shaddaa · pilotage, extraction, sang-froid</w:t>
+      </w:r>
+    </w:p>
+    <w:p>
+      <w:pPr>
+        <w:spacing w:after="24" w:line="246"/>
+        <w:jc w:val="both"/>
+      </w:pPr>
+      <w:r>
+        <w:rPr>
+          <w:b/>
+          <w:bCs/>
+        </w:rPr>
+        <w:t xml:space="preserve">DEXTÉRITÉ 3D</w:t>
+      </w:r>
+      <w:r>
+        <w:t xml:space="preserve"> — Blaster 4D, Esquive 3D+2</w:t>
+      </w:r>
+    </w:p>
+    <w:p>
+      <w:pPr>
+        <w:spacing w:after="24" w:line="246"/>
+        <w:jc w:val="both"/>
+      </w:pPr>
+      <w:r>
+        <w:rPr>
+          <w:b/>
+          <w:bCs/>
+        </w:rPr>
+        <w:t xml:space="preserve">PERCEPTION 3D</w:t>
+      </w:r>
+      <w:r>
+        <w:t xml:space="preserve"> — Baratin 3D+2, Jeu 3D+2</w:t>
+      </w:r>
+    </w:p>
+    <w:p>
+      <w:pPr>
+        <w:spacing w:after="24" w:line="246"/>
+        <w:jc w:val="both"/>
+      </w:pPr>
+      <w:r>
+        <w:rPr>
+          <w:b/>
+          <w:bCs/>
+        </w:rPr>
+        <w:t xml:space="preserve">SAVOIR 2D</w:t>
+      </w:r>
+      <w:r>
+        <w:t xml:space="preserve"> — Astrographie 2D+2</w:t>
+      </w:r>
+    </w:p>
+    <w:p>
+      <w:pPr>
+        <w:spacing w:after="24" w:line="246"/>
+        <w:jc w:val="both"/>
+      </w:pPr>
+      <w:r>
+        <w:rPr>
+          <w:b/>
+          <w:bCs/>
+        </w:rPr>
+        <w:t xml:space="preserve">VIGUEUR 2D+2</w:t>
+      </w:r>
+    </w:p>
+    <w:p>
+      <w:pPr>
+        <w:spacing w:after="24" w:line="246"/>
+        <w:jc w:val="both"/>
+      </w:pPr>
+      <w:r>
+        <w:rPr>
+          <w:b/>
+          <w:bCs/>
+        </w:rPr>
+        <w:t xml:space="preserve">MÉCANIQUE 4D</w:t>
+      </w:r>
+      <w:r>
+        <w:t xml:space="preserve"> — Pilotage spatial 5D, Artillerie spatiale 4D+2, Astrogation 4D+1, Sensoreurs 4D</w:t>
+      </w:r>
+    </w:p>
+    <w:p>
+      <w:pPr>
+        <w:spacing w:after="24" w:line="246"/>
+        <w:jc w:val="both"/>
+      </w:pPr>
+      <w:r>
+        <w:rPr>
+          <w:b/>
+          <w:bCs/>
+        </w:rPr>
+        <w:t xml:space="preserve">TECHNIQUE 3D+1</w:t>
+      </w:r>
+      <w:r>
+        <w:t xml:space="preserve"> — Réparation de vaisseaux 4D</w:t>
+      </w:r>
+    </w:p>
+    <w:p>
+      <w:pPr>
+        <w:spacing w:after="24" w:line="246"/>
+        <w:jc w:val="both"/>
+      </w:pPr>
+      <w:r>
+        <w:rPr>
+          <w:b/>
+          <w:bCs/>
+        </w:rPr>
+        <w:t xml:space="preserve">Déplacement</w:t>
+      </w:r>
+      <w:r>
+        <w:t xml:space="preserve"> 10 · </w:t>
+      </w:r>
+      <w:r>
+        <w:rPr>
+          <w:b/>
+          <w:bCs/>
+        </w:rPr>
+        <w:t xml:space="preserve">Points de Force</w:t>
+      </w:r>
+      <w:r>
+        <w:t xml:space="preserve"> 1 · </w:t>
+      </w:r>
+      <w:r>
+        <w:rPr>
+          <w:b/>
+          <w:bCs/>
+        </w:rPr>
+        <w:t xml:space="preserve">Points de Personnage</w:t>
+      </w:r>
+      <w:r>
+        <w:t xml:space="preserve"> 5</w:t>
+      </w:r>
+    </w:p>
+    <w:p>
+      <w:pPr>
+        <w:spacing w:after="24" w:line="246"/>
+        <w:jc w:val="both"/>
+      </w:pPr>
+      <w:r>
+        <w:rPr>
+          <w:b/>
+          <w:bCs/>
+        </w:rPr>
+        <w:t xml:space="preserve">Équipement</w:t>
+      </w:r>
+      <w:r>
+        <w:t xml:space="preserve"> — blaster lourd, veste de vol, comlink, les clés du </w:t>
+      </w:r>
+      <w:r>
+        <w:rPr>
+          <w:i/>
+          <w:iCs/>
+        </w:rPr>
+        <w:t xml:space="preserve">Murmure</w:t>
+      </w:r>
+    </w:p>
+    <w:p>
+      <w:pPr>
+        <w:spacing w:after="24" w:line="246"/>
+        <w:jc w:val="both"/>
+      </w:pPr>
+      <w:r>
+        <w:rPr>
+          <w:i/>
+          <w:iCs/>
+        </w:rPr>
+        <w:t xml:space="preserve">Accroche — capitaine-pilote du Murmure. Garde le vaisseau chaud sur l'aire d'amarrage : le plan d'extraction, c'est lui. Déteste rester à quai à attendre.</w:t>
+      </w:r>
+    </w:p>
+    <w:p>
+      <w:pPr>
+        <w:spacing w:after="150"/>
+      </w:pPr>
+    </w:p>
+    <w:p>
+      <w:pPr>
+        <w:pStyle w:val="Heading3"/>
+      </w:pPr>
+      <w:r>
+        <w:t xml:space="preserve">Holt Marek — Ancien sergent impérial </w:t>
+      </w:r>
+      <w:r>
+        <w:rPr>
+          <w:i/>
+          <w:iCs/>
+        </w:rPr>
+        <w:t xml:space="preserve">(déserteur)</w:t>
+      </w:r>
+    </w:p>
+    <w:p>
+      <w:pPr>
+        <w:spacing w:after="70"/>
+      </w:pPr>
+      <w:r>
+        <w:rPr>
+          <w:i/>
+          <w:iCs/>
+          <w:color w:val="3A5A7A"/>
+          <w:sz w:val="18"/>
+          <w:szCs w:val="18"/>
+        </w:rPr>
+        <w:t xml:space="preserve">Humain · homme · monde de garnison · force, sécurité, procédures impériales</w:t>
+      </w:r>
+    </w:p>
+    <w:p>
+      <w:pPr>
+        <w:spacing w:after="24" w:line="246"/>
+        <w:jc w:val="both"/>
+      </w:pPr>
+      <w:r>
+        <w:rPr>
+          <w:b/>
+          <w:bCs/>
+        </w:rPr>
+        <w:t xml:space="preserve">DEXTÉRITÉ 4D</w:t>
+      </w:r>
+      <w:r>
+        <w:t xml:space="preserve"> — Blaster 5D, Armes lourdes 4D+2, Esquive 4D+1</w:t>
+      </w:r>
+    </w:p>
+    <w:p>
+      <w:pPr>
+        <w:spacing w:after="24" w:line="246"/>
+        <w:jc w:val="both"/>
+      </w:pPr>
+      <w:r>
+        <w:rPr>
+          <w:b/>
+          <w:bCs/>
+        </w:rPr>
+        <w:t xml:space="preserve">PERCEPTION 3D</w:t>
+      </w:r>
+      <w:r>
+        <w:t xml:space="preserve"> — Commandement 3D+2, Intimidation 4D</w:t>
+      </w:r>
+    </w:p>
+    <w:p>
+      <w:pPr>
+        <w:spacing w:after="24" w:line="246"/>
+        <w:jc w:val="both"/>
+      </w:pPr>
+      <w:r>
+        <w:rPr>
+          <w:b/>
+          <w:bCs/>
+        </w:rPr>
+        <w:t xml:space="preserve">SAVOIR 3D</w:t>
+      </w:r>
+      <w:r>
+        <w:t xml:space="preserve"> — Bureaucratie impériale 3D+2, Tactique militaire 3D+2</w:t>
+      </w:r>
+    </w:p>
+    <w:p>
+      <w:pPr>
+        <w:spacing w:after="24" w:line="246"/>
+        <w:jc w:val="both"/>
+      </w:pPr>
+      <w:r>
+        <w:rPr>
+          <w:b/>
+          <w:bCs/>
+        </w:rPr>
+        <w:t xml:space="preserve">VIGUEUR 3D</w:t>
+      </w:r>
+      <w:r>
+        <w:t xml:space="preserve"> — Bagarre 4D, Encaissement 4D</w:t>
+      </w:r>
+    </w:p>
+    <w:p>
+      <w:pPr>
+        <w:spacing w:after="24" w:line="246"/>
+        <w:jc w:val="both"/>
+      </w:pPr>
+      <w:r>
+        <w:rPr>
+          <w:b/>
+          <w:bCs/>
+        </w:rPr>
+        <w:t xml:space="preserve">MÉCANIQUE 2D</w:t>
+      </w:r>
+    </w:p>
+    <w:p>
+      <w:pPr>
+        <w:spacing w:after="24" w:line="246"/>
+        <w:jc w:val="both"/>
+      </w:pPr>
+      <w:r>
+        <w:rPr>
+          <w:b/>
+          <w:bCs/>
+        </w:rPr>
+        <w:t xml:space="preserve">TECHNIQUE 3D</w:t>
+      </w:r>
+      <w:r>
+        <w:t xml:space="preserve"> — Sécurité 4D, Premiers soins 3D+2</w:t>
+      </w:r>
+    </w:p>
+    <w:p>
+      <w:pPr>
+        <w:spacing w:after="24" w:line="246"/>
+        <w:jc w:val="both"/>
+      </w:pPr>
+      <w:r>
+        <w:rPr>
+          <w:b/>
+          <w:bCs/>
+        </w:rPr>
+        <w:t xml:space="preserve">Déplacement</w:t>
+      </w:r>
+      <w:r>
+        <w:t xml:space="preserve"> 10 · </w:t>
+      </w:r>
+      <w:r>
+        <w:rPr>
+          <w:b/>
+          <w:bCs/>
+        </w:rPr>
+        <w:t xml:space="preserve">Points de Force</w:t>
+      </w:r>
+      <w:r>
+        <w:t xml:space="preserve"> 1 · </w:t>
+      </w:r>
+      <w:r>
+        <w:rPr>
+          <w:b/>
+          <w:bCs/>
+        </w:rPr>
+        <w:t xml:space="preserve">Points de Personnage</w:t>
+      </w:r>
+      <w:r>
+        <w:t xml:space="preserve"> 5</w:t>
+      </w:r>
+    </w:p>
+    <w:p>
+      <w:pPr>
+        <w:spacing w:after="24" w:line="246"/>
+        <w:jc w:val="both"/>
+      </w:pPr>
+      <w:r>
+        <w:rPr>
+          <w:b/>
+          <w:bCs/>
+        </w:rPr>
+        <w:t xml:space="preserve">Équipement</w:t>
+      </w:r>
+      <w:r>
+        <w:t xml:space="preserve"> — blaster E-11 « emprunté », armure légère sous vareuse civile, code-cylindre impérial périmé, plaques d'identité arrachées</w:t>
+      </w:r>
+    </w:p>
+    <w:p>
+      <w:pPr>
+        <w:spacing w:after="24" w:line="246"/>
+        <w:jc w:val="both"/>
+      </w:pPr>
+      <w:r>
+        <w:rPr>
+          <w:i/>
+          <w:iCs/>
+        </w:rPr>
+        <w:t xml:space="preserve">Accroche — connaît de l'intérieur les protocoles d'une station-relais et les manies de l'ISB : inestimable pour lire la menace Rennard. Chaque uniforme impérial croisé réveille ce qu'il a fui.</w:t>
+      </w:r>
+    </w:p>
+    <w:p>
+      <w:pPr>
+        <w:spacing w:after="150"/>
+      </w:pPr>
+    </w:p>
+    <w:p>
+      <w:pPr>
+        <w:pStyle w:val="Heading3"/>
+      </w:pPr>
+      <w:r>
+        <w:t xml:space="preserve">Ithra Wen — Médecin de bord / érudite</w:t>
+      </w:r>
+    </w:p>
+    <w:p>
+      <w:pPr>
+        <w:spacing w:after="70"/>
+      </w:pPr>
+      <w:r>
+        <w:rPr>
+          <w:i/>
+          <w:iCs/>
+          <w:color w:val="3A5A7A"/>
+          <w:sz w:val="18"/>
+          <w:szCs w:val="18"/>
+        </w:rPr>
+        <w:t xml:space="preserve">Humaine · femme · réfugiée d'Alderaan · soins, savoir, histoire alderaanienne</w:t>
+      </w:r>
+    </w:p>
+    <w:p>
+      <w:pPr>
+        <w:spacing w:after="24" w:line="246"/>
+        <w:jc w:val="both"/>
+      </w:pPr>
+      <w:r>
+        <w:rPr>
+          <w:b/>
+          <w:bCs/>
+        </w:rPr>
+        <w:t xml:space="preserve">DEXTÉRITÉ 2D</w:t>
+      </w:r>
+      <w:r>
+        <w:t xml:space="preserve"> — Esquive 2D+2</w:t>
+      </w:r>
+    </w:p>
+    <w:p>
+      <w:pPr>
+        <w:spacing w:after="24" w:line="246"/>
+        <w:jc w:val="both"/>
+      </w:pPr>
+      <w:r>
+        <w:rPr>
+          <w:b/>
+          <w:bCs/>
+        </w:rPr>
+        <w:t xml:space="preserve">PERCEPTION 3D</w:t>
+      </w:r>
+      <w:r>
+        <w:t xml:space="preserve"> — Baratin 3D+2, Persuasion 4D</w:t>
+      </w:r>
+    </w:p>
+    <w:p>
+      <w:pPr>
+        <w:spacing w:after="24" w:line="246"/>
+        <w:jc w:val="both"/>
+      </w:pPr>
+      <w:r>
+        <w:rPr>
+          <w:b/>
+          <w:bCs/>
+        </w:rPr>
+        <w:t xml:space="preserve">SAVOIR 4D</w:t>
+      </w:r>
+      <w:r>
+        <w:t xml:space="preserve"> — Cultures 5D, Histoire alderaanienne &amp; républicaine 5D, Langues 4D+2</w:t>
+      </w:r>
+    </w:p>
+    <w:p>
+      <w:pPr>
+        <w:spacing w:after="24" w:line="246"/>
+        <w:jc w:val="both"/>
+      </w:pPr>
+      <w:r>
+        <w:rPr>
+          <w:b/>
+          <w:bCs/>
+        </w:rPr>
+        <w:t xml:space="preserve">VIGUEUR 3D</w:t>
+      </w:r>
+    </w:p>
+    <w:p>
+      <w:pPr>
+        <w:spacing w:after="24" w:line="246"/>
+        <w:jc w:val="both"/>
+      </w:pPr>
+      <w:r>
+        <w:rPr>
+          <w:b/>
+          <w:bCs/>
+        </w:rPr>
+        <w:t xml:space="preserve">MÉCANIQUE 2D</w:t>
+      </w:r>
+    </w:p>
+    <w:p>
+      <w:pPr>
+        <w:spacing w:after="24" w:line="246"/>
+        <w:jc w:val="both"/>
+      </w:pPr>
+      <w:r>
+        <w:rPr>
+          <w:b/>
+          <w:bCs/>
+        </w:rPr>
+        <w:t xml:space="preserve">TECHNIQUE 4D</w:t>
+      </w:r>
+      <w:r>
+        <w:t xml:space="preserve"> — Premiers soins 5D, (A) Médecine 4D+2</w:t>
+      </w:r>
+    </w:p>
+    <w:p>
+      <w:pPr>
+        <w:spacing w:after="24" w:line="246"/>
+        <w:jc w:val="both"/>
+      </w:pPr>
+      <w:r>
+        <w:rPr>
+          <w:b/>
+          <w:bCs/>
+        </w:rPr>
+        <w:t xml:space="preserve">Déplacement</w:t>
+      </w:r>
+      <w:r>
+        <w:t xml:space="preserve"> 10 · </w:t>
+      </w:r>
+      <w:r>
+        <w:rPr>
+          <w:b/>
+          <w:bCs/>
+        </w:rPr>
+        <w:t xml:space="preserve">Points de Force</w:t>
+      </w:r>
+      <w:r>
+        <w:t xml:space="preserve"> 2 · </w:t>
+      </w:r>
+      <w:r>
+        <w:rPr>
+          <w:b/>
+          <w:bCs/>
+        </w:rPr>
+        <w:t xml:space="preserve">Points de Personnage</w:t>
+      </w:r>
+      <w:r>
+        <w:t xml:space="preserve"> 5</w:t>
+      </w:r>
+    </w:p>
+    <w:p>
+      <w:pPr>
+        <w:spacing w:after="24" w:line="246"/>
+        <w:jc w:val="both"/>
+      </w:pPr>
+      <w:r>
+        <w:rPr>
+          <w:b/>
+          <w:bCs/>
+        </w:rPr>
+        <w:t xml:space="preserve">Équipement</w:t>
+      </w:r>
+      <w:r>
+        <w:t xml:space="preserve"> — trousse médicale de campagne, injecteurs de stims, exemplaire annoté d'un ouvrage d'histoire alderaanienne</w:t>
+      </w:r>
+    </w:p>
+    <w:p>
+      <w:pPr>
+        <w:spacing w:after="24" w:line="246"/>
+        <w:jc w:val="both"/>
+      </w:pPr>
+      <w:r>
+        <w:rPr>
+          <w:i/>
+          <w:iCs/>
+        </w:rPr>
+        <w:t xml:space="preserve">Accroche — comme Tana, elle a vu Alderaan mourir. C'est elle qui reconnaît d'emblée les trois noms de l'indice (a) comme des figures réelles, et qui gagnera le plus vite la confiance de Tana. Le deuil la rend parfois imprudente face à l'Empire.</w:t>
+      </w:r>
+    </w:p>
+    <w:p>
+      <w:pPr>
+        <w:spacing w:after="150"/>
       </w:pPr>
     </w:p>
     <w:p>

</xml_diff>

<commit_message>
TODO #2 — Horloge ISB : mécanique de triangulation en 6 crans
Remplace le « compte à rebours » flou par un moteur de tension pilotable :
- piste en 6 crans, chacun changeant concrètement la situation (jusqu'au
  verrouillage de la station au cran 6) ;
- avance passive (+1 par quart ou par scène-clé) + bavures chiffrées
  (mineure +1 / majeure +2) avec déclencheurs concrets ;
- leviers de ralentissement (-1 : désinformation, Holt via procédures ISB,
  diversion) ;
- signes à télégraphier + pilotage caché + variantes de départ.
Se branche sur #3 (événements), #4 (rayonnements) et le pré-tiré Holt Marek.

Co-Authored-By: Claude Opus 4.8 <noreply@anthropic.com>
</commit_message>
<xml_diff>
--- a/star-wars/scenarios/birth-of-the-death-squadron/docs/scenario_signal_detresse_FUSION.docx
+++ b/star-wars/scenarios/birth-of-the-death-squadron/docs/scenario_signal_detresse_FUSION.docx
@@ -846,7 +846,7 @@
         <w:pStyle w:val="Heading2"/>
       </w:pPr>
       <w:r>
-        <w:t xml:space="preserve">La menace : le compte à rebours ISB</w:t>
+        <w:t xml:space="preserve">La menace : l'horloge ISB (la triangulation)</w:t>
       </w:r>
     </w:p>
     <w:p>
@@ -855,7 +855,17 @@
         <w:jc w:val="both"/>
       </w:pPr>
       <w:r>
-        <w:t xml:space="preserve">L'anomalie de rebond de fréquence qui a permis l'interception a aussi trahi son existence. Une équipe restreinte du </w:t>
+        <w:t xml:space="preserve">Le </w:t>
+      </w:r>
+      <w:r>
+        <w:rPr>
+          <w:b/>
+          <w:bCs/>
+        </w:rPr>
+        <w:t xml:space="preserve">moteur de tension</w:t>
+      </w:r>
+      <w:r>
+        <w:t xml:space="preserve"> du scénario. Une équipe restreinte du </w:t>
       </w:r>
       <w:r>
         <w:rPr>
@@ -865,80 +875,67 @@
         <w:t xml:space="preserve">Bureau de Sécurité Impériale</w:t>
       </w:r>
       <w:r>
-        <w:t xml:space="preserve"> ratisse les stations-relais du secteur pour en localiser la source :</w:t>
-      </w:r>
-    </w:p>
-    <w:p>
-      <w:pPr>
-        <w:pStyle w:val="ListParagraph"/>
-        <w:numPr>
-          <w:ilvl w:val="0"/>
-          <w:numId w:val="2"/>
-        </w:numPr>
-        <w:spacing w:after="60" w:line="260"/>
-        <w:jc w:val="both"/>
-      </w:pPr>
-      <w:r>
-        <w:rPr>
-          <w:b/>
-          <w:bCs/>
-        </w:rPr>
-        <w:t xml:space="preserve">Agent Ivo Rennard</w:t>
-      </w:r>
-      <w:r>
-        <w:t xml:space="preserve"> — le chasseur méthodique, ne bluffe jamais.</w:t>
-      </w:r>
-    </w:p>
-    <w:p>
-      <w:pPr>
-        <w:pStyle w:val="ListParagraph"/>
-        <w:numPr>
-          <w:ilvl w:val="0"/>
-          <w:numId w:val="2"/>
-        </w:numPr>
-        <w:spacing w:after="60" w:line="260"/>
-        <w:jc w:val="both"/>
-      </w:pPr>
-      <w:r>
-        <w:rPr>
-          <w:b/>
-          <w:bCs/>
-        </w:rPr>
-        <w:t xml:space="preserve">Analyste Sorae Vint</w:t>
-      </w:r>
-      <w:r>
-        <w:t xml:space="preserve"> — retrace le rebond ; </w:t>
-      </w:r>
-      <w:r>
-        <w:rPr>
-          <w:b/>
-          <w:bCs/>
-        </w:rPr>
-        <w:t xml:space="preserve">sa progression = l'horloge réelle</w:t>
-      </w:r>
-      <w:r>
-        <w:t xml:space="preserve">.</w:t>
-      </w:r>
-    </w:p>
-    <w:p>
-      <w:pPr>
-        <w:pStyle w:val="ListParagraph"/>
-        <w:numPr>
-          <w:ilvl w:val="0"/>
-          <w:numId w:val="2"/>
-        </w:numPr>
-        <w:spacing w:after="60" w:line="260"/>
-        <w:jc w:val="both"/>
-      </w:pPr>
-      <w:r>
-        <w:rPr>
-          <w:b/>
-          <w:bCs/>
-        </w:rPr>
-        <w:t xml:space="preserve">Commandos Ferrus &amp; Skarn</w:t>
-      </w:r>
-      <w:r>
-        <w:t xml:space="preserve"> — la menace physique, si l'enquête débouche sur une prise.</w:t>
+        <w:t xml:space="preserve"> — l'agent </w:t>
+      </w:r>
+      <w:r>
+        <w:rPr>
+          <w:b/>
+          <w:bCs/>
+        </w:rPr>
+        <w:t xml:space="preserve">Rennard</w:t>
+      </w:r>
+      <w:r>
+        <w:t xml:space="preserve">, l'analyste </w:t>
+      </w:r>
+      <w:r>
+        <w:rPr>
+          <w:b/>
+          <w:bCs/>
+        </w:rPr>
+        <w:t xml:space="preserve">Sorae Vint</w:t>
+      </w:r>
+      <w:r>
+        <w:t xml:space="preserve">, les commandos </w:t>
+      </w:r>
+      <w:r>
+        <w:rPr>
+          <w:b/>
+          <w:bCs/>
+        </w:rPr>
+        <w:t xml:space="preserve">Ferrus &amp; Skarn</w:t>
+      </w:r>
+      <w:r>
+        <w:t xml:space="preserve"> (fiches en §4.7) — ratisse le secteur. Vint retrace pas à pas le </w:t>
+      </w:r>
+      <w:r>
+        <w:rPr>
+          <w:b/>
+          <w:bCs/>
+        </w:rPr>
+        <w:t xml:space="preserve">rebond de fréquence</w:t>
+      </w:r>
+      <w:r>
+        <w:t xml:space="preserve"> qui a trahi l'interception. Ce n'est pas « l'Empire soupçonne les PJ » : c'est l'Empire qui </w:t>
+      </w:r>
+      <w:r>
+        <w:rPr>
+          <w:b/>
+          <w:bCs/>
+        </w:rPr>
+        <w:t xml:space="preserve">resserre l'endroit</w:t>
+      </w:r>
+      <w:r>
+        <w:t xml:space="preserve"> d'où le signal est parti — et cet endroit converge vers Kessel-Tho, puis la DMZ et le journal, puis Tana et ceux qui l'aident. La triangulation est </w:t>
+      </w:r>
+      <w:r>
+        <w:rPr>
+          <w:b/>
+          <w:bCs/>
+        </w:rPr>
+        <w:t xml:space="preserve">inexorable</w:t>
+      </w:r>
+      <w:r>
+        <w:t xml:space="preserve"> : elle avance toujours.</w:t>
       </w:r>
     </w:p>
     <w:p>
@@ -947,17 +944,461 @@
         <w:jc w:val="both"/>
       </w:pPr>
       <w:r>
-        <w:t xml:space="preserve">Le MJ gère cette pression comme un </w:t>
-      </w:r>
-      <w:r>
-        <w:rPr>
-          <w:b/>
-          <w:bCs/>
-        </w:rPr>
-        <w:t xml:space="preserve">compte à rebours</w:t>
-      </w:r>
-      <w:r>
-        <w:t xml:space="preserve"> : chaque erreur visible des PJ (question de trop, effraction repérée, PNJ alarmé) fait avancer Vint. Quand elle boucle sa triangulation, l'ISB verrouille la station.</w:t>
+        <w:rPr>
+          <w:b/>
+          <w:bCs/>
+        </w:rPr>
+        <w:t xml:space="preserve">La piste — 6 crans.</w:t>
+      </w:r>
+      <w:r>
+        <w:t xml:space="preserve"> L'horloge démarre au </w:t>
+      </w:r>
+      <w:r>
+        <w:rPr>
+          <w:b/>
+          <w:bCs/>
+        </w:rPr>
+        <w:t xml:space="preserve">cran 2</w:t>
+      </w:r>
+      <w:r>
+        <w:t xml:space="preserve"> (l'équipe arrive sur Kessel-Tho, parmi d'autres stations ratissées). Chaque cran change concrètement la situation :</w:t>
+      </w:r>
+    </w:p>
+    <w:p>
+      <w:pPr>
+        <w:pStyle w:val="ListParagraph"/>
+        <w:numPr>
+          <w:ilvl w:val="0"/>
+          <w:numId w:val="2"/>
+        </w:numPr>
+        <w:spacing w:after="60" w:line="260"/>
+        <w:jc w:val="both"/>
+      </w:pPr>
+      <w:r>
+        <w:rPr>
+          <w:b/>
+          <w:bCs/>
+        </w:rPr>
+        <w:t xml:space="preserve">Cran 1 — Ratissage large.</w:t>
+      </w:r>
+      <w:r>
+        <w:t xml:space="preserve"> L'équipe est encore ailleurs dans le secteur. </w:t>
+      </w:r>
+      <w:r>
+        <w:rPr>
+          <w:i/>
+          <w:iCs/>
+        </w:rPr>
+        <w:t xml:space="preserve">(Départ possible pour une intro plus lente.)</w:t>
+      </w:r>
+    </w:p>
+    <w:p>
+      <w:pPr>
+        <w:pStyle w:val="ListParagraph"/>
+        <w:numPr>
+          <w:ilvl w:val="0"/>
+          <w:numId w:val="2"/>
+        </w:numPr>
+        <w:spacing w:after="60" w:line="260"/>
+        <w:jc w:val="both"/>
+      </w:pPr>
+      <w:r>
+        <w:rPr>
+          <w:b/>
+          <w:bCs/>
+        </w:rPr>
+        <w:t xml:space="preserve">Cran 2 — Arrivée.</w:t>
+      </w:r>
+      <w:r>
+        <w:t xml:space="preserve"> Rennard prend ses quartiers (zone commandos, N3). Skarn amorce une reconnaissance discrète du quai et des niveaux publics. </w:t>
+      </w:r>
+      <w:r>
+        <w:rPr>
+          <w:i/>
+          <w:iCs/>
+        </w:rPr>
+        <w:t xml:space="preserve">Départ recommandé.</w:t>
+      </w:r>
+    </w:p>
+    <w:p>
+      <w:pPr>
+        <w:pStyle w:val="ListParagraph"/>
+        <w:numPr>
+          <w:ilvl w:val="0"/>
+          <w:numId w:val="2"/>
+        </w:numPr>
+        <w:spacing w:after="60" w:line="260"/>
+        <w:jc w:val="both"/>
+      </w:pPr>
+      <w:r>
+        <w:rPr>
+          <w:b/>
+          <w:bCs/>
+        </w:rPr>
+        <w:t xml:space="preserve">Cran 3 — Corrélation.</w:t>
+      </w:r>
+      <w:r>
+        <w:t xml:space="preserve"> Vint relie le rebond à Kessel-Tho précisément. Contrôles d'accès renforcés ; premiers entretiens avec le personnel (Aashe, Kallan, garnison).</w:t>
+      </w:r>
+    </w:p>
+    <w:p>
+      <w:pPr>
+        <w:pStyle w:val="ListParagraph"/>
+        <w:numPr>
+          <w:ilvl w:val="0"/>
+          <w:numId w:val="2"/>
+        </w:numPr>
+        <w:spacing w:after="60" w:line="260"/>
+        <w:jc w:val="both"/>
+      </w:pPr>
+      <w:r>
+        <w:rPr>
+          <w:b/>
+          <w:bCs/>
+        </w:rPr>
+        <w:t xml:space="preserve">Cran 4 — Le trafic de fréquences.</w:t>
+      </w:r>
+      <w:r>
+        <w:t xml:space="preserve"> Rennard réquisitionne les registres (capitainerie, transmissions). </w:t>
+      </w:r>
+      <w:r>
+        <w:rPr>
+          <w:b/>
+          <w:bCs/>
+        </w:rPr>
+        <w:t xml:space="preserve">Tout départ de vaisseau exige désormais un feu vert de l'ISB.</w:t>
+      </w:r>
+      <w:r>
+        <w:t xml:space="preserve"> L'étau se resserre sur la DMZ.</w:t>
+      </w:r>
+    </w:p>
+    <w:p>
+      <w:pPr>
+        <w:pStyle w:val="ListParagraph"/>
+        <w:numPr>
+          <w:ilvl w:val="0"/>
+          <w:numId w:val="2"/>
+        </w:numPr>
+        <w:spacing w:after="60" w:line="260"/>
+        <w:jc w:val="both"/>
+      </w:pPr>
+      <w:r>
+        <w:rPr>
+          <w:b/>
+          <w:bCs/>
+        </w:rPr>
+        <w:t xml:space="preserve">Cran 5 — Les faux clients.</w:t>
+      </w:r>
+      <w:r>
+        <w:t xml:space="preserve"> Vint isole l'anomalie des trois alias. L'ISB cherche activement « Doiron » : la boutique est surveillée, les contacts de Tana (re)interrogés.</w:t>
+      </w:r>
+    </w:p>
+    <w:p>
+      <w:pPr>
+        <w:pStyle w:val="ListParagraph"/>
+        <w:numPr>
+          <w:ilvl w:val="0"/>
+          <w:numId w:val="2"/>
+        </w:numPr>
+        <w:spacing w:after="60" w:line="260"/>
+        <w:jc w:val="both"/>
+      </w:pPr>
+      <w:r>
+        <w:rPr>
+          <w:b/>
+          <w:bCs/>
+        </w:rPr>
+        <w:t xml:space="preserve">Cran 6 — VERROUILLAGE.</w:t>
+      </w:r>
+      <w:r>
+        <w:t xml:space="preserve"> Station bouclée : quais fermés, tout départ inspecté, Ferrus et Skarn en intervention. Chasse ouverte à Tana et à quiconque la couvre. </w:t>
+      </w:r>
+      <w:r>
+        <w:rPr>
+          <w:i/>
+          <w:iCs/>
+        </w:rPr>
+        <w:t xml:space="preserve">Le climax se joue maintenant, de gré ou de force.</w:t>
+      </w:r>
+    </w:p>
+    <w:p>
+      <w:pPr>
+        <w:keepNext/>
+        <w:spacing w:before="40" w:after="60"/>
+      </w:pPr>
+      <w:r>
+        <w:rPr>
+          <w:b/>
+          <w:bCs/>
+          <w:color w:val="8A1C1C"/>
+          <w:sz w:val="19"/>
+          <w:szCs w:val="19"/>
+        </w:rPr>
+        <w:t xml:space="preserve">Ce qui fait avancer l'horloge</w:t>
+      </w:r>
+    </w:p>
+    <w:p>
+      <w:pPr>
+        <w:pStyle w:val="ListParagraph"/>
+        <w:numPr>
+          <w:ilvl w:val="0"/>
+          <w:numId w:val="2"/>
+        </w:numPr>
+        <w:spacing w:after="60" w:line="260"/>
+        <w:jc w:val="both"/>
+      </w:pPr>
+      <w:r>
+        <w:rPr>
+          <w:b/>
+          <w:bCs/>
+        </w:rPr>
+        <w:t xml:space="preserve">Avance passive (le temps) :</w:t>
+      </w:r>
+      <w:r>
+        <w:t xml:space="preserve"> +1 cran par </w:t>
+      </w:r>
+      <w:r>
+        <w:rPr>
+          <w:b/>
+          <w:bCs/>
+        </w:rPr>
+        <w:t xml:space="preserve">quart</w:t>
+      </w:r>
+      <w:r>
+        <w:t xml:space="preserve"> écoulé (~8 h de fiction). À défaut de suivre l'heure, comptez +1 après chaque </w:t>
+      </w:r>
+      <w:r>
+        <w:rPr>
+          <w:b/>
+          <w:bCs/>
+        </w:rPr>
+        <w:t xml:space="preserve">scène-clé</w:t>
+      </w:r>
+      <w:r>
+        <w:t xml:space="preserve"> (indice bouclé, changement de niveau majeur). L'horloge ne recule jamais d'elle-même.</w:t>
+      </w:r>
+    </w:p>
+    <w:p>
+      <w:pPr>
+        <w:pStyle w:val="ListParagraph"/>
+        <w:numPr>
+          <w:ilvl w:val="0"/>
+          <w:numId w:val="2"/>
+        </w:numPr>
+        <w:spacing w:after="60" w:line="260"/>
+        <w:jc w:val="both"/>
+      </w:pPr>
+      <w:r>
+        <w:rPr>
+          <w:b/>
+          <w:bCs/>
+        </w:rPr>
+        <w:t xml:space="preserve">Bavure mineure (+1) :</w:t>
+      </w:r>
+      <w:r>
+        <w:t xml:space="preserve"> une question de trop qui remonte (interroger un impérial ou un PNJ prudent sur Tana / Doiron / les fréquences) ; un jet social raté devant un uniforme ; se faire remarquer au quai ou au marché gris ; un achat voyant à l'armurerie.</w:t>
+      </w:r>
+    </w:p>
+    <w:p>
+      <w:pPr>
+        <w:pStyle w:val="ListParagraph"/>
+        <w:numPr>
+          <w:ilvl w:val="0"/>
+          <w:numId w:val="2"/>
+        </w:numPr>
+        <w:spacing w:after="60" w:line="260"/>
+        <w:jc w:val="both"/>
+      </w:pPr>
+      <w:r>
+        <w:rPr>
+          <w:b/>
+          <w:bCs/>
+        </w:rPr>
+        <w:t xml:space="preserve">Bavure majeure (+2) :</w:t>
+      </w:r>
+      <w:r>
+        <w:t xml:space="preserve"> effraction repérée (DMZ, bureau Kallan, terminal des transmissions) ; alarme déclenchée ; PNJ alarmé qui alerte la garnison ou l'ISB ; violence ou arme dégainée en public ; </w:t>
+      </w:r>
+      <w:r>
+        <w:rPr>
+          <w:b/>
+          <w:bCs/>
+        </w:rPr>
+        <w:t xml:space="preserve">trace numérique laissée au slicing</w:t>
+      </w:r>
+      <w:r>
+        <w:t xml:space="preserve"> (échec critique en Sécurité / Programmation).</w:t>
+      </w:r>
+    </w:p>
+    <w:p>
+      <w:pPr>
+        <w:keepNext/>
+        <w:spacing w:before="40" w:after="60"/>
+      </w:pPr>
+      <w:r>
+        <w:rPr>
+          <w:b/>
+          <w:bCs/>
+          <w:color w:val="8A1C1C"/>
+          <w:sz w:val="19"/>
+          <w:szCs w:val="19"/>
+        </w:rPr>
+        <w:t xml:space="preserve">Ce qui peut la ralentir (−1, une fois chacun)</w:t>
+      </w:r>
+    </w:p>
+    <w:p>
+      <w:pPr>
+        <w:pStyle w:val="ListParagraph"/>
+        <w:numPr>
+          <w:ilvl w:val="0"/>
+          <w:numId w:val="2"/>
+        </w:numPr>
+        <w:spacing w:after="60" w:line="260"/>
+        <w:jc w:val="both"/>
+      </w:pPr>
+      <w:r>
+        <w:rPr>
+          <w:b/>
+          <w:bCs/>
+        </w:rPr>
+        <w:t xml:space="preserve">Désinformation active :</w:t>
+      </w:r>
+      <w:r>
+        <w:t xml:space="preserve"> planter une fausse piste crédible — faire porter le rebond au </w:t>
+      </w:r>
+      <w:r>
+        <w:rPr>
+          <w:i/>
+          <w:iCs/>
+        </w:rPr>
+        <w:t xml:space="preserve">Long Sillage</w:t>
+      </w:r>
+      <w:r>
+        <w:t xml:space="preserve"> déjà « suspecté » (rapport e), brouiller une borne WN, falsifier un registre.</w:t>
+      </w:r>
+    </w:p>
+    <w:p>
+      <w:pPr>
+        <w:pStyle w:val="ListParagraph"/>
+        <w:numPr>
+          <w:ilvl w:val="0"/>
+          <w:numId w:val="2"/>
+        </w:numPr>
+        <w:spacing w:after="60" w:line="260"/>
+        <w:jc w:val="both"/>
+      </w:pPr>
+      <w:r>
+        <w:rPr>
+          <w:b/>
+          <w:bCs/>
+        </w:rPr>
+        <w:t xml:space="preserve">Holt Marek de l'intérieur :</w:t>
+      </w:r>
+      <w:r>
+        <w:t xml:space="preserve"> exploiter les procédures ISB (faux ordre, lenteur administrative provoquée) — −1 sur un jet de </w:t>
+      </w:r>
+      <w:r>
+        <w:rPr>
+          <w:i/>
+          <w:iCs/>
+        </w:rPr>
+        <w:t xml:space="preserve">Bureaucratie impériale</w:t>
+      </w:r>
+      <w:r>
+        <w:t xml:space="preserve"> réussi.</w:t>
+      </w:r>
+    </w:p>
+    <w:p>
+      <w:pPr>
+        <w:pStyle w:val="ListParagraph"/>
+        <w:numPr>
+          <w:ilvl w:val="0"/>
+          <w:numId w:val="2"/>
+        </w:numPr>
+        <w:spacing w:after="60" w:line="260"/>
+        <w:jc w:val="both"/>
+      </w:pPr>
+      <w:r>
+        <w:rPr>
+          <w:b/>
+          <w:bCs/>
+        </w:rPr>
+        <w:t xml:space="preserve">Diversion coûteuse :</w:t>
+      </w:r>
+      <w:r>
+        <w:t xml:space="preserve"> provoquer un incident de station (cf. table d'événements ; ex. panne électrique C19/J133) qui accapare l'attention — gare aux dégâts collatéraux.</w:t>
+      </w:r>
+    </w:p>
+    <w:p>
+      <w:pPr>
+        <w:spacing w:after="120" w:line="264"/>
+        <w:jc w:val="both"/>
+      </w:pPr>
+      <w:r>
+        <w:rPr>
+          <w:b/>
+          <w:bCs/>
+        </w:rPr>
+        <w:t xml:space="preserve">Signes à télégraphier</w:t>
+      </w:r>
+      <w:r>
+        <w:t xml:space="preserve"> </w:t>
+      </w:r>
+      <w:r>
+        <w:rPr>
+          <w:i/>
+          <w:iCs/>
+        </w:rPr>
+        <w:t xml:space="preserve">(faire sentir l'horloge sans montrer le chiffre)</w:t>
+      </w:r>
+      <w:r>
+        <w:t xml:space="preserve"> : une silhouette grise (Skarn) aperçue deux fois ; le personnel plus nerveux, moins bavard ; un contrôle d'identité au quai qui n'y était pas la veille ; l'annonce que « les départs sont soumis à autorisation ». Chaque montée d'un cran mérite un signe concret.</w:t>
+      </w:r>
+    </w:p>
+    <w:p>
+      <w:pPr>
+        <w:spacing w:after="120" w:line="264"/>
+        <w:jc w:val="both"/>
+      </w:pPr>
+      <w:r>
+        <w:rPr>
+          <w:b/>
+          <w:bCs/>
+        </w:rPr>
+        <w:t xml:space="preserve">Pilotage &amp; variantes.</w:t>
+      </w:r>
+      <w:r>
+        <w:t xml:space="preserve"> Gardez le compteur caché ; laissez les joueurs lire la pression aux signes. One-shot tendu : démarrez au </w:t>
+      </w:r>
+      <w:r>
+        <w:rPr>
+          <w:b/>
+          <w:bCs/>
+        </w:rPr>
+        <w:t xml:space="preserve">cran 3</w:t>
+      </w:r>
+      <w:r>
+        <w:t xml:space="preserve">. Intro posée : </w:t>
+      </w:r>
+      <w:r>
+        <w:rPr>
+          <w:b/>
+          <w:bCs/>
+        </w:rPr>
+        <w:t xml:space="preserve">cran 1</w:t>
+      </w:r>
+      <w:r>
+        <w:t xml:space="preserve">. Une </w:t>
+      </w:r>
+      <w:r>
+        <w:rPr>
+          <w:b/>
+          <w:bCs/>
+        </w:rPr>
+        <w:t xml:space="preserve">tempête de rayonnements</w:t>
+      </w:r>
+      <w:r>
+        <w:t xml:space="preserve"> (cf. table météo) peut geler l'avance passive d'un quart — répit ambigu, car les comms des PJ sautent aussi.</w:t>
       </w:r>
     </w:p>
     <w:p>

</xml_diff>

<commit_message>
Embarquer la police Star Jedi et l'utiliser pour les titres
- couverture, « Sommaire » et les 5 titres H1 passent en Star Jedi ;
  H2/H3 restent en Calibri (lisibilité).
- police embarquée dans le .docx (police OOXML obfusquée, ECMA-376 :
  clé GUID 16 octets inversés, XOR des 32 premiers octets ; activation
  via embedTrueTypeFonts). Embarquement intégré au générateur
  (embedTitleFont, jszip). Source : empire-os/src/assets/starjedi/Starjedi.ttf.
- titre §5 « & » -> « et » (pas de glyphe & dans Star Jedi).
- rendu couverture vérifié (LibreOffice utilise bien la police embarquée).

Co-Authored-By: Claude Opus 4.8 <noreply@anthropic.com>
</commit_message>
<xml_diff>
--- a/star-wars/scenarios/birth-of-the-death-squadron/docs/scenario_signal_detresse_FUSION.docx
+++ b/star-wars/scenarios/birth-of-the-death-squadron/docs/scenario_signal_detresse_FUSION.docx
@@ -17,9 +17,9 @@
           <w:b/>
           <w:bCs/>
           <w:color w:val="26425C"/>
-          <w:sz w:val="60"/>
-          <w:szCs w:val="60"/>
-          <w:rFonts w:ascii="Calibri" w:cs="Calibri" w:eastAsia="Calibri" w:hAnsi="Calibri"/>
+          <w:sz w:val="64"/>
+          <w:szCs w:val="64"/>
+          <w:rFonts w:ascii="Star Jedi" w:cs="Star Jedi" w:eastAsia="Star Jedi" w:hAnsi="Star Jedi"/>
         </w:rPr>
         <w:t xml:space="preserve">SIGNAL DE DÉTRESSE</w:t>
       </w:r>
@@ -130,9 +130,9 @@
           <w:b/>
           <w:bCs/>
           <w:color w:val="26425C"/>
-          <w:sz w:val="34"/>
-          <w:szCs w:val="34"/>
-          <w:rFonts w:ascii="Calibri" w:cs="Calibri" w:eastAsia="Calibri" w:hAnsi="Calibri"/>
+          <w:sz w:val="40"/>
+          <w:szCs w:val="40"/>
+          <w:rFonts w:ascii="Star Jedi" w:cs="Star Jedi" w:eastAsia="Star Jedi" w:hAnsi="Star Jedi"/>
         </w:rPr>
         <w:t xml:space="preserve">Sommaire</w:t>
       </w:r>
@@ -7682,7 +7682,7 @@
         <w:pStyle w:val="Heading1"/>
       </w:pPr>
       <w:r>
-        <w:t xml:space="preserve">5. Issues possibles &amp; ouverture</w:t>
+        <w:t xml:space="preserve">5. Issues possibles et ouverture</w:t>
       </w:r>
     </w:p>
     <w:p>
@@ -8459,7 +8459,7 @@
       <w:color w:val="26425C"/>
       <w:sz w:val="30"/>
       <w:szCs w:val="30"/>
-      <w:rFonts w:ascii="Calibri" w:cs="Calibri" w:eastAsia="Calibri" w:hAnsi="Calibri"/>
+      <w:rFonts w:ascii="Star Jedi" w:cs="Star Jedi" w:eastAsia="Star Jedi" w:hAnsi="Star Jedi"/>
     </w:rPr>
   </w:style>
   <w:style w:type="paragraph" w:styleId="Heading2">

</xml_diff>

<commit_message>
TODO #3 — Table d'événements aléatoires de la station (d66)
Nouvelle section « Annexes — outils de MJ », annexe A : table d66 (2 dés,
thème 1-6 × événement 1-6 = 36 entrées) répartie en 6 thèmes (quai/vaisseaux,
technique/pannes, personnel/social, sécurité/impérial, commerce/rumeurs,
ambiance). Ancrée dans le journal de nuit (doc g) et crochetée sur l'horloge
ISB (#2), les rayonnements (#4) et les leviers sociaux (Vorn, Ossoval).
Rendu 2 colonnes vérifié (numéro accentué + retrait négatif).

Co-Authored-By: Claude Opus 4.8 <noreply@anthropic.com>
</commit_message>
<xml_diff>
--- a/star-wars/scenarios/birth-of-the-death-squadron/docs/scenario_signal_detresse_FUSION.docx
+++ b/star-wars/scenarios/birth-of-the-death-squadron/docs/scenario_signal_detresse_FUSION.docx
@@ -8057,6 +8057,986 @@
       </w:r>
       <w:r>
         <w:t xml:space="preserve"> Selon leurs actes, la station reste une base arrière possible (Kallan manipulable, PNJ ralliés, caches des locaux désaffectés) — ou un lieu désormais trop chaud.</w:t>
+      </w:r>
+    </w:p>
+    <w:p>
+      <w:pPr>
+        <w:pStyle w:val="Heading1"/>
+      </w:pPr>
+      <w:r>
+        <w:t xml:space="preserve">Annexes — outils de MJ</w:t>
+      </w:r>
+    </w:p>
+    <w:p>
+      <w:pPr>
+        <w:pStyle w:val="Heading2"/>
+      </w:pPr>
+      <w:r>
+        <w:t xml:space="preserve">A. Événements aléatoires de la station</w:t>
+      </w:r>
+    </w:p>
+    <w:p>
+      <w:pPr>
+        <w:spacing w:after="120" w:line="264"/>
+        <w:jc w:val="both"/>
+      </w:pPr>
+      <w:r>
+        <w:t xml:space="preserve">Pour donner vie à la station entre deux temps d'enquête. </w:t>
+      </w:r>
+      <w:r>
+        <w:rPr>
+          <w:b/>
+          <w:bCs/>
+        </w:rPr>
+        <w:t xml:space="preserve">Lancez deux dés</w:t>
+      </w:r>
+      <w:r>
+        <w:t xml:space="preserve"> (ou 1D deux fois) : le premier donne le </w:t>
+      </w:r>
+      <w:r>
+        <w:rPr>
+          <w:b/>
+          <w:bCs/>
+        </w:rPr>
+        <w:t xml:space="preserve">thème</w:t>
+      </w:r>
+      <w:r>
+        <w:t xml:space="preserve"> (1-6), le second l'</w:t>
+      </w:r>
+      <w:r>
+        <w:rPr>
+          <w:b/>
+          <w:bCs/>
+        </w:rPr>
+        <w:t xml:space="preserve">événement</w:t>
+      </w:r>
+      <w:r>
+        <w:t xml:space="preserve"> (1-6). Roulez une fois par </w:t>
+      </w:r>
+      <w:r>
+        <w:rPr>
+          <w:b/>
+          <w:bCs/>
+        </w:rPr>
+        <w:t xml:space="preserve">quart</w:t>
+      </w:r>
+      <w:r>
+        <w:t xml:space="preserve">, ou dès qu'une scène a besoin de texture. La plupart sont de l'ambiance ; certains portent un </w:t>
+      </w:r>
+      <w:r>
+        <w:rPr>
+          <w:b/>
+          <w:bCs/>
+        </w:rPr>
+        <w:t xml:space="preserve">crochet mécanique</w:t>
+      </w:r>
+      <w:r>
+        <w:t xml:space="preserve"> </w:t>
+      </w:r>
+      <w:r>
+        <w:rPr>
+          <w:i/>
+          <w:iCs/>
+        </w:rPr>
+        <w:t xml:space="preserve">(horloge ISB ; rayonnements → annexe B ; leviers sociaux)</w:t>
+      </w:r>
+      <w:r>
+        <w:t xml:space="preserve">.</w:t>
+      </w:r>
+    </w:p>
+    <w:p>
+      <w:pPr>
+        <w:keepNext/>
+        <w:spacing w:before="90" w:after="40"/>
+      </w:pPr>
+      <w:r>
+        <w:rPr>
+          <w:b/>
+          <w:bCs/>
+          <w:color w:val="3A5A7A"/>
+          <w:sz w:val="19"/>
+          <w:szCs w:val="19"/>
+        </w:rPr>
+        <w:t xml:space="preserve">1 · Quai &amp; vaisseaux</w:t>
+      </w:r>
+    </w:p>
+    <w:p>
+      <w:pPr>
+        <w:spacing w:after="20" w:line="248"/>
+        <w:ind w:left="300" w:hanging="300"/>
+        <w:jc w:val="both"/>
+      </w:pPr>
+      <w:r>
+        <w:rPr>
+          <w:b/>
+          <w:bCs/>
+          <w:color w:val="8A1C1C"/>
+        </w:rPr>
+        <w:t xml:space="preserve">1  </w:t>
+      </w:r>
+      <w:r>
+        <w:t xml:space="preserve">Arrivée du </w:t>
+      </w:r>
+      <w:r>
+        <w:rPr>
+          <w:i/>
+          <w:iCs/>
+        </w:rPr>
+        <w:t xml:space="preserve">Perce-Brume</w:t>
+      </w:r>
+      <w:r>
+        <w:t xml:space="preserve"> (denrées) : déchargement bruyant, quai encombré une heure.</w:t>
+      </w:r>
+    </w:p>
+    <w:p>
+      <w:pPr>
+        <w:spacing w:after="20" w:line="248"/>
+        <w:ind w:left="300" w:hanging="300"/>
+        <w:jc w:val="both"/>
+      </w:pPr>
+      <w:r>
+        <w:rPr>
+          <w:b/>
+          <w:bCs/>
+          <w:color w:val="8A1C1C"/>
+        </w:rPr>
+        <w:t xml:space="preserve">2  </w:t>
+      </w:r>
+      <w:r>
+        <w:t xml:space="preserve">Un remorqueur ramène un caboteur en avarie (écho de l'</w:t>
+      </w:r>
+      <w:r>
+        <w:rPr>
+          <w:i/>
+          <w:iCs/>
+        </w:rPr>
+        <w:t xml:space="preserve">Étoile Voilée</w:t>
+      </w:r>
+      <w:r>
+        <w:t xml:space="preserve">) : l'infirmerie est sollicitée.</w:t>
+      </w:r>
+    </w:p>
+    <w:p>
+      <w:pPr>
+        <w:spacing w:after="20" w:line="248"/>
+        <w:ind w:left="300" w:hanging="300"/>
+        <w:jc w:val="both"/>
+      </w:pPr>
+      <w:r>
+        <w:rPr>
+          <w:b/>
+          <w:bCs/>
+          <w:color w:val="8A1C1C"/>
+        </w:rPr>
+        <w:t xml:space="preserve">3  </w:t>
+      </w:r>
+      <w:r>
+        <w:t xml:space="preserve">Départ précipité d'un contrebandier sans acquitter ses taxes de quai — Bregman fulmine.</w:t>
+      </w:r>
+    </w:p>
+    <w:p>
+      <w:pPr>
+        <w:spacing w:after="20" w:line="248"/>
+        <w:ind w:left="300" w:hanging="300"/>
+        <w:jc w:val="both"/>
+      </w:pPr>
+      <w:r>
+        <w:rPr>
+          <w:b/>
+          <w:bCs/>
+          <w:color w:val="8A1C1C"/>
+        </w:rPr>
+        <w:t xml:space="preserve">4  </w:t>
+      </w:r>
+      <w:r>
+        <w:t xml:space="preserve">Deux vaisseaux non déclarés s'accrochent au loin (règlement de comptes) : </w:t>
+      </w:r>
+      <w:r>
+        <w:rPr>
+          <w:b/>
+          <w:bCs/>
+        </w:rPr>
+        <w:t xml:space="preserve">confinement partiel</w:t>
+      </w:r>
+      <w:r>
+        <w:t xml:space="preserve">, quai verrouillé ~2 h.</w:t>
+      </w:r>
+    </w:p>
+    <w:p>
+      <w:pPr>
+        <w:spacing w:after="20" w:line="248"/>
+        <w:ind w:left="300" w:hanging="300"/>
+        <w:jc w:val="both"/>
+      </w:pPr>
+      <w:r>
+        <w:rPr>
+          <w:b/>
+          <w:bCs/>
+          <w:color w:val="8A1C1C"/>
+        </w:rPr>
+        <w:t xml:space="preserve">5  </w:t>
+      </w:r>
+      <w:r>
+        <w:t xml:space="preserve">Le </w:t>
+      </w:r>
+      <w:r>
+        <w:rPr>
+          <w:i/>
+          <w:iCs/>
+        </w:rPr>
+        <w:t xml:space="preserve">Long Sillage</w:t>
+      </w:r>
+      <w:r>
+        <w:t xml:space="preserve"> (Fenn Yorrik) fait escale : rumeurs et marchandages à la cantina.</w:t>
+      </w:r>
+    </w:p>
+    <w:p>
+      <w:pPr>
+        <w:spacing w:after="20" w:line="248"/>
+        <w:ind w:left="300" w:hanging="300"/>
+        <w:jc w:val="both"/>
+      </w:pPr>
+      <w:r>
+        <w:rPr>
+          <w:b/>
+          <w:bCs/>
+          <w:color w:val="8A1C1C"/>
+        </w:rPr>
+        <w:t xml:space="preserve">6  </w:t>
+      </w:r>
+      <w:r>
+        <w:t xml:space="preserve">La </w:t>
+      </w:r>
+      <w:r>
+        <w:rPr>
+          <w:b/>
+          <w:bCs/>
+        </w:rPr>
+        <w:t xml:space="preserve">passerelle 3 grince</w:t>
+      </w:r>
+      <w:r>
+        <w:t xml:space="preserve"> de plus belle ; un docker se tord la cheville, ticket de maintenance relancé (en vain).</w:t>
+      </w:r>
+    </w:p>
+    <w:p>
+      <w:pPr>
+        <w:keepNext/>
+        <w:spacing w:before="90" w:after="40"/>
+      </w:pPr>
+      <w:r>
+        <w:rPr>
+          <w:b/>
+          <w:bCs/>
+          <w:color w:val="3A5A7A"/>
+          <w:sz w:val="19"/>
+          <w:szCs w:val="19"/>
+        </w:rPr>
+        <w:t xml:space="preserve">2 · Technique &amp; pannes</w:t>
+      </w:r>
+    </w:p>
+    <w:p>
+      <w:pPr>
+        <w:spacing w:after="20" w:line="248"/>
+        <w:ind w:left="300" w:hanging="300"/>
+        <w:jc w:val="both"/>
+      </w:pPr>
+      <w:r>
+        <w:rPr>
+          <w:b/>
+          <w:bCs/>
+          <w:color w:val="8A1C1C"/>
+        </w:rPr>
+        <w:t xml:space="preserve">1  </w:t>
+      </w:r>
+      <w:r>
+        <w:t xml:space="preserve">Micro-coupure d'éclairage secteur D, réglée en moins d'une heure — mais une porte reste bloquée entre-temps.</w:t>
+      </w:r>
+    </w:p>
+    <w:p>
+      <w:pPr>
+        <w:spacing w:after="20" w:line="248"/>
+        <w:ind w:left="300" w:hanging="300"/>
+        <w:jc w:val="both"/>
+      </w:pPr>
+      <w:r>
+        <w:rPr>
+          <w:b/>
+          <w:bCs/>
+          <w:color w:val="8A1C1C"/>
+        </w:rPr>
+        <w:t xml:space="preserve">2  </w:t>
+      </w:r>
+      <w:r>
+        <w:rPr>
+          <w:b/>
+          <w:bCs/>
+        </w:rPr>
+        <w:t xml:space="preserve">Fluctuation du réseau électrique</w:t>
+      </w:r>
+      <w:r>
+        <w:t xml:space="preserve"> (secteurs B/C), bascule de secours lente : noir de ~90 s </w:t>
+      </w:r>
+      <w:r>
+        <w:rPr>
+          <w:i/>
+          <w:iCs/>
+        </w:rPr>
+        <w:t xml:space="preserve">(diversion possible, cf. horloge ISB)</w:t>
+      </w:r>
+      <w:r>
+        <w:t xml:space="preserve">.</w:t>
+      </w:r>
+    </w:p>
+    <w:p>
+      <w:pPr>
+        <w:spacing w:after="20" w:line="248"/>
+        <w:ind w:left="300" w:hanging="300"/>
+        <w:jc w:val="both"/>
+      </w:pPr>
+      <w:r>
+        <w:rPr>
+          <w:b/>
+          <w:bCs/>
+          <w:color w:val="8A1C1C"/>
+        </w:rPr>
+        <w:t xml:space="preserve">3  </w:t>
+      </w:r>
+      <w:r>
+        <w:t xml:space="preserve">Contrôle du recyclage d'air secteur C : léger défaut, odeur de brûlé, secteur évacué 20 min.</w:t>
+      </w:r>
+    </w:p>
+    <w:p>
+      <w:pPr>
+        <w:spacing w:after="20" w:line="248"/>
+        <w:ind w:left="300" w:hanging="300"/>
+        <w:jc w:val="both"/>
+      </w:pPr>
+      <w:r>
+        <w:rPr>
+          <w:b/>
+          <w:bCs/>
+          <w:color w:val="8A1C1C"/>
+        </w:rPr>
+        <w:t xml:space="preserve">4  </w:t>
+      </w:r>
+      <w:r>
+        <w:t xml:space="preserve">Antenne AD-01 : micro-coupures des comms extérieures pendant 30 min (senseurs dégradés).</w:t>
+      </w:r>
+    </w:p>
+    <w:p>
+      <w:pPr>
+        <w:spacing w:after="20" w:line="248"/>
+        <w:ind w:left="300" w:hanging="300"/>
+        <w:jc w:val="both"/>
+      </w:pPr>
+      <w:r>
+        <w:rPr>
+          <w:b/>
+          <w:bCs/>
+          <w:color w:val="8A1C1C"/>
+        </w:rPr>
+        <w:t xml:space="preserve">5  </w:t>
+      </w:r>
+      <w:r>
+        <w:t xml:space="preserve">Un droïde de maintenance tombe en panne au milieu d'une coursive et bloque le passage.</w:t>
+      </w:r>
+    </w:p>
+    <w:p>
+      <w:pPr>
+        <w:spacing w:after="20" w:line="248"/>
+        <w:ind w:left="300" w:hanging="300"/>
+        <w:jc w:val="both"/>
+      </w:pPr>
+      <w:r>
+        <w:rPr>
+          <w:b/>
+          <w:bCs/>
+          <w:color w:val="8A1C1C"/>
+        </w:rPr>
+        <w:t xml:space="preserve">6  </w:t>
+      </w:r>
+      <w:r>
+        <w:t xml:space="preserve">Recalibrage d'antenne par Kavarel : accès à la galerie de maintenance temporairement restreint.</w:t>
+      </w:r>
+    </w:p>
+    <w:p>
+      <w:pPr>
+        <w:keepNext/>
+        <w:spacing w:before="90" w:after="40"/>
+      </w:pPr>
+      <w:r>
+        <w:rPr>
+          <w:b/>
+          <w:bCs/>
+          <w:color w:val="3A5A7A"/>
+          <w:sz w:val="19"/>
+          <w:szCs w:val="19"/>
+        </w:rPr>
+        <w:t xml:space="preserve">3 · Personnel &amp; social</w:t>
+      </w:r>
+    </w:p>
+    <w:p>
+      <w:pPr>
+        <w:spacing w:after="20" w:line="248"/>
+        <w:ind w:left="300" w:hanging="300"/>
+        <w:jc w:val="both"/>
+      </w:pPr>
+      <w:r>
+        <w:rPr>
+          <w:b/>
+          <w:bCs/>
+          <w:color w:val="8A1C1C"/>
+        </w:rPr>
+        <w:t xml:space="preserve">1  </w:t>
+      </w:r>
+      <w:r>
+        <w:t xml:space="preserve">Altercation entre deux dockers (manutention ratée) : fin de service anticipée, tension palpable.</w:t>
+      </w:r>
+    </w:p>
+    <w:p>
+      <w:pPr>
+        <w:spacing w:after="20" w:line="248"/>
+        <w:ind w:left="300" w:hanging="300"/>
+        <w:jc w:val="both"/>
+      </w:pPr>
+      <w:r>
+        <w:rPr>
+          <w:b/>
+          <w:bCs/>
+          <w:color w:val="8A1C1C"/>
+        </w:rPr>
+        <w:t xml:space="preserve">2  </w:t>
+      </w:r>
+      <w:r>
+        <w:t xml:space="preserve">Kessa Droman sert un plat spécial au mess : tout le monde s'y presse (bon moment social).</w:t>
+      </w:r>
+    </w:p>
+    <w:p>
+      <w:pPr>
+        <w:spacing w:after="20" w:line="248"/>
+        <w:ind w:left="300" w:hanging="300"/>
+        <w:jc w:val="both"/>
+      </w:pPr>
+      <w:r>
+        <w:rPr>
+          <w:b/>
+          <w:bCs/>
+          <w:color w:val="8A1C1C"/>
+        </w:rPr>
+        <w:t xml:space="preserve">3  </w:t>
+      </w:r>
+      <w:r>
+        <w:t xml:space="preserve">Rumeur de réduction d'effectifs : le personnel est nerveux, moins bavard.</w:t>
+      </w:r>
+    </w:p>
+    <w:p>
+      <w:pPr>
+        <w:spacing w:after="20" w:line="248"/>
+        <w:ind w:left="300" w:hanging="300"/>
+        <w:jc w:val="both"/>
+      </w:pPr>
+      <w:r>
+        <w:rPr>
+          <w:b/>
+          <w:bCs/>
+          <w:color w:val="8A1C1C"/>
+        </w:rPr>
+        <w:t xml:space="preserve">4  </w:t>
+      </w:r>
+      <w:r>
+        <w:t xml:space="preserve">Le centre culturel réclame (encore) des crédits à l'administration ; Maren Estil de mauvaise humeur.</w:t>
+      </w:r>
+    </w:p>
+    <w:p>
+      <w:pPr>
+        <w:spacing w:after="20" w:line="248"/>
+        <w:ind w:left="300" w:hanging="300"/>
+        <w:jc w:val="both"/>
+      </w:pPr>
+      <w:r>
+        <w:rPr>
+          <w:b/>
+          <w:bCs/>
+          <w:color w:val="8A1C1C"/>
+        </w:rPr>
+        <w:t xml:space="preserve">5  </w:t>
+      </w:r>
+      <w:r>
+        <w:t xml:space="preserve">Passation Bregman/Voss houleuse : un rapport « oublié » refait surface.</w:t>
+      </w:r>
+    </w:p>
+    <w:p>
+      <w:pPr>
+        <w:spacing w:after="20" w:line="248"/>
+        <w:ind w:left="300" w:hanging="300"/>
+        <w:jc w:val="both"/>
+      </w:pPr>
+      <w:r>
+        <w:rPr>
+          <w:b/>
+          <w:bCs/>
+          <w:color w:val="8A1C1C"/>
+        </w:rPr>
+        <w:t xml:space="preserve">6  </w:t>
+      </w:r>
+      <w:r>
+        <w:t xml:space="preserve">Quelqu'un a trop bu à la cantina ; Vezz Nurodo cherche à le faire raccompagner discrètement.</w:t>
+      </w:r>
+    </w:p>
+    <w:p>
+      <w:pPr>
+        <w:keepNext/>
+        <w:spacing w:before="90" w:after="40"/>
+      </w:pPr>
+      <w:r>
+        <w:rPr>
+          <w:b/>
+          <w:bCs/>
+          <w:color w:val="3A5A7A"/>
+          <w:sz w:val="19"/>
+          <w:szCs w:val="19"/>
+        </w:rPr>
+        <w:t xml:space="preserve">4 · Sécurité &amp; présence impériale</w:t>
+      </w:r>
+    </w:p>
+    <w:p>
+      <w:pPr>
+        <w:spacing w:after="20" w:line="248"/>
+        <w:ind w:left="300" w:hanging="300"/>
+        <w:jc w:val="both"/>
+      </w:pPr>
+      <w:r>
+        <w:rPr>
+          <w:b/>
+          <w:bCs/>
+          <w:color w:val="8A1C1C"/>
+        </w:rPr>
+        <w:t xml:space="preserve">1  </w:t>
+      </w:r>
+      <w:r>
+        <w:t xml:space="preserve">Contrôle d'identité inopiné au quai (Denz &amp; Voy) : file d'attente, nervosité générale.</w:t>
+      </w:r>
+    </w:p>
+    <w:p>
+      <w:pPr>
+        <w:spacing w:after="20" w:line="248"/>
+        <w:ind w:left="300" w:hanging="300"/>
+        <w:jc w:val="both"/>
+      </w:pPr>
+      <w:r>
+        <w:rPr>
+          <w:b/>
+          <w:bCs/>
+          <w:color w:val="8A1C1C"/>
+        </w:rPr>
+        <w:t xml:space="preserve">2  </w:t>
+      </w:r>
+      <w:r>
+        <w:t xml:space="preserve">Le Lt Adrast inspecte un niveau au hasard, pour « faire du zèle » devant l'ISB.</w:t>
+      </w:r>
+    </w:p>
+    <w:p>
+      <w:pPr>
+        <w:spacing w:after="20" w:line="248"/>
+        <w:ind w:left="300" w:hanging="300"/>
+        <w:jc w:val="both"/>
+      </w:pPr>
+      <w:r>
+        <w:rPr>
+          <w:b/>
+          <w:bCs/>
+          <w:color w:val="8A1C1C"/>
+        </w:rPr>
+        <w:t xml:space="preserve">3  </w:t>
+      </w:r>
+      <w:r>
+        <w:t xml:space="preserve">Une </w:t>
+      </w:r>
+      <w:r>
+        <w:rPr>
+          <w:b/>
+          <w:bCs/>
+        </w:rPr>
+        <w:t xml:space="preserve">silhouette grise</w:t>
+      </w:r>
+      <w:r>
+        <w:t xml:space="preserve"> (Skarn ?) est aperçue à un carrefour, puis disparaît. </w:t>
+      </w:r>
+      <w:r>
+        <w:rPr>
+          <w:i/>
+          <w:iCs/>
+        </w:rPr>
+        <w:t xml:space="preserve">(Signe d'horloge ISB.)</w:t>
+      </w:r>
+    </w:p>
+    <w:p>
+      <w:pPr>
+        <w:spacing w:after="20" w:line="248"/>
+        <w:ind w:left="300" w:hanging="300"/>
+        <w:jc w:val="both"/>
+      </w:pPr>
+      <w:r>
+        <w:rPr>
+          <w:b/>
+          <w:bCs/>
+          <w:color w:val="8A1C1C"/>
+        </w:rPr>
+        <w:t xml:space="preserve">4  </w:t>
+      </w:r>
+      <w:r>
+        <w:t xml:space="preserve">Patrouille conjointe : Denz bavarde (info gratuite), Voy raccourcit la conversation.</w:t>
+      </w:r>
+    </w:p>
+    <w:p>
+      <w:pPr>
+        <w:spacing w:after="20" w:line="248"/>
+        <w:ind w:left="300" w:hanging="300"/>
+        <w:jc w:val="both"/>
+      </w:pPr>
+      <w:r>
+        <w:rPr>
+          <w:b/>
+          <w:bCs/>
+          <w:color w:val="8A1C1C"/>
+        </w:rPr>
+        <w:t xml:space="preserve">5  </w:t>
+      </w:r>
+      <w:r>
+        <w:t xml:space="preserve">Rennard demande à consulter un registre à la capitainerie : l'étau se resserre </w:t>
+      </w:r>
+      <w:r>
+        <w:rPr>
+          <w:i/>
+          <w:iCs/>
+        </w:rPr>
+        <w:t xml:space="preserve">(avancer l'horloge ?)</w:t>
+      </w:r>
+      <w:r>
+        <w:t xml:space="preserve">.</w:t>
+      </w:r>
+    </w:p>
+    <w:p>
+      <w:pPr>
+        <w:spacing w:after="20" w:line="248"/>
+        <w:ind w:left="300" w:hanging="300"/>
+        <w:jc w:val="both"/>
+      </w:pPr>
+      <w:r>
+        <w:rPr>
+          <w:b/>
+          <w:bCs/>
+          <w:color w:val="8A1C1C"/>
+        </w:rPr>
+        <w:t xml:space="preserve">6  </w:t>
+      </w:r>
+      <w:r>
+        <w:t xml:space="preserve">Fausse alerte capteur : </w:t>
+      </w:r>
+      <w:r>
+        <w:rPr>
+          <w:b/>
+          <w:bCs/>
+        </w:rPr>
+        <w:t xml:space="preserve">confinement 15 min</w:t>
+      </w:r>
+      <w:r>
+        <w:t xml:space="preserve">, tout le monde sur les nerfs.</w:t>
+      </w:r>
+    </w:p>
+    <w:p>
+      <w:pPr>
+        <w:keepNext/>
+        <w:spacing w:before="90" w:after="40"/>
+      </w:pPr>
+      <w:r>
+        <w:rPr>
+          <w:b/>
+          <w:bCs/>
+          <w:color w:val="3A5A7A"/>
+          <w:sz w:val="19"/>
+          <w:szCs w:val="19"/>
+        </w:rPr>
+        <w:t xml:space="preserve">5 · Commerce &amp; rumeurs</w:t>
+      </w:r>
+    </w:p>
+    <w:p>
+      <w:pPr>
+        <w:spacing w:after="20" w:line="248"/>
+        <w:ind w:left="300" w:hanging="300"/>
+        <w:jc w:val="both"/>
+      </w:pPr>
+      <w:r>
+        <w:rPr>
+          <w:b/>
+          <w:bCs/>
+          <w:color w:val="8A1C1C"/>
+        </w:rPr>
+        <w:t xml:space="preserve">1  </w:t>
+      </w:r>
+      <w:r>
+        <w:t xml:space="preserve">Trik Ossoval propose une « pièce rare » (peut-être utile, peut-être volée).</w:t>
+      </w:r>
+    </w:p>
+    <w:p>
+      <w:pPr>
+        <w:spacing w:after="20" w:line="248"/>
+        <w:ind w:left="300" w:hanging="300"/>
+        <w:jc w:val="both"/>
+      </w:pPr>
+      <w:r>
+        <w:rPr>
+          <w:b/>
+          <w:bCs/>
+          <w:color w:val="8A1C1C"/>
+        </w:rPr>
+        <w:t xml:space="preserve">2  </w:t>
+      </w:r>
+      <w:r>
+        <w:t xml:space="preserve">Chessa Vorn fait la tournée de ses débiteurs : on apprend qui est endetté </w:t>
+      </w:r>
+      <w:r>
+        <w:rPr>
+          <w:i/>
+          <w:iCs/>
+        </w:rPr>
+        <w:t xml:space="preserve">(levier social)</w:t>
+      </w:r>
+      <w:r>
+        <w:t xml:space="preserve">.</w:t>
+      </w:r>
+    </w:p>
+    <w:p>
+      <w:pPr>
+        <w:spacing w:after="20" w:line="248"/>
+        <w:ind w:left="300" w:hanging="300"/>
+        <w:jc w:val="both"/>
+      </w:pPr>
+      <w:r>
+        <w:rPr>
+          <w:b/>
+          <w:bCs/>
+          <w:color w:val="8A1C1C"/>
+        </w:rPr>
+        <w:t xml:space="preserve">3  </w:t>
+      </w:r>
+      <w:r>
+        <w:t xml:space="preserve">Le chasseur de primes </w:t>
+      </w:r>
+      <w:r>
+        <w:rPr>
+          <w:i/>
+          <w:iCs/>
+        </w:rPr>
+        <w:t xml:space="preserve">Widowmaker</w:t>
+      </w:r>
+      <w:r>
+        <w:t xml:space="preserve"> (Krul Ashen) est de passage : la cantina se tait à son entrée.</w:t>
+      </w:r>
+    </w:p>
+    <w:p>
+      <w:pPr>
+        <w:spacing w:after="20" w:line="248"/>
+        <w:ind w:left="300" w:hanging="300"/>
+        <w:jc w:val="both"/>
+      </w:pPr>
+      <w:r>
+        <w:rPr>
+          <w:b/>
+          <w:bCs/>
+          <w:color w:val="8A1C1C"/>
+        </w:rPr>
+        <w:t xml:space="preserve">4  </w:t>
+      </w:r>
+      <w:r>
+        <w:t xml:space="preserve">Hooru Damm livre des vivres frais : petit attroupement, bonne occasion d'écouter des ragots.</w:t>
+      </w:r>
+    </w:p>
+    <w:p>
+      <w:pPr>
+        <w:spacing w:after="20" w:line="248"/>
+        <w:ind w:left="300" w:hanging="300"/>
+        <w:jc w:val="both"/>
+      </w:pPr>
+      <w:r>
+        <w:rPr>
+          <w:b/>
+          <w:bCs/>
+          <w:color w:val="8A1C1C"/>
+        </w:rPr>
+        <w:t xml:space="preserve">5  </w:t>
+      </w:r>
+      <w:r>
+        <w:t xml:space="preserve">Fennik Doss reçoit une caisse « non déclarée » à l'armurerie ; il se fait discret.</w:t>
+      </w:r>
+    </w:p>
+    <w:p>
+      <w:pPr>
+        <w:spacing w:after="20" w:line="248"/>
+        <w:ind w:left="300" w:hanging="300"/>
+        <w:jc w:val="both"/>
+      </w:pPr>
+      <w:r>
+        <w:rPr>
+          <w:b/>
+          <w:bCs/>
+          <w:color w:val="8A1C1C"/>
+        </w:rPr>
+        <w:t xml:space="preserve">6  </w:t>
+      </w:r>
+      <w:r>
+        <w:t xml:space="preserve">Un colis mal étiqueté circule de main en main à la recherche de son destinataire.</w:t>
+      </w:r>
+    </w:p>
+    <w:p>
+      <w:pPr>
+        <w:keepNext/>
+        <w:spacing w:before="90" w:after="40"/>
+      </w:pPr>
+      <w:r>
+        <w:rPr>
+          <w:b/>
+          <w:bCs/>
+          <w:color w:val="3A5A7A"/>
+          <w:sz w:val="19"/>
+          <w:szCs w:val="19"/>
+        </w:rPr>
+        <w:t xml:space="preserve">6 · Ambiance &amp; anodin</w:t>
+      </w:r>
+    </w:p>
+    <w:p>
+      <w:pPr>
+        <w:spacing w:after="20" w:line="248"/>
+        <w:ind w:left="300" w:hanging="300"/>
+        <w:jc w:val="both"/>
+      </w:pPr>
+      <w:r>
+        <w:rPr>
+          <w:b/>
+          <w:bCs/>
+          <w:color w:val="8A1C1C"/>
+        </w:rPr>
+        <w:t xml:space="preserve">1  </w:t>
+      </w:r>
+      <w:r>
+        <w:t xml:space="preserve">Une </w:t>
+      </w:r>
+      <w:r>
+        <w:rPr>
+          <w:b/>
+          <w:bCs/>
+        </w:rPr>
+        <w:t xml:space="preserve">tempête électromagnétique</w:t>
+      </w:r>
+      <w:r>
+        <w:t xml:space="preserve"> fait grésiller les comms 10 min </w:t>
+      </w:r>
+      <w:r>
+        <w:rPr>
+          <w:i/>
+          <w:iCs/>
+        </w:rPr>
+        <w:t xml:space="preserve">(voir annexe B)</w:t>
+      </w:r>
+      <w:r>
+        <w:t xml:space="preserve">.</w:t>
+      </w:r>
+    </w:p>
+    <w:p>
+      <w:pPr>
+        <w:spacing w:after="20" w:line="248"/>
+        <w:ind w:left="300" w:hanging="300"/>
+        <w:jc w:val="both"/>
+      </w:pPr>
+      <w:r>
+        <w:rPr>
+          <w:b/>
+          <w:bCs/>
+          <w:color w:val="8A1C1C"/>
+        </w:rPr>
+        <w:t xml:space="preserve">2  </w:t>
+      </w:r>
+      <w:r>
+        <w:t xml:space="preserve">Coupure d'eau chaude aux quartiers : ronchonnements généralisés.</w:t>
+      </w:r>
+    </w:p>
+    <w:p>
+      <w:pPr>
+        <w:spacing w:after="20" w:line="248"/>
+        <w:ind w:left="300" w:hanging="300"/>
+        <w:jc w:val="both"/>
+      </w:pPr>
+      <w:r>
+        <w:rPr>
+          <w:b/>
+          <w:bCs/>
+          <w:color w:val="8A1C1C"/>
+        </w:rPr>
+        <w:t xml:space="preserve">3  </w:t>
+      </w:r>
+      <w:r>
+        <w:t xml:space="preserve">Un enfant (rare sur la station) s'est perdu dans une coursive ; qui le raccompagne ?</w:t>
+      </w:r>
+    </w:p>
+    <w:p>
+      <w:pPr>
+        <w:spacing w:after="20" w:line="248"/>
+        <w:ind w:left="300" w:hanging="300"/>
+        <w:jc w:val="both"/>
+      </w:pPr>
+      <w:r>
+        <w:rPr>
+          <w:b/>
+          <w:bCs/>
+          <w:color w:val="8A1C1C"/>
+        </w:rPr>
+        <w:t xml:space="preserve">4  </w:t>
+      </w:r>
+      <w:r>
+        <w:t xml:space="preserve">Odeur persistante de caf brûlé au mess ; Kessa s'excuse platement.</w:t>
+      </w:r>
+    </w:p>
+    <w:p>
+      <w:pPr>
+        <w:spacing w:after="20" w:line="248"/>
+        <w:ind w:left="300" w:hanging="300"/>
+        <w:jc w:val="both"/>
+      </w:pPr>
+      <w:r>
+        <w:rPr>
+          <w:b/>
+          <w:bCs/>
+          <w:color w:val="8A1C1C"/>
+        </w:rPr>
+        <w:t xml:space="preserve">5  </w:t>
+      </w:r>
+      <w:r>
+        <w:t xml:space="preserve">Un haut-parleur défectueux répète une annonce en boucle jusqu'à ce qu'on le débranche.</w:t>
+      </w:r>
+    </w:p>
+    <w:p>
+      <w:pPr>
+        <w:spacing w:after="20" w:line="248"/>
+        <w:ind w:left="300" w:hanging="300"/>
+        <w:jc w:val="both"/>
+      </w:pPr>
+      <w:r>
+        <w:rPr>
+          <w:b/>
+          <w:bCs/>
+          <w:color w:val="8A1C1C"/>
+        </w:rPr>
+        <w:t xml:space="preserve">6  </w:t>
+      </w:r>
+      <w:r>
+        <w:t xml:space="preserve">Rien de notable — la station ronronne. </w:t>
+      </w:r>
+      <w:r>
+        <w:rPr>
+          <w:i/>
+          <w:iCs/>
+        </w:rPr>
+        <w:t xml:space="preserve">(Le calme avant quelque chose ?)</w:t>
       </w:r>
     </w:p>
     <w:p>

</xml_diff>

<commit_message>
Annexe B — Handout : le message initial de Tana (message 0)
Ajoute le handout déclencheur du scénario dans les annexes, en section
PLEINE LARGEUR (exception à la mise en page 2 colonnes, demandée) :
- note MJ : chiffre « Sand/Musset » (une ligne sur deux), relais par
  « le Courtier », message caché décodé, double sens de « impériaux » ;
- encadré à imprimer pour les joueurs (police Consolas, cadre parchemin).
Réalisé via une 4e section Word 1 colonne (footer dupliqué via makeFooter()).
Renomme « Annexes — outils de MJ » -> « Annexes ».
Ajoute aussi la source docs/message_initial_tana.docx au dépôt.

Co-Authored-By: Claude Opus 4.8 <noreply@anthropic.com>
</commit_message>
<xml_diff>
--- a/star-wars/scenarios/birth-of-the-death-squadron/docs/scenario_signal_detresse_FUSION.docx
+++ b/star-wars/scenarios/birth-of-the-death-squadron/docs/scenario_signal_detresse_FUSION.docx
@@ -8064,7 +8064,7 @@
         <w:pStyle w:val="Heading1"/>
       </w:pPr>
       <w:r>
-        <w:t xml:space="preserve">Annexes — outils de MJ</w:t>
+        <w:t xml:space="preserve">Annexes</w:t>
       </w:r>
     </w:p>
     <w:p>
@@ -9041,6 +9041,632 @@
     </w:p>
     <w:p>
       <w:pPr>
+        <w:sectPr>
+          <w:footerReference w:type="default" r:id="rId6"/>
+          <w:pgSz w:w="11906" w:h="16838" w:orient="portrait"/>
+          <w:pgMar w:top="1134" w:right="1134" w:bottom="1134" w:left="1134" w:header="708" w:footer="708" w:gutter="0"/>
+          <w:pgNumType/>
+          <w:cols w:space="454" w:num="2" w:equalWidth="true"/>
+          <w:docGrid w:linePitch="360"/>
+        </w:sectPr>
+      </w:pPr>
+    </w:p>
+    <w:p>
+      <w:pPr>
+        <w:pStyle w:val="Heading2"/>
+      </w:pPr>
+      <w:r>
+        <w:t xml:space="preserve">B. Handout — Le message initial de Tana (le « message 0 »)</w:t>
+      </w:r>
+    </w:p>
+    <w:p>
+      <w:pPr>
+        <w:spacing w:after="120" w:line="264"/>
+        <w:jc w:val="both"/>
+      </w:pPr>
+      <w:r>
+        <w:t xml:space="preserve">Point de départ du scénario. Avant de disparaître sous l'alias </w:t>
+      </w:r>
+      <w:r>
+        <w:rPr>
+          <w:b/>
+          <w:bCs/>
+        </w:rPr>
+        <w:t xml:space="preserve">Doiron</w:t>
+      </w:r>
+      <w:r>
+        <w:t xml:space="preserve">, Tana a posté une annonce sur un canal privé de marché noir : en apparence une brocante banale, mais </w:t>
+      </w:r>
+      <w:r>
+        <w:rPr>
+          <w:b/>
+          <w:bCs/>
+        </w:rPr>
+        <w:t xml:space="preserve">une ligne sur deux (les impaires)</w:t>
+      </w:r>
+      <w:r>
+        <w:t xml:space="preserve"> forme un message d'alerte à l'Alliance — procédé </w:t>
+      </w:r>
+      <w:r>
+        <w:rPr>
+          <w:b/>
+          <w:bCs/>
+        </w:rPr>
+        <w:t xml:space="preserve">« Sand/Musset »</w:t>
+      </w:r>
+      <w:r>
+        <w:t xml:space="preserve"> (un texte anodin dont une ligne sur deux cache un second message). Un intermédiaire, </w:t>
+      </w:r>
+      <w:r>
+        <w:rPr>
+          <w:b/>
+          <w:bCs/>
+        </w:rPr>
+        <w:t xml:space="preserve">le Courtier</w:t>
+      </w:r>
+      <w:r>
+        <w:t xml:space="preserve">, l'a relayé à la Rébellion : c'est ce qui amène les PJ à Kessel-Tho.</w:t>
+      </w:r>
+    </w:p>
+    <w:p>
+      <w:pPr>
+        <w:spacing w:after="120" w:line="264"/>
+        <w:jc w:val="both"/>
+      </w:pPr>
+      <w:r>
+        <w:rPr>
+          <w:b/>
+          <w:bCs/>
+        </w:rPr>
+        <w:t xml:space="preserve">Volontairement, les coordonnées de la flotte n'y figurent pas</w:t>
+      </w:r>
+      <w:r>
+        <w:t xml:space="preserve"> (ni en surface, ni en caché) : Tana refuse de les confier à un canal ouvert. Il faut la retrouver physiquement et déchiffrer son journal.</w:t>
+      </w:r>
+    </w:p>
+    <w:p>
+      <w:pPr>
+        <w:spacing w:before="40" w:after="40"/>
+      </w:pPr>
+      <w:r>
+        <w:rPr>
+          <w:b/>
+          <w:bCs/>
+          <w:color w:val="8A1C1C"/>
+          <w:sz w:val="19"/>
+          <w:szCs w:val="19"/>
+        </w:rPr>
+        <w:t xml:space="preserve">Le message caché (lignes impaires), en clair :</w:t>
+      </w:r>
+    </w:p>
+    <w:p>
+      <w:pPr>
+        <w:pStyle w:val="ListParagraph"/>
+        <w:numPr>
+          <w:ilvl w:val="0"/>
+          <w:numId w:val="2"/>
+        </w:numPr>
+        <w:spacing w:after="40" w:line="258"/>
+      </w:pPr>
+      <w:r>
+        <w:rPr>
+          <w:b/>
+          <w:bCs/>
+        </w:rPr>
+        <w:t xml:space="preserve">« Le Faucheur est de sortie »</w:t>
+      </w:r>
+      <w:r>
+        <w:t xml:space="preserve"> → le Projet Faucheur est opérationnel et en mouvement.</w:t>
+      </w:r>
+    </w:p>
+    <w:p>
+      <w:pPr>
+        <w:pStyle w:val="ListParagraph"/>
+        <w:numPr>
+          <w:ilvl w:val="0"/>
+          <w:numId w:val="2"/>
+        </w:numPr>
+        <w:spacing w:after="40" w:line="258"/>
+      </w:pPr>
+      <w:r>
+        <w:rPr>
+          <w:b/>
+          <w:bCs/>
+        </w:rPr>
+        <w:t xml:space="preserve">« …trajectoire mesurée et calibrée sur plus de deux semaines »</w:t>
+      </w:r>
+      <w:r>
+        <w:t xml:space="preserve"> → elle a suivi et calculé leur trajectoire : elle sait où ils vont.</w:t>
+      </w:r>
+    </w:p>
+    <w:p>
+      <w:pPr>
+        <w:pStyle w:val="ListParagraph"/>
+        <w:numPr>
+          <w:ilvl w:val="0"/>
+          <w:numId w:val="2"/>
+        </w:numPr>
+        <w:spacing w:after="40" w:line="258"/>
+      </w:pPr>
+      <w:r>
+        <w:rPr>
+          <w:b/>
+          <w:bCs/>
+        </w:rPr>
+        <w:t xml:space="preserve">« …à l'écoute notamment chez les / impériaux »</w:t>
+      </w:r>
+      <w:r>
+        <w:t xml:space="preserve"> → le canal est surveillé par l'Empire (prudence).</w:t>
+      </w:r>
+    </w:p>
+    <w:p>
+      <w:pPr>
+        <w:pStyle w:val="ListParagraph"/>
+        <w:numPr>
+          <w:ilvl w:val="0"/>
+          <w:numId w:val="2"/>
+        </w:numPr>
+        <w:spacing w:after="40" w:line="258"/>
+      </w:pPr>
+      <w:r>
+        <w:rPr>
+          <w:b/>
+          <w:bCs/>
+        </w:rPr>
+        <w:t xml:space="preserve">« Bafouille … chez la marchande Doiron, quai de Kessel-Tho »</w:t>
+      </w:r>
+      <w:r>
+        <w:t xml:space="preserve"> → point de contact et identité de couverture.</w:t>
+      </w:r>
+    </w:p>
+    <w:p>
+      <w:pPr>
+        <w:pStyle w:val="ListParagraph"/>
+        <w:numPr>
+          <w:ilvl w:val="0"/>
+          <w:numId w:val="2"/>
+        </w:numPr>
+        <w:spacing w:after="40" w:line="258"/>
+      </w:pPr>
+      <w:r>
+        <w:rPr>
+          <w:b/>
+          <w:bCs/>
+        </w:rPr>
+        <w:t xml:space="preserve">« Je change de casier tous les jours, situation instable »</w:t>
+      </w:r>
+      <w:r>
+        <w:t xml:space="preserve"> → elle est traquée, elle se déplace.</w:t>
+      </w:r>
+    </w:p>
+    <w:p>
+      <w:pPr>
+        <w:pStyle w:val="ListParagraph"/>
+        <w:numPr>
+          <w:ilvl w:val="0"/>
+          <w:numId w:val="2"/>
+        </w:numPr>
+        <w:spacing w:after="40" w:line="258"/>
+      </w:pPr>
+      <w:r>
+        <w:rPr>
+          <w:b/>
+          <w:bCs/>
+        </w:rPr>
+        <w:t xml:space="preserve">« Ne tardez pas, l'offre ne durera pas »</w:t>
+      </w:r>
+      <w:r>
+        <w:t xml:space="preserve"> → urgence absolue.</w:t>
+      </w:r>
+    </w:p>
+    <w:p>
+      <w:pPr>
+        <w:spacing w:after="120" w:line="264"/>
+        <w:jc w:val="both"/>
+      </w:pPr>
+      <w:r>
+        <w:rPr>
+          <w:b/>
+          <w:bCs/>
+        </w:rPr>
+        <w:t xml:space="preserve">Le double sens de « impériaux ».</w:t>
+      </w:r>
+      <w:r>
+        <w:t xml:space="preserve"> Le mot revient deux fois : en surface c'est la devise (« crédits impériaux »), mais isolé dans la lecture cachée il se lit « les Impériaux » — l'Empire. L'effet est voulu.</w:t>
+      </w:r>
+    </w:p>
+    <w:p>
+      <w:pPr>
+        <w:spacing w:after="120" w:line="264"/>
+        <w:jc w:val="both"/>
+      </w:pPr>
+      <w:r>
+        <w:rPr>
+          <w:b/>
+          <w:bCs/>
+        </w:rPr>
+        <w:t xml:space="preserve">Aide si les joueurs bloquent :</w:t>
+      </w:r>
+      <w:r>
+        <w:t xml:space="preserve"> les redondances (« nommé Bafouille / chez la marchande Doiron ») et le mot « impériaux » répété sont des anomalies de rédaction qui trahissent une structure. Qui connaît la correspondance Sand/Musset trouve aussitôt — bonne récompense de culture générale.</w:t>
+      </w:r>
+    </w:p>
+    <w:p>
+      <w:pPr>
+        <w:spacing w:before="80" w:after="60"/>
+      </w:pPr>
+      <w:r>
+        <w:rPr>
+          <w:b/>
+          <w:bCs/>
+          <w:color w:val="3A5A7A"/>
+          <w:sz w:val="19"/>
+          <w:szCs w:val="19"/>
+        </w:rPr>
+        <w:t xml:space="preserve">À imprimer pour les joueurs :</w:t>
+      </w:r>
+    </w:p>
+    <w:tbl>
+      <w:tblPr>
+        <w:tblW w:type="dxa" w:w="9638"/>
+        <w:tblBorders>
+          <w:top w:val="single" w:color="8A1C1C" w:sz="10"/>
+          <w:left w:val="single" w:color="8A1C1C" w:sz="10"/>
+          <w:bottom w:val="single" w:color="8A1C1C" w:sz="10"/>
+          <w:right w:val="single" w:color="8A1C1C" w:sz="10"/>
+          <w:insideH w:val="single" w:color="8A1C1C" w:sz="10"/>
+          <w:insideV w:val="single" w:color="8A1C1C" w:sz="10"/>
+        </w:tblBorders>
+      </w:tblPr>
+      <w:tblGrid>
+        <w:gridCol w:w="9638"/>
+      </w:tblGrid>
+      <w:tr>
+        <w:tc>
+          <w:tcPr>
+            <w:tcW w:type="dxa" w:w="9638"/>
+            <w:shd w:fill="FBF7EE" w:color="auto" w:val="clear"/>
+            <w:tcMar>
+              <w:top w:type="dxa" w:w="200"/>
+              <w:left w:type="dxa" w:w="240"/>
+              <w:bottom w:type="dxa" w:w="200"/>
+              <w:right w:type="dxa" w:w="240"/>
+            </w:tcMar>
+          </w:tcPr>
+          <w:p>
+            <w:pPr>
+              <w:spacing w:after="20"/>
+              <w:jc w:val="center"/>
+            </w:pPr>
+            <w:r>
+              <w:rPr>
+                <w:b/>
+                <w:bCs/>
+                <w:color w:val="222222"/>
+                <w:sz w:val="22"/>
+                <w:szCs w:val="22"/>
+                <w:rFonts w:ascii="Consolas" w:cs="Consolas" w:eastAsia="Consolas" w:hAnsi="Consolas"/>
+              </w:rPr>
+              <w:t xml:space="preserve">PETITES ANNONCES — SECTEUR KESSEL</w:t>
+            </w:r>
+          </w:p>
+          <w:p>
+            <w:pPr>
+              <w:pBdr>
+                <w:bottom w:val="single" w:color="C9B99A" w:sz="4"/>
+              </w:pBdr>
+              <w:spacing w:after="160"/>
+              <w:jc w:val="center"/>
+            </w:pPr>
+            <w:r>
+              <w:rPr>
+                <w:i/>
+                <w:iCs/>
+                <w:color w:val="666666"/>
+                <w:sz w:val="16"/>
+                <w:szCs w:val="16"/>
+                <w:rFonts w:ascii="Consolas" w:cs="Consolas" w:eastAsia="Consolas" w:hAnsi="Consolas"/>
+              </w:rPr>
+              <w:t xml:space="preserve">canal privé — lot du cycle</w:t>
+            </w:r>
+          </w:p>
+          <w:p>
+            <w:pPr>
+              <w:spacing w:after="26" w:line="240"/>
+            </w:pPr>
+            <w:r>
+              <w:rPr>
+                <w:color w:val="222222"/>
+                <w:sz w:val="18"/>
+                <w:szCs w:val="18"/>
+                <w:rFonts w:ascii="Consolas" w:cs="Consolas" w:eastAsia="Consolas" w:hAnsi="Consolas"/>
+              </w:rPr>
+              <w:t xml:space="preserve">Le Faucheur est de sortie</w:t>
+            </w:r>
+          </w:p>
+          <w:p>
+            <w:pPr>
+              <w:spacing w:after="26" w:line="240"/>
+            </w:pPr>
+            <w:r>
+              <w:rPr>
+                <w:color w:val="222222"/>
+                <w:sz w:val="18"/>
+                <w:szCs w:val="18"/>
+                <w:rFonts w:ascii="Consolas" w:cs="Consolas" w:eastAsia="Consolas" w:hAnsi="Consolas"/>
+              </w:rPr>
+              <w:t xml:space="preserve">Lots disponibles comme d'habitude, premier arrivé, premier servi</w:t>
+            </w:r>
+          </w:p>
+          <w:p>
+            <w:pPr>
+              <w:spacing w:after="26" w:line="240"/>
+            </w:pPr>
+            <w:r>
+              <w:rPr>
+                <w:color w:val="222222"/>
+                <w:sz w:val="18"/>
+                <w:szCs w:val="18"/>
+                <w:rFonts w:ascii="Consolas" w:cs="Consolas" w:eastAsia="Consolas" w:hAnsi="Consolas"/>
+              </w:rPr>
+              <w:t xml:space="preserve">Il y a du gros et du très gros cette fois-ci avec ces</w:t>
+            </w:r>
+          </w:p>
+          <w:p>
+            <w:pPr>
+              <w:spacing w:after="26" w:line="240"/>
+            </w:pPr>
+            <w:r>
+              <w:rPr>
+                <w:color w:val="222222"/>
+                <w:sz w:val="18"/>
+                <w:szCs w:val="18"/>
+                <w:rFonts w:ascii="Consolas" w:cs="Consolas" w:eastAsia="Consolas" w:hAnsi="Consolas"/>
+              </w:rPr>
+              <w:t xml:space="preserve">lots de convertisseurs d'énergie, état correct, prix 200 crédits</w:t>
+            </w:r>
+          </w:p>
+          <w:p>
+            <w:pPr>
+              <w:spacing w:after="26" w:line="240"/>
+            </w:pPr>
+            <w:r>
+              <w:rPr>
+                <w:color w:val="222222"/>
+                <w:sz w:val="18"/>
+                <w:szCs w:val="18"/>
+                <w:rFonts w:ascii="Consolas" w:cs="Consolas" w:eastAsia="Consolas" w:hAnsi="Consolas"/>
+              </w:rPr>
+              <w:t xml:space="preserve">impériaux, pas de négociation possible</w:t>
+            </w:r>
+          </w:p>
+          <w:p>
+            <w:pPr>
+              <w:spacing w:after="26" w:line="240"/>
+            </w:pPr>
+            <w:r>
+              <w:rPr>
+                <w:color w:val="222222"/>
+                <w:sz w:val="18"/>
+                <w:szCs w:val="18"/>
+                <w:rFonts w:ascii="Consolas" w:cs="Consolas" w:eastAsia="Consolas" w:hAnsi="Consolas"/>
+              </w:rPr>
+              <w:t xml:space="preserve">Aussi disponible un casque de pilote Z-95 avec son émission de</w:t>
+            </w:r>
+          </w:p>
+          <w:p>
+            <w:pPr>
+              <w:spacing w:after="26" w:line="240"/>
+            </w:pPr>
+            <w:r>
+              <w:rPr>
+                <w:color w:val="222222"/>
+                <w:sz w:val="18"/>
+                <w:szCs w:val="18"/>
+                <w:rFonts w:ascii="Consolas" w:cs="Consolas" w:eastAsia="Consolas" w:hAnsi="Consolas"/>
+              </w:rPr>
+              <w:t xml:space="preserve">trajectoire mesurée et calibrée sur plus de deux semaines,</w:t>
+            </w:r>
+          </w:p>
+          <w:p>
+            <w:pPr>
+              <w:spacing w:after="26" w:line="240"/>
+            </w:pPr>
+            <w:r>
+              <w:rPr>
+                <w:color w:val="222222"/>
+                <w:sz w:val="18"/>
+                <w:szCs w:val="18"/>
+                <w:rFonts w:ascii="Consolas" w:cs="Consolas" w:eastAsia="Consolas" w:hAnsi="Consolas"/>
+              </w:rPr>
+              <w:t xml:space="preserve">visière à remplacer, prix 50 crédits impériaux, négociation</w:t>
+            </w:r>
+          </w:p>
+          <w:p>
+            <w:pPr>
+              <w:spacing w:after="26" w:line="240"/>
+            </w:pPr>
+            <w:r>
+              <w:rPr>
+                <w:color w:val="222222"/>
+                <w:sz w:val="18"/>
+                <w:szCs w:val="18"/>
+                <w:rFonts w:ascii="Consolas" w:cs="Consolas" w:eastAsia="Consolas" w:hAnsi="Consolas"/>
+              </w:rPr>
+              <w:t xml:space="preserve">possible</w:t>
+            </w:r>
+          </w:p>
+          <w:p>
+            <w:pPr>
+              <w:spacing w:after="26" w:line="240"/>
+            </w:pPr>
+            <w:r>
+              <w:rPr>
+                <w:color w:val="222222"/>
+                <w:sz w:val="18"/>
+                <w:szCs w:val="18"/>
+                <w:rFonts w:ascii="Consolas" w:cs="Consolas" w:eastAsia="Consolas" w:hAnsi="Consolas"/>
+              </w:rPr>
+              <w:t xml:space="preserve">Containers de pièces de blindage, en gros uniquement. J'espère</w:t>
+            </w:r>
+          </w:p>
+          <w:p>
+            <w:pPr>
+              <w:spacing w:after="26" w:line="240"/>
+            </w:pPr>
+            <w:r>
+              <w:rPr>
+                <w:color w:val="222222"/>
+                <w:sz w:val="18"/>
+                <w:szCs w:val="18"/>
+                <w:rFonts w:ascii="Consolas" w:cs="Consolas" w:eastAsia="Consolas" w:hAnsi="Consolas"/>
+              </w:rPr>
+              <w:t xml:space="preserve">que du monde soit intéressé et à l'écoute notamment chez les</w:t>
+            </w:r>
+          </w:p>
+          <w:p>
+            <w:pPr>
+              <w:spacing w:after="26" w:line="240"/>
+            </w:pPr>
+            <w:r>
+              <w:rPr>
+                <w:color w:val="222222"/>
+                <w:sz w:val="18"/>
+                <w:szCs w:val="18"/>
+                <w:rFonts w:ascii="Consolas" w:cs="Consolas" w:eastAsia="Consolas" w:hAnsi="Consolas"/>
+              </w:rPr>
+              <w:t xml:space="preserve">pirates. Paiement par virement exigé, prix à la tonne 500 crédits</w:t>
+            </w:r>
+          </w:p>
+          <w:p>
+            <w:pPr>
+              <w:spacing w:after="26" w:line="240"/>
+            </w:pPr>
+            <w:r>
+              <w:rPr>
+                <w:color w:val="222222"/>
+                <w:sz w:val="18"/>
+                <w:szCs w:val="18"/>
+                <w:rFonts w:ascii="Consolas" w:cs="Consolas" w:eastAsia="Consolas" w:hAnsi="Consolas"/>
+              </w:rPr>
+              <w:t xml:space="preserve">impériaux</w:t>
+            </w:r>
+          </w:p>
+          <w:p>
+            <w:pPr>
+              <w:spacing w:after="26" w:line="240"/>
+            </w:pPr>
+            <w:r>
+              <w:rPr>
+                <w:color w:val="222222"/>
+                <w:sz w:val="18"/>
+                <w:szCs w:val="18"/>
+                <w:rFonts w:ascii="Consolas" w:cs="Consolas" w:eastAsia="Consolas" w:hAnsi="Consolas"/>
+              </w:rPr>
+              <w:t xml:space="preserve">Droïde astromécano listé en commission, dévoué, compétent nommé</w:t>
+            </w:r>
+          </w:p>
+          <w:p>
+            <w:pPr>
+              <w:spacing w:after="26" w:line="240"/>
+            </w:pPr>
+            <w:r>
+              <w:rPr>
+                <w:color w:val="222222"/>
+                <w:sz w:val="18"/>
+                <w:szCs w:val="18"/>
+                <w:rFonts w:ascii="Consolas" w:cs="Consolas" w:eastAsia="Consolas" w:hAnsi="Consolas"/>
+              </w:rPr>
+              <w:t xml:space="preserve">Bafouille disponible chez la marchande Doiron, quai de Kessel-Tho</w:t>
+            </w:r>
+          </w:p>
+          <w:p>
+            <w:pPr>
+              <w:spacing w:after="26" w:line="240"/>
+            </w:pPr>
+            <w:r>
+              <w:rPr>
+                <w:color w:val="222222"/>
+                <w:sz w:val="18"/>
+                <w:szCs w:val="18"/>
+                <w:rFonts w:ascii="Consolas" w:cs="Consolas" w:eastAsia="Consolas" w:hAnsi="Consolas"/>
+              </w:rPr>
+              <w:t xml:space="preserve">Réservoirs auxiliaires, fuite mineure, bon pour pièces.</w:t>
+            </w:r>
+          </w:p>
+          <w:p>
+            <w:pPr>
+              <w:spacing w:after="26" w:line="240"/>
+            </w:pPr>
+            <w:r>
+              <w:rPr>
+                <w:color w:val="222222"/>
+                <w:sz w:val="18"/>
+                <w:szCs w:val="18"/>
+                <w:rFonts w:ascii="Consolas" w:cs="Consolas" w:eastAsia="Consolas" w:hAnsi="Consolas"/>
+              </w:rPr>
+              <w:t xml:space="preserve">Je change de casier tous les jours, situation instable.</w:t>
+            </w:r>
+          </w:p>
+          <w:p>
+            <w:pPr>
+              <w:spacing w:after="26" w:line="240"/>
+            </w:pPr>
+            <w:r>
+              <w:rPr>
+                <w:color w:val="222222"/>
+                <w:sz w:val="18"/>
+                <w:szCs w:val="18"/>
+                <w:rFonts w:ascii="Consolas" w:cs="Consolas" w:eastAsia="Consolas" w:hAnsi="Consolas"/>
+              </w:rPr>
+              <w:t xml:space="preserve">Livraison main à main uniquement, pas d'intermédiaire.</w:t>
+            </w:r>
+          </w:p>
+          <w:p>
+            <w:pPr>
+              <w:spacing w:after="26" w:line="240"/>
+            </w:pPr>
+            <w:r>
+              <w:rPr>
+                <w:color w:val="222222"/>
+                <w:sz w:val="18"/>
+                <w:szCs w:val="18"/>
+                <w:rFonts w:ascii="Consolas" w:cs="Consolas" w:eastAsia="Consolas" w:hAnsi="Consolas"/>
+              </w:rPr>
+              <w:t xml:space="preserve">Ne tardez pas, l'offre ne durera pas.</w:t>
+            </w:r>
+          </w:p>
+          <w:p>
+            <w:pPr>
+              <w:spacing w:after="26" w:line="240"/>
+            </w:pPr>
+            <w:r>
+              <w:rPr>
+                <w:color w:val="222222"/>
+                <w:sz w:val="18"/>
+                <w:szCs w:val="18"/>
+                <w:rFonts w:ascii="Consolas" w:cs="Consolas" w:eastAsia="Consolas" w:hAnsi="Consolas"/>
+              </w:rPr>
+              <w:t xml:space="preserve">Contactez le Courtier habituel pour les détails.</w:t>
+            </w:r>
+          </w:p>
+        </w:tc>
+      </w:tr>
+    </w:tbl>
+    <w:p>
+      <w:pPr>
+        <w:spacing w:before="100"/>
+      </w:pPr>
+      <w:r>
+        <w:rPr>
+          <w:i/>
+          <w:iCs/>
+        </w:rPr>
+        <w:t xml:space="preserve">Source détaillée (version annotée ligne à ligne, traduction complète) : `docs/message_initial_tana.docx`.</w:t>
+      </w:r>
+    </w:p>
+    <w:p>
+      <w:pPr>
         <w:spacing w:before="240"/>
         <w:jc w:val="center"/>
       </w:pPr>
@@ -9056,11 +9682,10 @@
       </w:r>
     </w:p>
     <w:sectPr>
-      <w:footerReference w:type="default" r:id="rId6"/>
+      <w:footerReference w:type="default" r:id="rId7"/>
       <w:pgSz w:w="11906" w:h="16838" w:orient="portrait"/>
       <w:pgMar w:top="1134" w:right="1134" w:bottom="1134" w:left="1134" w:header="708" w:footer="708" w:gutter="0"/>
       <w:pgNumType/>
-      <w:cols w:space="454" w:num="2" w:equalWidth="true"/>
       <w:docGrid w:linePitch="360"/>
     </w:sectPr>
   </w:body>
@@ -9072,6 +9697,38 @@
 </file>
 
 <file path=word/footer1.xml><?xml version="1.0" encoding="utf-8"?>
+<w:ftr xmlns:wpc="http://schemas.microsoft.com/office/word/2010/wordprocessingCanvas" xmlns:mc="http://schemas.openxmlformats.org/markup-compatibility/2006" xmlns:o="urn:schemas-microsoft-com:office:office" xmlns:r="http://schemas.openxmlformats.org/officeDocument/2006/relationships" xmlns:m="http://schemas.openxmlformats.org/officeDocument/2006/math" xmlns:v="urn:schemas-microsoft-com:vml" xmlns:wp14="http://schemas.microsoft.com/office/word/2010/wordprocessingDrawing" xmlns:wp="http://schemas.openxmlformats.org/drawingml/2006/wordprocessingDrawing" xmlns:w10="urn:schemas-microsoft-com:office:word" xmlns:w="http://schemas.openxmlformats.org/wordprocessingml/2006/main" xmlns:w14="http://schemas.microsoft.com/office/word/2010/wordml" xmlns:w15="http://schemas.microsoft.com/office/word/2012/wordml" xmlns:wpg="http://schemas.microsoft.com/office/word/2010/wordprocessingGroup" xmlns:wpi="http://schemas.microsoft.com/office/word/2010/wordprocessingInk" xmlns:wne="http://schemas.microsoft.com/office/word/2006/wordml" xmlns:wps="http://schemas.microsoft.com/office/word/2010/wordprocessingShape">
+  <w:p>
+    <w:pPr>
+      <w:pBdr>
+        <w:top w:val="single" w:color="CCCCCC" w:sz="4"/>
+      </w:pBdr>
+      <w:jc w:val="center"/>
+    </w:pPr>
+    <w:r>
+      <w:rPr>
+        <w:color w:val="999999"/>
+        <w:sz w:val="16"/>
+        <w:szCs w:val="16"/>
+      </w:rPr>
+      <w:t xml:space="preserve">Signal de Détresse — Kessel-Tho     </w:t>
+    </w:r>
+    <w:r>
+      <w:rPr>
+        <w:color w:val="999999"/>
+        <w:sz w:val="16"/>
+        <w:szCs w:val="16"/>
+      </w:rPr>
+      <w:fldChar w:fldCharType="begin"/>
+      <w:instrText xml:space="preserve">PAGE</w:instrText>
+      <w:fldChar w:fldCharType="separate"/>
+      <w:fldChar w:fldCharType="end"/>
+    </w:r>
+  </w:p>
+</w:ftr>
+</file>
+
+<file path=word/footer2.xml><?xml version="1.0" encoding="utf-8"?>
 <w:ftr xmlns:wpc="http://schemas.microsoft.com/office/word/2010/wordprocessingCanvas" xmlns:mc="http://schemas.openxmlformats.org/markup-compatibility/2006" xmlns:o="urn:schemas-microsoft-com:office:office" xmlns:r="http://schemas.openxmlformats.org/officeDocument/2006/relationships" xmlns:m="http://schemas.openxmlformats.org/officeDocument/2006/math" xmlns:v="urn:schemas-microsoft-com:vml" xmlns:wp14="http://schemas.microsoft.com/office/word/2010/wordprocessingDrawing" xmlns:wp="http://schemas.openxmlformats.org/drawingml/2006/wordprocessingDrawing" xmlns:w10="urn:schemas-microsoft-com:office:word" xmlns:w="http://schemas.openxmlformats.org/wordprocessingml/2006/main" xmlns:w14="http://schemas.microsoft.com/office/word/2010/wordml" xmlns:w15="http://schemas.microsoft.com/office/word/2012/wordml" xmlns:wpg="http://schemas.microsoft.com/office/word/2010/wordprocessingGroup" xmlns:wpi="http://schemas.microsoft.com/office/word/2010/wordprocessingInk" xmlns:wne="http://schemas.microsoft.com/office/word/2006/wordml" xmlns:wps="http://schemas.microsoft.com/office/word/2010/wordprocessingShape">
   <w:p>
     <w:pPr>

</xml_diff>

<commit_message>
TODO #4 — Météo des rayonnements de la Gueule (annexe B)
Annexe B (outil MJ, 2 colonnes) : échelle météo 1D/quart
(Calme/Instable/Tempête) à effets mécaniques double usage —
comms & détresse (-1D/-2D), horloge ISB (ralentie/gelée, cf. #2),
départs de vaisseaux (astrogation +1 / hyperespace suspendu) —
+ table d'incidents (1D) cross-liée (#2 ISB, #3 événement technique 2·2)
+ note de pilotage (levier de rythme pour le climax).
Re-lettrage des annexes : A Événements, B Rayonnements, C Handout.

Co-Authored-By: Claude Opus 4.8 <noreply@anthropic.com>
</commit_message>
<xml_diff>
--- a/star-wars/scenarios/birth-of-the-death-squadron/docs/scenario_signal_detresse_FUSION.docx
+++ b/star-wars/scenarios/birth-of-the-death-squadron/docs/scenario_signal_detresse_FUSION.docx
@@ -9041,6 +9041,454 @@
     </w:p>
     <w:p>
       <w:pPr>
+        <w:pStyle w:val="Heading2"/>
+      </w:pPr>
+      <w:r>
+        <w:t xml:space="preserve">B. Météo des rayonnements &amp; incidents gravitationnels (la Gueule)</w:t>
+      </w:r>
+    </w:p>
+    <w:p>
+      <w:pPr>
+        <w:spacing w:after="120" w:line="264"/>
+        <w:jc w:val="both"/>
+      </w:pPr>
+      <w:r>
+        <w:t xml:space="preserve">Kessel-Tho est en bordure de </w:t>
+      </w:r>
+      <w:r>
+        <w:rPr>
+          <w:b/>
+          <w:bCs/>
+        </w:rPr>
+        <w:t xml:space="preserve">la Gueule</w:t>
+      </w:r>
+      <w:r>
+        <w:t xml:space="preserve">, l'amas de trous noirs du système. Tempêtes de rayonnement, pics gravitationnels et brouillage des senseurs font partie du décor — et de la mécanique. Roulez </w:t>
+      </w:r>
+      <w:r>
+        <w:rPr>
+          <w:b/>
+          <w:bCs/>
+        </w:rPr>
+        <w:t xml:space="preserve">1D par quart</w:t>
+      </w:r>
+      <w:r>
+        <w:t xml:space="preserve"> (ou quand le récit s'y prête) ; en cas d'agitation, complétez par un </w:t>
+      </w:r>
+      <w:r>
+        <w:rPr>
+          <w:b/>
+          <w:bCs/>
+        </w:rPr>
+        <w:t xml:space="preserve">incident</w:t>
+      </w:r>
+      <w:r>
+        <w:t xml:space="preserve">.</w:t>
+      </w:r>
+    </w:p>
+    <w:p>
+      <w:pPr>
+        <w:keepNext/>
+        <w:spacing w:before="40" w:after="60"/>
+      </w:pPr>
+      <w:r>
+        <w:rPr>
+          <w:b/>
+          <w:bCs/>
+          <w:color w:val="8A1C1C"/>
+          <w:sz w:val="19"/>
+          <w:szCs w:val="19"/>
+        </w:rPr>
+        <w:t xml:space="preserve">Échelle météo (1D par quart)</w:t>
+      </w:r>
+    </w:p>
+    <w:p>
+      <w:pPr>
+        <w:pStyle w:val="ListParagraph"/>
+        <w:numPr>
+          <w:ilvl w:val="0"/>
+          <w:numId w:val="2"/>
+        </w:numPr>
+        <w:spacing w:after="60" w:line="260"/>
+        <w:jc w:val="both"/>
+      </w:pPr>
+      <w:r>
+        <w:rPr>
+          <w:b/>
+          <w:bCs/>
+        </w:rPr>
+        <w:t xml:space="preserve">1-3 · Calme.</w:t>
+      </w:r>
+      <w:r>
+        <w:t xml:space="preserve"> Rien de notable. Comms et senseurs nominaux ; départs normaux ; horloge ISB : avance normale.</w:t>
+      </w:r>
+    </w:p>
+    <w:p>
+      <w:pPr>
+        <w:pStyle w:val="ListParagraph"/>
+        <w:numPr>
+          <w:ilvl w:val="0"/>
+          <w:numId w:val="2"/>
+        </w:numPr>
+        <w:spacing w:after="60" w:line="260"/>
+        <w:jc w:val="both"/>
+      </w:pPr>
+      <w:r>
+        <w:rPr>
+          <w:b/>
+          <w:bCs/>
+        </w:rPr>
+        <w:t xml:space="preserve">4-5 · Instable.</w:t>
+      </w:r>
+      <w:r>
+        <w:t xml:space="preserve"> Grésillements, brouillage intermittent. </w:t>
+      </w:r>
+      <w:r>
+        <w:rPr>
+          <w:b/>
+          <w:bCs/>
+        </w:rPr>
+        <w:t xml:space="preserve">−1D</w:t>
+      </w:r>
+      <w:r>
+        <w:t xml:space="preserve"> aux jets de Communications et Sensoreurs (et pour capter/émettre la détresse) ; astrogation de départ </w:t>
+      </w:r>
+      <w:r>
+        <w:rPr>
+          <w:b/>
+          <w:bCs/>
+        </w:rPr>
+        <w:t xml:space="preserve">+1 cran de difficulté</w:t>
+      </w:r>
+      <w:r>
+        <w:t xml:space="preserve"> ; </w:t>
+      </w:r>
+      <w:r>
+        <w:rPr>
+          <w:b/>
+          <w:bCs/>
+        </w:rPr>
+        <w:t xml:space="preserve">l'horloge ISB n'avance pas passivement ce quart</w:t>
+      </w:r>
+      <w:r>
+        <w:t xml:space="preserve"> (le rebond se noie dans le bruit) ; roulez un incident.</w:t>
+      </w:r>
+    </w:p>
+    <w:p>
+      <w:pPr>
+        <w:pStyle w:val="ListParagraph"/>
+        <w:numPr>
+          <w:ilvl w:val="0"/>
+          <w:numId w:val="2"/>
+        </w:numPr>
+        <w:spacing w:after="60" w:line="260"/>
+        <w:jc w:val="both"/>
+      </w:pPr>
+      <w:r>
+        <w:rPr>
+          <w:b/>
+          <w:bCs/>
+        </w:rPr>
+        <w:t xml:space="preserve">6 · Tempête.</w:t>
+      </w:r>
+      <w:r>
+        <w:t xml:space="preserve"> Rayonnement intense et turbulences gravitationnelles. </w:t>
+      </w:r>
+      <w:r>
+        <w:rPr>
+          <w:b/>
+          <w:bCs/>
+        </w:rPr>
+        <w:t xml:space="preserve">−2D</w:t>
+      </w:r>
+      <w:r>
+        <w:t xml:space="preserve"> aux comms/senseurs, comms externes possiblement </w:t>
+      </w:r>
+      <w:r>
+        <w:rPr>
+          <w:b/>
+          <w:bCs/>
+        </w:rPr>
+        <w:t xml:space="preserve">coupées</w:t>
+      </w:r>
+      <w:r>
+        <w:t xml:space="preserve"> ; </w:t>
+      </w:r>
+      <w:r>
+        <w:rPr>
+          <w:b/>
+          <w:bCs/>
+        </w:rPr>
+        <w:t xml:space="preserve">départs en hyperespace suspendus</w:t>
+      </w:r>
+      <w:r>
+        <w:t xml:space="preserve"> (les vaisseaux sont cloués — l'exfiltration attendra) ; </w:t>
+      </w:r>
+      <w:r>
+        <w:rPr>
+          <w:b/>
+          <w:bCs/>
+        </w:rPr>
+        <w:t xml:space="preserve">horloge ISB gelée</w:t>
+      </w:r>
+      <w:r>
+        <w:t xml:space="preserve"> ce quart (répit ambigu : les PJ aussi sont bloqués) ; </w:t>
+      </w:r>
+      <w:r>
+        <w:rPr>
+          <w:b/>
+          <w:bCs/>
+        </w:rPr>
+        <w:t xml:space="preserve">incident garanti</w:t>
+      </w:r>
+      <w:r>
+        <w:t xml:space="preserve"> + danger radiologique pour qui reste exposé (coque fine, sortie extravéhiculaire).</w:t>
+      </w:r>
+    </w:p>
+    <w:p>
+      <w:pPr>
+        <w:keepNext/>
+        <w:spacing w:before="40" w:after="60"/>
+      </w:pPr>
+      <w:r>
+        <w:rPr>
+          <w:b/>
+          <w:bCs/>
+          <w:color w:val="8A1C1C"/>
+          <w:sz w:val="19"/>
+          <w:szCs w:val="19"/>
+        </w:rPr>
+        <w:t xml:space="preserve">Incidents (1D)</w:t>
+      </w:r>
+    </w:p>
+    <w:p>
+      <w:pPr>
+        <w:spacing w:after="20" w:line="248"/>
+        <w:ind w:left="300" w:hanging="300"/>
+        <w:jc w:val="both"/>
+      </w:pPr>
+      <w:r>
+        <w:rPr>
+          <w:b/>
+          <w:bCs/>
+          <w:color w:val="8A1C1C"/>
+        </w:rPr>
+        <w:t xml:space="preserve">1  </w:t>
+      </w:r>
+      <w:r>
+        <w:rPr>
+          <w:b/>
+          <w:bCs/>
+        </w:rPr>
+        <w:t xml:space="preserve">Cascade de parasites</w:t>
+      </w:r>
+      <w:r>
+        <w:t xml:space="preserve"> : les comms internes grésillent 10 min ; un message important arrive tronqué (le MJ coupe une info en deux).</w:t>
+      </w:r>
+    </w:p>
+    <w:p>
+      <w:pPr>
+        <w:spacing w:after="20" w:line="248"/>
+        <w:ind w:left="300" w:hanging="300"/>
+        <w:jc w:val="both"/>
+      </w:pPr>
+      <w:r>
+        <w:rPr>
+          <w:b/>
+          <w:bCs/>
+          <w:color w:val="8A1C1C"/>
+        </w:rPr>
+        <w:t xml:space="preserve">2  </w:t>
+      </w:r>
+      <w:r>
+        <w:rPr>
+          <w:b/>
+          <w:bCs/>
+        </w:rPr>
+        <w:t xml:space="preserve">Pic gravitationnel</w:t>
+      </w:r>
+      <w:r>
+        <w:t xml:space="preserve"> : brève micro-gravité dans un secteur ; jet d'Esquive ou de Vigueur pour ne pas être déséquilibré ; un sas se coince.</w:t>
+      </w:r>
+    </w:p>
+    <w:p>
+      <w:pPr>
+        <w:spacing w:after="20" w:line="248"/>
+        <w:ind w:left="300" w:hanging="300"/>
+        <w:jc w:val="both"/>
+      </w:pPr>
+      <w:r>
+        <w:rPr>
+          <w:b/>
+          <w:bCs/>
+          <w:color w:val="8A1C1C"/>
+        </w:rPr>
+        <w:t xml:space="preserve">3  </w:t>
+      </w:r>
+      <w:r>
+        <w:rPr>
+          <w:b/>
+          <w:bCs/>
+        </w:rPr>
+        <w:t xml:space="preserve">Bouffée de rayonnement</w:t>
+      </w:r>
+      <w:r>
+        <w:t xml:space="preserve"> : alarme radiologique, coursives extérieures évacuées ; qui reste exposé encaisse des dégâts (jet de Vigueur / ~1D de dégâts, à l'appréciation du MJ).</w:t>
+      </w:r>
+    </w:p>
+    <w:p>
+      <w:pPr>
+        <w:spacing w:after="20" w:line="248"/>
+        <w:ind w:left="300" w:hanging="300"/>
+        <w:jc w:val="both"/>
+      </w:pPr>
+      <w:r>
+        <w:rPr>
+          <w:b/>
+          <w:bCs/>
+          <w:color w:val="8A1C1C"/>
+        </w:rPr>
+        <w:t xml:space="preserve">4  </w:t>
+      </w:r>
+      <w:r>
+        <w:rPr>
+          <w:b/>
+          <w:bCs/>
+        </w:rPr>
+        <w:t xml:space="preserve">Senseurs aveugles</w:t>
+      </w:r>
+      <w:r>
+        <w:t xml:space="preserve"> : la station est « sourde » 30 min — un vaisseau peut arriver ou repartir </w:t>
+      </w:r>
+      <w:r>
+        <w:rPr>
+          <w:b/>
+          <w:bCs/>
+        </w:rPr>
+        <w:t xml:space="preserve">inaperçu</w:t>
+      </w:r>
+      <w:r>
+        <w:t xml:space="preserve"> (l'ISB… ou un allié). À double tranchant.</w:t>
+      </w:r>
+    </w:p>
+    <w:p>
+      <w:pPr>
+        <w:spacing w:after="20" w:line="248"/>
+        <w:ind w:left="300" w:hanging="300"/>
+        <w:jc w:val="both"/>
+      </w:pPr>
+      <w:r>
+        <w:rPr>
+          <w:b/>
+          <w:bCs/>
+          <w:color w:val="8A1C1C"/>
+        </w:rPr>
+        <w:t xml:space="preserve">5  </w:t>
+      </w:r>
+      <w:r>
+        <w:rPr>
+          <w:b/>
+          <w:bCs/>
+        </w:rPr>
+        <w:t xml:space="preserve">Surtension</w:t>
+      </w:r>
+      <w:r>
+        <w:t xml:space="preserve"> : couplée au réseau électrique fragile (cf. panne C19/J133), risque de </w:t>
+      </w:r>
+      <w:r>
+        <w:rPr>
+          <w:b/>
+          <w:bCs/>
+        </w:rPr>
+        <w:t xml:space="preserve">panne</w:t>
+      </w:r>
+      <w:r>
+        <w:t xml:space="preserve"> — enchaînez sur l'événement technique 2·2 ; les lumières faiblissent.</w:t>
+      </w:r>
+    </w:p>
+    <w:p>
+      <w:pPr>
+        <w:spacing w:after="20" w:line="248"/>
+        <w:ind w:left="300" w:hanging="300"/>
+        <w:jc w:val="both"/>
+      </w:pPr>
+      <w:r>
+        <w:rPr>
+          <w:b/>
+          <w:bCs/>
+          <w:color w:val="8A1C1C"/>
+        </w:rPr>
+        <w:t xml:space="preserve">6  </w:t>
+      </w:r>
+      <w:r>
+        <w:rPr>
+          <w:b/>
+          <w:bCs/>
+        </w:rPr>
+        <w:t xml:space="preserve">Fenêtre de silence</w:t>
+      </w:r>
+      <w:r>
+        <w:t xml:space="preserve"> : le brouillage couvre tout — </w:t>
+      </w:r>
+      <w:r>
+        <w:rPr>
+          <w:b/>
+          <w:bCs/>
+        </w:rPr>
+        <w:t xml:space="preserve">moment idéal</w:t>
+      </w:r>
+      <w:r>
+        <w:t xml:space="preserve"> pour une transmission clandestine (émettre/recevoir sans être triangulé) ou pour se faufiler pendant que les capteurs sont noyés.</w:t>
+      </w:r>
+    </w:p>
+    <w:p>
+      <w:pPr>
+        <w:spacing w:after="120" w:line="264"/>
+        <w:jc w:val="both"/>
+      </w:pPr>
+      <w:r>
+        <w:rPr>
+          <w:b/>
+          <w:bCs/>
+        </w:rPr>
+        <w:t xml:space="preserve">Pilotage.</w:t>
+      </w:r>
+      <w:r>
+        <w:t xml:space="preserve"> Une tempête est un excellent </w:t>
+      </w:r>
+      <w:r>
+        <w:rPr>
+          <w:b/>
+          <w:bCs/>
+        </w:rPr>
+        <w:t xml:space="preserve">levier de rythme</w:t>
+      </w:r>
+      <w:r>
+        <w:t xml:space="preserve"> : programmez-la pour le climax (piéger les PJ à quai, forcer un choix tendu), ou laissez-la émerger au dé. Elle </w:t>
+      </w:r>
+      <w:r>
+        <w:rPr>
+          <w:b/>
+          <w:bCs/>
+        </w:rPr>
+        <w:t xml:space="preserve">met en pause l'horloge ISB</w:t>
+      </w:r>
+      <w:r>
+        <w:t xml:space="preserve"> — utile pour souffler — mais </w:t>
+      </w:r>
+      <w:r>
+        <w:rPr>
+          <w:b/>
+          <w:bCs/>
+        </w:rPr>
+        <w:t xml:space="preserve">verrouille aussi les départs</w:t>
+      </w:r>
+      <w:r>
+        <w:t xml:space="preserve"> : le répit a un prix.</w:t>
+      </w:r>
+    </w:p>
+    <w:p>
+      <w:pPr>
         <w:sectPr>
           <w:footerReference w:type="default" r:id="rId6"/>
           <w:pgSz w:w="11906" w:h="16838" w:orient="portrait"/>
@@ -9056,7 +9504,7 @@
         <w:pStyle w:val="Heading2"/>
       </w:pPr>
       <w:r>
-        <w:t xml:space="preserve">B. Handout — Le message initial de Tana (le « message 0 »)</w:t>
+        <w:t xml:space="preserve">C. Handout — Le message initial de Tana (le « message 0 »)</w:t>
       </w:r>
     </w:p>
     <w:p>

</xml_diff>

<commit_message>
Annexe B — Table « Incidents du quotidien » (scènes de rue)
Ajoute la vraie table d'incidents demandée : le quotidien de la station sous
les yeux des PJ (vol/pickpocket, vendeur à la sauvette, rabatteur, mendicité,
prostitution, spice, musiciens, bonneteau, frictions, couleur locale…), d66,
avec scènes directes aux PJ et crochets (Chessa Vorn, souvenir de Tana,
propagande, filature ISB).

Réorganise les annexes : A Événements · B Incidents (rue) · C Météo · D Handout.
Renomme la sous-liste météo « Incidents » -> « Phénomènes » (évite la collision)
et met à jour les renvois croisés (annexe B -> C).

Co-Authored-By: Claude Opus 4.8 <noreply@anthropic.com>
</commit_message>
<xml_diff>
--- a/star-wars/scenarios/birth-of-the-death-squadron/docs/scenario_signal_detresse_FUSION.docx
+++ b/star-wars/scenarios/birth-of-the-death-squadron/docs/scenario_signal_detresse_FUSION.docx
@@ -8140,7 +8140,7 @@
           <w:i/>
           <w:iCs/>
         </w:rPr>
-        <w:t xml:space="preserve">(horloge ISB ; rayonnements → annexe B ; leviers sociaux)</w:t>
+        <w:t xml:space="preserve">(horloge ISB ; rayonnements → annexe C ; leviers sociaux)</w:t>
       </w:r>
       <w:r>
         <w:t xml:space="preserve">.</w:t>
@@ -8938,7 +8938,7 @@
           <w:i/>
           <w:iCs/>
         </w:rPr>
-        <w:t xml:space="preserve">(voir annexe B)</w:t>
+        <w:t xml:space="preserve">(voir annexe C)</w:t>
       </w:r>
       <w:r>
         <w:t xml:space="preserve">.</w:t>
@@ -9046,7 +9046,825 @@
         <w:pStyle w:val="Heading2"/>
       </w:pPr>
       <w:r>
-        <w:t xml:space="preserve">B. Météo des rayonnements &amp; incidents gravitationnels (la Gueule)</w:t>
+        <w:t xml:space="preserve">B. Incidents du quotidien (scènes de rue)</w:t>
+      </w:r>
+    </w:p>
+    <w:p>
+      <w:pPr>
+        <w:spacing w:after="120" w:line="264"/>
+        <w:jc w:val="both"/>
+      </w:pPr>
+      <w:r>
+        <w:t xml:space="preserve">Le quotidien grouillant de la station — ce qui se passe </w:t>
+      </w:r>
+      <w:r>
+        <w:rPr>
+          <w:b/>
+          <w:bCs/>
+        </w:rPr>
+        <w:t xml:space="preserve">sous les yeux des PJ</w:t>
+      </w:r>
+      <w:r>
+        <w:t xml:space="preserve">, et parfois </w:t>
+      </w:r>
+      <w:r>
+        <w:rPr>
+          <w:b/>
+          <w:bCs/>
+        </w:rPr>
+        <w:t xml:space="preserve">à leurs dépens</w:t>
+      </w:r>
+      <w:r>
+        <w:t xml:space="preserve">. Même usage que la table A (</w:t>
+      </w:r>
+      <w:r>
+        <w:rPr>
+          <w:b/>
+          <w:bCs/>
+        </w:rPr>
+        <w:t xml:space="preserve">1D</w:t>
+      </w:r>
+      <w:r>
+        <w:t xml:space="preserve"> thème + </w:t>
+      </w:r>
+      <w:r>
+        <w:rPr>
+          <w:b/>
+          <w:bCs/>
+        </w:rPr>
+        <w:t xml:space="preserve">1D</w:t>
+      </w:r>
+      <w:r>
+        <w:t xml:space="preserve"> scène). Certaines scènes s'adressent directement aux PJ (on les aborde, on les détrousse) ; d'autres se déroulent devant eux et font vivre le décor.</w:t>
+      </w:r>
+    </w:p>
+    <w:p>
+      <w:pPr>
+        <w:keepNext/>
+        <w:spacing w:before="90" w:after="40"/>
+      </w:pPr>
+      <w:r>
+        <w:rPr>
+          <w:b/>
+          <w:bCs/>
+          <w:color w:val="3A5A7A"/>
+          <w:sz w:val="19"/>
+          <w:szCs w:val="19"/>
+        </w:rPr>
+        <w:t xml:space="preserve">1 · Petite délinquance</w:t>
+      </w:r>
+    </w:p>
+    <w:p>
+      <w:pPr>
+        <w:spacing w:after="20" w:line="248"/>
+        <w:ind w:left="300" w:hanging="300"/>
+        <w:jc w:val="both"/>
+      </w:pPr>
+      <w:r>
+        <w:rPr>
+          <w:b/>
+          <w:bCs/>
+          <w:color w:val="8A1C1C"/>
+        </w:rPr>
+        <w:t xml:space="preserve">1  </w:t>
+      </w:r>
+      <w:r>
+        <w:t xml:space="preserve">Un pickpocket effleure un PJ (Perception vs Habileté manuelle) — bourse, comlink ou datapad visé.</w:t>
+      </w:r>
+    </w:p>
+    <w:p>
+      <w:pPr>
+        <w:spacing w:after="20" w:line="248"/>
+        <w:ind w:left="300" w:hanging="300"/>
+        <w:jc w:val="both"/>
+      </w:pPr>
+      <w:r>
+        <w:rPr>
+          <w:b/>
+          <w:bCs/>
+          <w:color w:val="8A1C1C"/>
+        </w:rPr>
+        <w:t xml:space="preserve">2  </w:t>
+      </w:r>
+      <w:r>
+        <w:t xml:space="preserve">Deux gamins créent une diversion pendant qu'un troisième fait les poches d'un badaud.</w:t>
+      </w:r>
+    </w:p>
+    <w:p>
+      <w:pPr>
+        <w:spacing w:after="20" w:line="248"/>
+        <w:ind w:left="300" w:hanging="300"/>
+        <w:jc w:val="both"/>
+      </w:pPr>
+      <w:r>
+        <w:rPr>
+          <w:b/>
+          <w:bCs/>
+          <w:color w:val="8A1C1C"/>
+        </w:rPr>
+        <w:t xml:space="preserve">3  </w:t>
+      </w:r>
+      <w:r>
+        <w:t xml:space="preserve">Un « vendeur » propose un cristal soi-disant kyber, manifestement faux, à prix cassé.</w:t>
+      </w:r>
+    </w:p>
+    <w:p>
+      <w:pPr>
+        <w:spacing w:after="20" w:line="248"/>
+        <w:ind w:left="300" w:hanging="300"/>
+        <w:jc w:val="both"/>
+      </w:pPr>
+      <w:r>
+        <w:rPr>
+          <w:b/>
+          <w:bCs/>
+          <w:color w:val="8A1C1C"/>
+        </w:rPr>
+        <w:t xml:space="preserve">4  </w:t>
+      </w:r>
+      <w:r>
+        <w:t xml:space="preserve">Un commerçant accuse un client de vol ; la foule se masse, ça peut déraper.</w:t>
+      </w:r>
+    </w:p>
+    <w:p>
+      <w:pPr>
+        <w:spacing w:after="20" w:line="248"/>
+        <w:ind w:left="300" w:hanging="300"/>
+        <w:jc w:val="both"/>
+      </w:pPr>
+      <w:r>
+        <w:rPr>
+          <w:b/>
+          <w:bCs/>
+          <w:color w:val="8A1C1C"/>
+        </w:rPr>
+        <w:t xml:space="preserve">5  </w:t>
+      </w:r>
+      <w:r>
+        <w:t xml:space="preserve">Un tire-laine détale avec une sacoche ; on crie « au voleur ! » — un PJ est-il sur son chemin ?</w:t>
+      </w:r>
+    </w:p>
+    <w:p>
+      <w:pPr>
+        <w:spacing w:after="20" w:line="248"/>
+        <w:ind w:left="300" w:hanging="300"/>
+        <w:jc w:val="both"/>
+      </w:pPr>
+      <w:r>
+        <w:rPr>
+          <w:b/>
+          <w:bCs/>
+          <w:color w:val="8A1C1C"/>
+        </w:rPr>
+        <w:t xml:space="preserve">6  </w:t>
+      </w:r>
+      <w:r>
+        <w:t xml:space="preserve">Un « gardien » propose de surveiller le vaisseau des PJ contre quelques crédits — sinon, « on ne sait jamais ».</w:t>
+      </w:r>
+    </w:p>
+    <w:p>
+      <w:pPr>
+        <w:keepNext/>
+        <w:spacing w:before="90" w:after="40"/>
+      </w:pPr>
+      <w:r>
+        <w:rPr>
+          <w:b/>
+          <w:bCs/>
+          <w:color w:val="3A5A7A"/>
+          <w:sz w:val="19"/>
+          <w:szCs w:val="19"/>
+        </w:rPr>
+        <w:t xml:space="preserve">2 · Sollicitations (on aborde les PJ)</w:t>
+      </w:r>
+    </w:p>
+    <w:p>
+      <w:pPr>
+        <w:spacing w:after="20" w:line="248"/>
+        <w:ind w:left="300" w:hanging="300"/>
+        <w:jc w:val="both"/>
+      </w:pPr>
+      <w:r>
+        <w:rPr>
+          <w:b/>
+          <w:bCs/>
+          <w:color w:val="8A1C1C"/>
+        </w:rPr>
+        <w:t xml:space="preserve">1  </w:t>
+      </w:r>
+      <w:r>
+        <w:t xml:space="preserve">Un vendeur à la sauvette déballe sa camelote (pièces, comlinks trafiqués) sous le nez des PJ.</w:t>
+      </w:r>
+    </w:p>
+    <w:p>
+      <w:pPr>
+        <w:spacing w:after="20" w:line="248"/>
+        <w:ind w:left="300" w:hanging="300"/>
+        <w:jc w:val="both"/>
+      </w:pPr>
+      <w:r>
+        <w:rPr>
+          <w:b/>
+          <w:bCs/>
+          <w:color w:val="8A1C1C"/>
+        </w:rPr>
+        <w:t xml:space="preserve">2  </w:t>
+      </w:r>
+      <w:r>
+        <w:t xml:space="preserve">Un mendiant s'accroche et sert une histoire larmoyante — vraie ou non.</w:t>
+      </w:r>
+    </w:p>
+    <w:p>
+      <w:pPr>
+        <w:spacing w:after="20" w:line="248"/>
+        <w:ind w:left="300" w:hanging="300"/>
+        <w:jc w:val="both"/>
+      </w:pPr>
+      <w:r>
+        <w:rPr>
+          <w:b/>
+          <w:bCs/>
+          <w:color w:val="8A1C1C"/>
+        </w:rPr>
+        <w:t xml:space="preserve">3  </w:t>
+      </w:r>
+      <w:r>
+        <w:t xml:space="preserve">Un rabatteur vante une cantina ou un tripot « discret, pas de questions ».</w:t>
+      </w:r>
+    </w:p>
+    <w:p>
+      <w:pPr>
+        <w:spacing w:after="20" w:line="248"/>
+        <w:ind w:left="300" w:hanging="300"/>
+        <w:jc w:val="both"/>
+      </w:pPr>
+      <w:r>
+        <w:rPr>
+          <w:b/>
+          <w:bCs/>
+          <w:color w:val="8A1C1C"/>
+        </w:rPr>
+        <w:t xml:space="preserve">4  </w:t>
+      </w:r>
+      <w:r>
+        <w:t xml:space="preserve">Un prostitué ou une prostituée aborde un PJ, sourire fatigué.</w:t>
+      </w:r>
+    </w:p>
+    <w:p>
+      <w:pPr>
+        <w:spacing w:after="20" w:line="248"/>
+        <w:ind w:left="300" w:hanging="300"/>
+        <w:jc w:val="both"/>
+      </w:pPr>
+      <w:r>
+        <w:rPr>
+          <w:b/>
+          <w:bCs/>
+          <w:color w:val="8A1C1C"/>
+        </w:rPr>
+        <w:t xml:space="preserve">5  </w:t>
+      </w:r>
+      <w:r>
+        <w:t xml:space="preserve">Un « guide » propose de mener les PJ « où ils veulent, sans être vus » — utile, ou piège.</w:t>
+      </w:r>
+    </w:p>
+    <w:p>
+      <w:pPr>
+        <w:spacing w:after="20" w:line="248"/>
+        <w:ind w:left="300" w:hanging="300"/>
+        <w:jc w:val="both"/>
+      </w:pPr>
+      <w:r>
+        <w:rPr>
+          <w:b/>
+          <w:bCs/>
+          <w:color w:val="8A1C1C"/>
+        </w:rPr>
+        <w:t xml:space="preserve">6  </w:t>
+      </w:r>
+      <w:r>
+        <w:t xml:space="preserve">Un prêcheur d'une secte de la Bordure harangue les passants sur la fin des temps.</w:t>
+      </w:r>
+    </w:p>
+    <w:p>
+      <w:pPr>
+        <w:keepNext/>
+        <w:spacing w:before="90" w:after="40"/>
+      </w:pPr>
+      <w:r>
+        <w:rPr>
+          <w:b/>
+          <w:bCs/>
+          <w:color w:val="3A5A7A"/>
+          <w:sz w:val="19"/>
+          <w:szCs w:val="19"/>
+        </w:rPr>
+        <w:t xml:space="preserve">3 · Marges &amp; misère</w:t>
+      </w:r>
+    </w:p>
+    <w:p>
+      <w:pPr>
+        <w:spacing w:after="20" w:line="248"/>
+        <w:ind w:left="300" w:hanging="300"/>
+        <w:jc w:val="both"/>
+      </w:pPr>
+      <w:r>
+        <w:rPr>
+          <w:b/>
+          <w:bCs/>
+          <w:color w:val="8A1C1C"/>
+        </w:rPr>
+        <w:t xml:space="preserve">1  </w:t>
+      </w:r>
+      <w:r>
+        <w:t xml:space="preserve">Un spice-head hagard fouille les rebuts ; il a peut-être vu quelque chose cette nuit.</w:t>
+      </w:r>
+    </w:p>
+    <w:p>
+      <w:pPr>
+        <w:spacing w:after="20" w:line="248"/>
+        <w:ind w:left="300" w:hanging="300"/>
+        <w:jc w:val="both"/>
+      </w:pPr>
+      <w:r>
+        <w:rPr>
+          <w:b/>
+          <w:bCs/>
+          <w:color w:val="8A1C1C"/>
+        </w:rPr>
+        <w:t xml:space="preserve">2  </w:t>
+      </w:r>
+      <w:r>
+        <w:t xml:space="preserve">Une famille de réfugiés campe dans une coursive, surveillée de loin par la garnison.</w:t>
+      </w:r>
+    </w:p>
+    <w:p>
+      <w:pPr>
+        <w:spacing w:after="20" w:line="248"/>
+        <w:ind w:left="300" w:hanging="300"/>
+        <w:jc w:val="both"/>
+      </w:pPr>
+      <w:r>
+        <w:rPr>
+          <w:b/>
+          <w:bCs/>
+          <w:color w:val="8A1C1C"/>
+        </w:rPr>
+        <w:t xml:space="preserve">3  </w:t>
+      </w:r>
+      <w:r>
+        <w:t xml:space="preserve">Un joueur ruiné supplie Chessa Vorn pour un délai ; ça finit mal.</w:t>
+      </w:r>
+    </w:p>
+    <w:p>
+      <w:pPr>
+        <w:spacing w:after="20" w:line="248"/>
+        <w:ind w:left="300" w:hanging="300"/>
+        <w:jc w:val="both"/>
+      </w:pPr>
+      <w:r>
+        <w:rPr>
+          <w:b/>
+          <w:bCs/>
+          <w:color w:val="8A1C1C"/>
+        </w:rPr>
+        <w:t xml:space="preserve">4  </w:t>
+      </w:r>
+      <w:r>
+        <w:t xml:space="preserve">Un docker brade en douce sa ration ou ses médocs pour éponger une dette.</w:t>
+      </w:r>
+    </w:p>
+    <w:p>
+      <w:pPr>
+        <w:spacing w:after="20" w:line="248"/>
+        <w:ind w:left="300" w:hanging="300"/>
+        <w:jc w:val="both"/>
+      </w:pPr>
+      <w:r>
+        <w:rPr>
+          <w:b/>
+          <w:bCs/>
+          <w:color w:val="8A1C1C"/>
+        </w:rPr>
+        <w:t xml:space="preserve">5  </w:t>
+      </w:r>
+      <w:r>
+        <w:t xml:space="preserve">Une bagarre éclate autour d'une dose de spice ; personne n'intervient.</w:t>
+      </w:r>
+    </w:p>
+    <w:p>
+      <w:pPr>
+        <w:spacing w:after="20" w:line="248"/>
+        <w:ind w:left="300" w:hanging="300"/>
+        <w:jc w:val="both"/>
+      </w:pPr>
+      <w:r>
+        <w:rPr>
+          <w:b/>
+          <w:bCs/>
+          <w:color w:val="8A1C1C"/>
+        </w:rPr>
+        <w:t xml:space="preserve">6  </w:t>
+      </w:r>
+      <w:r>
+        <w:t xml:space="preserve">Un ancien de la station, sans le sou, connaît tous les recoins — et </w:t>
+      </w:r>
+      <w:r>
+        <w:rPr>
+          <w:b/>
+          <w:bCs/>
+        </w:rPr>
+        <w:t xml:space="preserve">se souvient de Tana</w:t>
+      </w:r>
+      <w:r>
+        <w:t xml:space="preserve">.</w:t>
+      </w:r>
+    </w:p>
+    <w:p>
+      <w:pPr>
+        <w:keepNext/>
+        <w:spacing w:before="90" w:after="40"/>
+      </w:pPr>
+      <w:r>
+        <w:rPr>
+          <w:b/>
+          <w:bCs/>
+          <w:color w:val="3A5A7A"/>
+          <w:sz w:val="19"/>
+          <w:szCs w:val="19"/>
+        </w:rPr>
+        <w:t xml:space="preserve">4 · Foule &amp; distractions</w:t>
+      </w:r>
+    </w:p>
+    <w:p>
+      <w:pPr>
+        <w:spacing w:after="20" w:line="248"/>
+        <w:ind w:left="300" w:hanging="300"/>
+        <w:jc w:val="both"/>
+      </w:pPr>
+      <w:r>
+        <w:rPr>
+          <w:b/>
+          <w:bCs/>
+          <w:color w:val="8A1C1C"/>
+        </w:rPr>
+        <w:t xml:space="preserve">1  </w:t>
+      </w:r>
+      <w:r>
+        <w:t xml:space="preserve">Un musicien joue pour quelques crédits ; sa sébile fait un bon point de rendez-vous discret.</w:t>
+      </w:r>
+    </w:p>
+    <w:p>
+      <w:pPr>
+        <w:spacing w:after="20" w:line="248"/>
+        <w:ind w:left="300" w:hanging="300"/>
+        <w:jc w:val="both"/>
+      </w:pPr>
+      <w:r>
+        <w:rPr>
+          <w:b/>
+          <w:bCs/>
+          <w:color w:val="8A1C1C"/>
+        </w:rPr>
+        <w:t xml:space="preserve">2  </w:t>
+      </w:r>
+      <w:r>
+        <w:t xml:space="preserve">Un bonneteau attire un cercle de badauds — arnaque garantie.</w:t>
+      </w:r>
+    </w:p>
+    <w:p>
+      <w:pPr>
+        <w:spacing w:after="20" w:line="248"/>
+        <w:ind w:left="300" w:hanging="300"/>
+        <w:jc w:val="both"/>
+      </w:pPr>
+      <w:r>
+        <w:rPr>
+          <w:b/>
+          <w:bCs/>
+          <w:color w:val="8A1C1C"/>
+        </w:rPr>
+        <w:t xml:space="preserve">3  </w:t>
+      </w:r>
+      <w:r>
+        <w:t xml:space="preserve">Un montreur de créature exotique fait son numéro ; l'animal s'échappe à moitié.</w:t>
+      </w:r>
+    </w:p>
+    <w:p>
+      <w:pPr>
+        <w:spacing w:after="20" w:line="248"/>
+        <w:ind w:left="300" w:hanging="300"/>
+        <w:jc w:val="both"/>
+      </w:pPr>
+      <w:r>
+        <w:rPr>
+          <w:b/>
+          <w:bCs/>
+          <w:color w:val="8A1C1C"/>
+        </w:rPr>
+        <w:t xml:space="preserve">4  </w:t>
+      </w:r>
+      <w:r>
+        <w:t xml:space="preserve">Deux équipages de passage se toisent au comptoir ; la tension monte.</w:t>
+      </w:r>
+    </w:p>
+    <w:p>
+      <w:pPr>
+        <w:spacing w:after="20" w:line="248"/>
+        <w:ind w:left="300" w:hanging="300"/>
+        <w:jc w:val="both"/>
+      </w:pPr>
+      <w:r>
+        <w:rPr>
+          <w:b/>
+          <w:bCs/>
+          <w:color w:val="8A1C1C"/>
+        </w:rPr>
+        <w:t xml:space="preserve">5  </w:t>
+      </w:r>
+      <w:r>
+        <w:t xml:space="preserve">Un attroupement se forme devant un écran crachant de la propagande impériale.</w:t>
+      </w:r>
+    </w:p>
+    <w:p>
+      <w:pPr>
+        <w:spacing w:after="20" w:line="248"/>
+        <w:ind w:left="300" w:hanging="300"/>
+        <w:jc w:val="both"/>
+      </w:pPr>
+      <w:r>
+        <w:rPr>
+          <w:b/>
+          <w:bCs/>
+          <w:color w:val="8A1C1C"/>
+        </w:rPr>
+        <w:t xml:space="preserve">6  </w:t>
+      </w:r>
+      <w:r>
+        <w:t xml:space="preserve">Une fête improvisée (fin de contrat d'un équipage) déborde dans la coursive.</w:t>
+      </w:r>
+    </w:p>
+    <w:p>
+      <w:pPr>
+        <w:keepNext/>
+        <w:spacing w:before="90" w:after="40"/>
+      </w:pPr>
+      <w:r>
+        <w:rPr>
+          <w:b/>
+          <w:bCs/>
+          <w:color w:val="3A5A7A"/>
+          <w:sz w:val="19"/>
+          <w:szCs w:val="19"/>
+        </w:rPr>
+        <w:t xml:space="preserve">5 · Frictions</w:t>
+      </w:r>
+    </w:p>
+    <w:p>
+      <w:pPr>
+        <w:spacing w:after="20" w:line="248"/>
+        <w:ind w:left="300" w:hanging="300"/>
+        <w:jc w:val="both"/>
+      </w:pPr>
+      <w:r>
+        <w:rPr>
+          <w:b/>
+          <w:bCs/>
+          <w:color w:val="8A1C1C"/>
+        </w:rPr>
+        <w:t xml:space="preserve">1  </w:t>
+      </w:r>
+      <w:r>
+        <w:t xml:space="preserve">Bousculade : un PJ renverse l'étal d'un vendeur, qui exige réparation.</w:t>
+      </w:r>
+    </w:p>
+    <w:p>
+      <w:pPr>
+        <w:spacing w:after="20" w:line="248"/>
+        <w:ind w:left="300" w:hanging="300"/>
+        <w:jc w:val="both"/>
+      </w:pPr>
+      <w:r>
+        <w:rPr>
+          <w:b/>
+          <w:bCs/>
+          <w:color w:val="8A1C1C"/>
+        </w:rPr>
+        <w:t xml:space="preserve">2  </w:t>
+      </w:r>
+      <w:r>
+        <w:t xml:space="preserve">Un ivrogne prend un PJ pour un autre et cherche des noises.</w:t>
+      </w:r>
+    </w:p>
+    <w:p>
+      <w:pPr>
+        <w:spacing w:after="20" w:line="248"/>
+        <w:ind w:left="300" w:hanging="300"/>
+        <w:jc w:val="both"/>
+      </w:pPr>
+      <w:r>
+        <w:rPr>
+          <w:b/>
+          <w:bCs/>
+          <w:color w:val="8A1C1C"/>
+        </w:rPr>
+        <w:t xml:space="preserve">3  </w:t>
+      </w:r>
+      <w:r>
+        <w:t xml:space="preserve">Un garde procède à un contrôle « informel » en espérant un pot-de-vin.</w:t>
+      </w:r>
+    </w:p>
+    <w:p>
+      <w:pPr>
+        <w:spacing w:after="20" w:line="248"/>
+        <w:ind w:left="300" w:hanging="300"/>
+        <w:jc w:val="both"/>
+      </w:pPr>
+      <w:r>
+        <w:rPr>
+          <w:b/>
+          <w:bCs/>
+          <w:color w:val="8A1C1C"/>
+        </w:rPr>
+        <w:t xml:space="preserve">4  </w:t>
+      </w:r>
+      <w:r>
+        <w:t xml:space="preserve">Deux PNJ se disputent bruyamment et implorent un PJ de « dire qui a raison ».</w:t>
+      </w:r>
+    </w:p>
+    <w:p>
+      <w:pPr>
+        <w:spacing w:after="20" w:line="248"/>
+        <w:ind w:left="300" w:hanging="300"/>
+        <w:jc w:val="both"/>
+      </w:pPr>
+      <w:r>
+        <w:rPr>
+          <w:b/>
+          <w:bCs/>
+          <w:color w:val="8A1C1C"/>
+        </w:rPr>
+        <w:t xml:space="preserve">5  </w:t>
+      </w:r>
+      <w:r>
+        <w:t xml:space="preserve">Un droïde de service défectueux harcèle les passants avec une réclame en boucle.</w:t>
+      </w:r>
+    </w:p>
+    <w:p>
+      <w:pPr>
+        <w:spacing w:after="20" w:line="248"/>
+        <w:ind w:left="300" w:hanging="300"/>
+        <w:jc w:val="both"/>
+      </w:pPr>
+      <w:r>
+        <w:rPr>
+          <w:b/>
+          <w:bCs/>
+          <w:color w:val="8A1C1C"/>
+        </w:rPr>
+        <w:t xml:space="preserve">6  </w:t>
+      </w:r>
+      <w:r>
+        <w:t xml:space="preserve">Quelqu'un a pris la place d'amarrage, la table ou la file — négociation ou esclandre.</w:t>
+      </w:r>
+    </w:p>
+    <w:p>
+      <w:pPr>
+        <w:keepNext/>
+        <w:spacing w:before="90" w:after="40"/>
+      </w:pPr>
+      <w:r>
+        <w:rPr>
+          <w:b/>
+          <w:bCs/>
+          <w:color w:val="3A5A7A"/>
+          <w:sz w:val="19"/>
+          <w:szCs w:val="19"/>
+        </w:rPr>
+        <w:t xml:space="preserve">6 · Couleur locale</w:t>
+      </w:r>
+    </w:p>
+    <w:p>
+      <w:pPr>
+        <w:spacing w:after="20" w:line="248"/>
+        <w:ind w:left="300" w:hanging="300"/>
+        <w:jc w:val="both"/>
+      </w:pPr>
+      <w:r>
+        <w:rPr>
+          <w:b/>
+          <w:bCs/>
+          <w:color w:val="8A1C1C"/>
+        </w:rPr>
+        <w:t xml:space="preserve">1  </w:t>
+      </w:r>
+      <w:r>
+        <w:t xml:space="preserve">Une odeur de cuisine exotique attire vers un stand dont la tenancière entend tout.</w:t>
+      </w:r>
+    </w:p>
+    <w:p>
+      <w:pPr>
+        <w:spacing w:after="20" w:line="248"/>
+        <w:ind w:left="300" w:hanging="300"/>
+        <w:jc w:val="both"/>
+      </w:pPr>
+      <w:r>
+        <w:rPr>
+          <w:b/>
+          <w:bCs/>
+          <w:color w:val="8A1C1C"/>
+        </w:rPr>
+        <w:t xml:space="preserve">2  </w:t>
+      </w:r>
+      <w:r>
+        <w:t xml:space="preserve">Un colporteur de rumeurs vend ses « informations » (à moitié vraies) au détail.</w:t>
+      </w:r>
+    </w:p>
+    <w:p>
+      <w:pPr>
+        <w:spacing w:after="20" w:line="248"/>
+        <w:ind w:left="300" w:hanging="300"/>
+        <w:jc w:val="both"/>
+      </w:pPr>
+      <w:r>
+        <w:rPr>
+          <w:b/>
+          <w:bCs/>
+          <w:color w:val="8A1C1C"/>
+        </w:rPr>
+        <w:t xml:space="preserve">3  </w:t>
+      </w:r>
+      <w:r>
+        <w:t xml:space="preserve">Un gosse suit les PJ en quémandant, puis lâche une info étonnamment précise.</w:t>
+      </w:r>
+    </w:p>
+    <w:p>
+      <w:pPr>
+        <w:spacing w:after="20" w:line="248"/>
+        <w:ind w:left="300" w:hanging="300"/>
+        <w:jc w:val="both"/>
+      </w:pPr>
+      <w:r>
+        <w:rPr>
+          <w:b/>
+          <w:bCs/>
+          <w:color w:val="8A1C1C"/>
+        </w:rPr>
+        <w:t xml:space="preserve">4  </w:t>
+      </w:r>
+      <w:r>
+        <w:t xml:space="preserve">Un vieux droïde de protocole cabossé fait la manche en six langues.</w:t>
+      </w:r>
+    </w:p>
+    <w:p>
+      <w:pPr>
+        <w:spacing w:after="20" w:line="248"/>
+        <w:ind w:left="300" w:hanging="300"/>
+        <w:jc w:val="both"/>
+      </w:pPr>
+      <w:r>
+        <w:rPr>
+          <w:b/>
+          <w:bCs/>
+          <w:color w:val="8A1C1C"/>
+        </w:rPr>
+        <w:t xml:space="preserve">5  </w:t>
+      </w:r>
+      <w:r>
+        <w:t xml:space="preserve">Un graffiti frais — slogan rebelle ? tag de gang ? — que la garnison n'a pas encore effacé.</w:t>
+      </w:r>
+    </w:p>
+    <w:p>
+      <w:pPr>
+        <w:spacing w:after="20" w:line="248"/>
+        <w:ind w:left="300" w:hanging="300"/>
+        <w:jc w:val="both"/>
+      </w:pPr>
+      <w:r>
+        <w:rPr>
+          <w:b/>
+          <w:bCs/>
+          <w:color w:val="8A1C1C"/>
+        </w:rPr>
+        <w:t xml:space="preserve">6  </w:t>
+      </w:r>
+      <w:r>
+        <w:t xml:space="preserve">Un passant dévisage les PJ un peu trop longtemps, puis s'éclipse. </w:t>
+      </w:r>
+      <w:r>
+        <w:rPr>
+          <w:i/>
+          <w:iCs/>
+        </w:rPr>
+        <w:t xml:space="preserve">(Parano… ou filature ISB ?)</w:t>
+      </w:r>
+    </w:p>
+    <w:p>
+      <w:pPr>
+        <w:pStyle w:val="Heading2"/>
+      </w:pPr>
+      <w:r>
+        <w:t xml:space="preserve">C. Météo des rayonnements &amp; phénomènes gravitationnels (la Gueule)</w:t>
       </w:r>
     </w:p>
     <w:p>
@@ -9260,7 +10078,7 @@
           <w:sz w:val="19"/>
           <w:szCs w:val="19"/>
         </w:rPr>
-        <w:t xml:space="preserve">Incidents (1D)</w:t>
+        <w:t xml:space="preserve">Phénomènes (1D)</w:t>
       </w:r>
     </w:p>
     <w:p>
@@ -9506,7 +10324,7 @@
         <w:pStyle w:val="Heading2"/>
       </w:pPr>
       <w:r>
-        <w:t xml:space="preserve">C. Handout — Le message initial de Tana (le « message 0 »)</w:t>
+        <w:t xml:space="preserve">D. Handout — Le message initial de Tana (le « message 0 »)</w:t>
       </w:r>
     </w:p>
     <w:p>

</xml_diff>

<commit_message>
Pré-tirés expérimentés (~18D de compétences) + TODO report FDPJ
- Remonte les compétences des 6 pré-tirés au niveau « expérimenté »
  (~18D de compétences au lieu de 7) : spécialités 5D-8D, breadth élargie,
  cohérente avec chaque concept (slicer, pilote, infiltratrice, etc.).
- Note d'intro mise à jour (personnages expérimentés).
- Stats dérivées (Initiative, Ténacité/Vitalité, Pénalité de coordination)
  laissées à l'utilisateur.
- Ajoute TODO #10 : reporter les 6 pré-tirés sur la feuille FDPJ RV v.3.8.2.

Co-Authored-By: Claude Opus 4.8 <noreply@anthropic.com>
</commit_message>
<xml_diff>
--- a/star-wars/scenarios/birth-of-the-death-squadron/docs/scenario_signal_detresse_FUSION.docx
+++ b/star-wars/scenarios/birth-of-the-death-squadron/docs/scenario_signal_detresse_FUSION.docx
@@ -2208,7 +2208,21 @@
                 <w:i/>
                 <w:iCs/>
               </w:rPr>
-              <w:t xml:space="preserve"> du dossier). Six attributs : </w:t>
+              <w:t xml:space="preserve"> du dossier). </w:t>
+            </w:r>
+            <w:r>
+              <w:rPr>
+                <w:i/>
+                <w:iCs/>
+              </w:rPr>
+              <w:t xml:space="preserve">Personnages expérimentés (~18D de compétences).</w:t>
+            </w:r>
+            <w:r>
+              <w:rPr>
+                <w:i/>
+                <w:iCs/>
+              </w:rPr>
+              <w:t xml:space="preserve"> Six attributs : </w:t>
             </w:r>
             <w:r>
               <w:rPr>
@@ -2222,7 +2236,7 @@
                 <w:i/>
                 <w:iCs/>
               </w:rPr>
-              <w:t xml:space="preserve">. Les compétences non citées valent la valeur de leur attribut. Reportez </w:t>
+              <w:t xml:space="preserve"> ; les compétences non citées valent la valeur de leur attribut. Reportez </w:t>
             </w:r>
             <w:r>
               <w:rPr>
@@ -2250,7 +2264,7 @@
                 <w:i/>
                 <w:iCs/>
               </w:rPr>
-              <w:t xml:space="preserve"> sur la fiche selon les règles ; ajustez les dés à votre création de personnage.</w:t>
+              <w:t xml:space="preserve"> sur la fiche selon les règles.</w:t>
             </w:r>
           </w:p>
         </w:tc>
@@ -2304,7 +2318,7 @@
         <w:t xml:space="preserve">COORDINATION 2D+2</w:t>
       </w:r>
       <w:r>
-        <w:t xml:space="preserve"> — Blaster 3D+2, Esquive 3D</w:t>
+        <w:t xml:space="preserve"> — Blaster 3D+2, Esquive 3D+2</w:t>
       </w:r>
     </w:p>
     <w:p>
@@ -2320,7 +2334,7 @@
         <w:t xml:space="preserve">SAVOIR 3D</w:t>
       </w:r>
       <w:r>
-        <w:t xml:space="preserve"> — Administration 4D, Systèmes Planétaires 3D+2, Illégalité 3D+2</w:t>
+        <w:t xml:space="preserve"> — Administration 5D, Systèmes Planétaires 4D, Illégalité 4D</w:t>
       </w:r>
     </w:p>
     <w:p>
@@ -2336,7 +2350,7 @@
         <w:t xml:space="preserve">PERCEPTION 4D</w:t>
       </w:r>
       <w:r>
-        <w:t xml:space="preserve"> — Subterfuge 5D, Persuasion 5D, Commerce 4D+2, Empathie 4D+1</w:t>
+        <w:t xml:space="preserve"> — Subterfuge 6D, Persuasion 6D, Commerce 5D, Empathie 4D+2</w:t>
       </w:r>
     </w:p>
     <w:p>
@@ -2352,7 +2366,7 @@
         <w:t xml:space="preserve">MÉCANIQUE 3D</w:t>
       </w:r>
       <w:r>
-        <w:t xml:space="preserve"> — Communications 4D, Senseurs 3D+2</w:t>
+        <w:t xml:space="preserve"> — Communications 4D+2, Senseurs 4D</w:t>
       </w:r>
     </w:p>
     <w:p>
@@ -2368,7 +2382,7 @@
         <w:t xml:space="preserve">TECHNIQUE 3D</w:t>
       </w:r>
       <w:r>
-        <w:t xml:space="preserve"> — Sécurité 3D+2</w:t>
+        <w:t xml:space="preserve"> — Sécurité 4D</w:t>
       </w:r>
     </w:p>
     <w:p>
@@ -2384,7 +2398,7 @@
         <w:t xml:space="preserve">VIGUEUR 2D</w:t>
       </w:r>
       <w:r>
-        <w:t xml:space="preserve"> — Autorité 4D</w:t>
+        <w:t xml:space="preserve"> — Autorité 5D</w:t>
       </w:r>
     </w:p>
     <w:p>
@@ -2483,7 +2497,7 @@
         <w:t xml:space="preserve">COORDINATION 2D</w:t>
       </w:r>
       <w:r>
-        <w:t xml:space="preserve"> — Esquive 2D+2, Habileté manuelle 3D</w:t>
+        <w:t xml:space="preserve"> — Esquive 3D, Habileté manuelle 4D</w:t>
       </w:r>
     </w:p>
     <w:p>
@@ -2499,7 +2513,7 @@
         <w:t xml:space="preserve">SAVOIR 3D</w:t>
       </w:r>
       <w:r>
-        <w:t xml:space="preserve"> — Illégalité 3D+2, Erudition 4D</w:t>
+        <w:t xml:space="preserve"> — Illégalité 5D, Erudition 5D</w:t>
       </w:r>
     </w:p>
     <w:p>
@@ -2515,7 +2529,7 @@
         <w:t xml:space="preserve">PERCEPTION 3D</w:t>
       </w:r>
       <w:r>
-        <w:t xml:space="preserve"> — Recherche 3D+2, Furtivité 3D+1</w:t>
+        <w:t xml:space="preserve"> — Recherche 5D, Furtivité 4D+1</w:t>
       </w:r>
     </w:p>
     <w:p>
@@ -2531,7 +2545,7 @@
         <w:t xml:space="preserve">MÉCANIQUE 3D</w:t>
       </w:r>
       <w:r>
-        <w:t xml:space="preserve"> — Communications 3D+2, Senseurs 3D+1</w:t>
+        <w:t xml:space="preserve"> — Communications 4D+2, Senseurs 4D</w:t>
       </w:r>
     </w:p>
     <w:p>
@@ -2547,7 +2561,7 @@
         <w:t xml:space="preserve">TECHNIQUE 5D</w:t>
       </w:r>
       <w:r>
-        <w:t xml:space="preserve"> — Prog. et Rép. ordinat. 6D, Sécurité 5D+2, Prog. et Rép. Droïds 5D+1</w:t>
+        <w:t xml:space="preserve"> — Prog. et Rép. ordinat. 8D, Sécurité 7D, Prog. et Rép. Droïds 6D</w:t>
       </w:r>
     </w:p>
     <w:p>
@@ -2561,6 +2575,9 @@
           <w:bCs/>
         </w:rPr>
         <w:t xml:space="preserve">VIGUEUR 2D</w:t>
+      </w:r>
+      <w:r>
+        <w:t xml:space="preserve"> — Résistance 3D</w:t>
       </w:r>
     </w:p>
     <w:p>
@@ -2659,7 +2676,7 @@
         <w:t xml:space="preserve">COORDINATION 4D</w:t>
       </w:r>
       <w:r>
-        <w:t xml:space="preserve"> — Blaster 4D+1, Esquive 4D+2, Habileté manuelle 4D+1, Agilité 4D</w:t>
+        <w:t xml:space="preserve"> — Blaster 5D, Esquive 6D, Habileté manuelle 5D, Agilité 5D</w:t>
       </w:r>
     </w:p>
     <w:p>
@@ -2675,7 +2692,7 @@
         <w:t xml:space="preserve">SAVOIR 2D</w:t>
       </w:r>
       <w:r>
-        <w:t xml:space="preserve"> — Langages 2D+2, Illégalité 2D+2</w:t>
+        <w:t xml:space="preserve"> — Langages 3D, Illégalité 4D</w:t>
       </w:r>
     </w:p>
     <w:p>
@@ -2691,7 +2708,7 @@
         <w:t xml:space="preserve">PERCEPTION 4D</w:t>
       </w:r>
       <w:r>
-        <w:t xml:space="preserve"> — Furtivité 5D+1, Recherche 4D+2, Subterfuge 4D</w:t>
+        <w:t xml:space="preserve"> — Furtivité 7D, Recherche 5D+2, Subterfuge 5D</w:t>
       </w:r>
     </w:p>
     <w:p>
@@ -2706,6 +2723,9 @@
         </w:rPr>
         <w:t xml:space="preserve">MÉCANIQUE 2D</w:t>
       </w:r>
+      <w:r>
+        <w:t xml:space="preserve"> — Senseurs 3D</w:t>
+      </w:r>
     </w:p>
     <w:p>
       <w:pPr>
@@ -2720,7 +2740,7 @@
         <w:t xml:space="preserve">TECHNIQUE 3D</w:t>
       </w:r>
       <w:r>
-        <w:t xml:space="preserve"> — Sécurité 3D+2</w:t>
+        <w:t xml:space="preserve"> — Sécurité 5D</w:t>
       </w:r>
     </w:p>
     <w:p>
@@ -2736,7 +2756,7 @@
         <w:t xml:space="preserve">VIGUEUR 3D</w:t>
       </w:r>
       <w:r>
-        <w:t xml:space="preserve"> — Mouvement 3D+2, Arme de mêlée 3D+2</w:t>
+        <w:t xml:space="preserve"> — Mouvement 5D, Arme de mêlée 4D+2</w:t>
       </w:r>
     </w:p>
     <w:p>
@@ -2848,7 +2868,7 @@
         <w:t xml:space="preserve">COORDINATION 3D</w:t>
       </w:r>
       <w:r>
-        <w:t xml:space="preserve"> — Blaster 4D, Esquive 3D+2</w:t>
+        <w:t xml:space="preserve"> — Blaster 5D, Esquive 4D+2</w:t>
       </w:r>
     </w:p>
     <w:p>
@@ -2864,7 +2884,7 @@
         <w:t xml:space="preserve">SAVOIR 2D</w:t>
       </w:r>
       <w:r>
-        <w:t xml:space="preserve"> — Systèmes Planétaires 2D+2, Illégalité 3D</w:t>
+        <w:t xml:space="preserve"> — Systèmes Planétaires 4D, Illégalité 4D</w:t>
       </w:r>
     </w:p>
     <w:p>
@@ -2880,7 +2900,7 @@
         <w:t xml:space="preserve">PERCEPTION 3D</w:t>
       </w:r>
       <w:r>
-        <w:t xml:space="preserve"> — Subterfuge 3D+2, Commerce 3D+1</w:t>
+        <w:t xml:space="preserve"> — Subterfuge 4D+2, Commerce 4D</w:t>
       </w:r>
     </w:p>
     <w:p>
@@ -2896,7 +2916,7 @@
         <w:t xml:space="preserve">MÉCANIQUE 4D</w:t>
       </w:r>
       <w:r>
-        <w:t xml:space="preserve"> — Piloter vaisseaux 5D, Armes vaisseaux 4D+2, Astrogation 4D+1, Senseurs 4D, Propulseurs indiv 4D</w:t>
+        <w:t xml:space="preserve"> — Piloter vaisseaux 7D, Armes vaisseaux 6D, Astrogation 5D+2, Senseurs 5D, Propulseurs indiv 5D</w:t>
       </w:r>
     </w:p>
     <w:p>
@@ -2912,7 +2932,7 @@
         <w:t xml:space="preserve">TECHNIQUE 3D</w:t>
       </w:r>
       <w:r>
-        <w:t xml:space="preserve"> — Réparation Transports 4D</w:t>
+        <w:t xml:space="preserve"> — Réparation Transports 5D</w:t>
       </w:r>
     </w:p>
     <w:p>
@@ -2926,6 +2946,9 @@
           <w:bCs/>
         </w:rPr>
         <w:t xml:space="preserve">VIGUEUR 2D+2</w:t>
+      </w:r>
+      <w:r>
+        <w:t xml:space="preserve"> — Résistance 3D+2</w:t>
       </w:r>
     </w:p>
     <w:p>
@@ -3038,7 +3061,7 @@
         <w:t xml:space="preserve">COORDINATION 4D</w:t>
       </w:r>
       <w:r>
-        <w:t xml:space="preserve"> — Blaster 5D, Lance-projectiles 4D+2, Esquive 4D+1</w:t>
+        <w:t xml:space="preserve"> — Blaster 6D, Lance-projectiles 5D, Esquive 5D</w:t>
       </w:r>
     </w:p>
     <w:p>
@@ -3054,7 +3077,7 @@
         <w:t xml:space="preserve">SAVOIR 3D</w:t>
       </w:r>
       <w:r>
-        <w:t xml:space="preserve"> — Administration 3D+2, Tactique 3D+2</w:t>
+        <w:t xml:space="preserve"> — Administration 5D, Tactique 5D</w:t>
       </w:r>
     </w:p>
     <w:p>
@@ -3070,7 +3093,7 @@
         <w:t xml:space="preserve">PERCEPTION 3D</w:t>
       </w:r>
       <w:r>
-        <w:t xml:space="preserve"> — Subterfuge 3D+1</w:t>
+        <w:t xml:space="preserve"> — Subterfuge 4D</w:t>
       </w:r>
     </w:p>
     <w:p>
@@ -3085,6 +3108,9 @@
         </w:rPr>
         <w:t xml:space="preserve">MÉCANIQUE 2D</w:t>
       </w:r>
+      <w:r>
+        <w:t xml:space="preserve"> — Conduire véhicules 3D+2</w:t>
+      </w:r>
     </w:p>
     <w:p>
       <w:pPr>
@@ -3099,7 +3125,7 @@
         <w:t xml:space="preserve">TECHNIQUE 3D</w:t>
       </w:r>
       <w:r>
-        <w:t xml:space="preserve"> — Sécurité 4D, Armures et Exos. 3D+2, Médecine 3D+2</w:t>
+        <w:t xml:space="preserve"> — Sécurité 5D, Armures et Exos. 5D, Médecine 4D</w:t>
       </w:r>
     </w:p>
     <w:p>
@@ -3115,7 +3141,7 @@
         <w:t xml:space="preserve">VIGUEUR 3D</w:t>
       </w:r>
       <w:r>
-        <w:t xml:space="preserve"> — Autorité 4D, Arme de mêlée 4D, Résistance 4D, Arts martiaux 3D+2</w:t>
+        <w:t xml:space="preserve"> — Autorité 5D, Arme de mêlée 5D, Résistance 5D+2, Arts martiaux 4D+2</w:t>
       </w:r>
     </w:p>
     <w:p>
@@ -3214,7 +3240,7 @@
         <w:t xml:space="preserve">COORDINATION 2D</w:t>
       </w:r>
       <w:r>
-        <w:t xml:space="preserve"> — Esquive 2D+2</w:t>
+        <w:t xml:space="preserve"> — Esquive 3D</w:t>
       </w:r>
     </w:p>
     <w:p>
@@ -3230,7 +3256,7 @@
         <w:t xml:space="preserve">SAVOIR 4D</w:t>
       </w:r>
       <w:r>
-        <w:t xml:space="preserve"> — Erudition 5D, Xénologie 4D+2, Langages 4D+2, Systèmes Planétaires 4D</w:t>
+        <w:t xml:space="preserve"> — Erudition 6D, Xénologie 6D, Langages 5D+2, Systèmes Planétaires 4D+2</w:t>
       </w:r>
     </w:p>
     <w:p>
@@ -3246,7 +3272,7 @@
         <w:t xml:space="preserve">PERCEPTION 3D</w:t>
       </w:r>
       <w:r>
-        <w:t xml:space="preserve"> — Empathie 4D, Persuasion 3D+2</w:t>
+        <w:t xml:space="preserve"> — Empathie 5D, Persuasion 4D+2, Recherche 4D</w:t>
       </w:r>
     </w:p>
     <w:p>
@@ -3275,7 +3301,7 @@
         <w:t xml:space="preserve">TECHNIQUE 4D</w:t>
       </w:r>
       <w:r>
-        <w:t xml:space="preserve"> — Médecine 5D, Réparation Équipement 4D</w:t>
+        <w:t xml:space="preserve"> — Médecine 7D, Réparation Équipement 4D+2</w:t>
       </w:r>
     </w:p>
     <w:p>
@@ -3291,7 +3317,7 @@
         <w:t xml:space="preserve">VIGUEUR 3D</w:t>
       </w:r>
       <w:r>
-        <w:t xml:space="preserve"> — Volonté 3D+2</w:t>
+        <w:t xml:space="preserve"> — Volonté 5D</w:t>
       </w:r>
     </w:p>
     <w:p>

</xml_diff>

<commit_message>
TODO #5 — Climax réécrit (casse → trace → face-à-face → fuite)
Section 5 « Le climax et les issues » (design durci en séance de grilling) :
- Goulot 1, le casse : point d'accès réseau (tunnel de maintenance /
  convaincre Kavarel / effraction) + Bafouille ; fenêtre ~ session.
- La trace inévitable : le segment de Kallan est déjà sous surveillance ISB
  (déloyauté avérée, doc i) -> toute extraction brûle -> Rennard + corvette.
- Goulot 2, face-à-face au quai (rue de western) : posture de Rennard mappée
  sur l'horloge de traque ; « parler = son arme » (retardateur pour la corvette).
- Chrono corvette : 10 rounds (+5 météo, +5 si rapides) ; fuite = jets
  Piloter/Réparation en vol.
- 4 axes de fin modulaires + 2 encarts MJ (soupapes de sacrifice, gradient de
  fins ; ton space opera, toujours un fil d'espoir). Rennard jetable (one-shot).
- 4.6 (DMZ) réaligné sur ces voies + renvoi vers §5.

Co-Authored-By: Claude Opus 4.8 <noreply@anthropic.com>
</commit_message>
<xml_diff>
--- a/star-wars/scenarios/birth-of-the-death-squadron/docs/scenario_signal_detresse_FUSION.docx
+++ b/star-wars/scenarios/birth-of-the-death-squadron/docs/scenario_signal_detresse_FUSION.docx
@@ -6318,27 +6318,54 @@
         <w:t xml:space="preserve">Accès</w:t>
       </w:r>
       <w:r>
-        <w:t xml:space="preserve"> — deux voies : la </w:t>
-      </w:r>
-      <w:r>
-        <w:rPr>
-          <w:b/>
-          <w:bCs/>
-        </w:rPr>
-        <w:t xml:space="preserve">colonne de sécurité</w:t>
-      </w:r>
-      <w:r>
-        <w:t xml:space="preserve"> blindée depuis N4/N3 (rapide mais surveillée), ou, plus discret socialement mais risqué, le </w:t>
-      </w:r>
-      <w:r>
-        <w:rPr>
-          <w:b/>
-          <w:bCs/>
-        </w:rPr>
-        <w:t xml:space="preserve">terminal de la salle de contrôle des transmissions</w:t>
-      </w:r>
-      <w:r>
-        <w:t xml:space="preserve"> (N4) sous l'œil d'Aashe. Présence probable de Kavarel / Bissik ou de la garnison à proximité.</w:t>
+        <w:t xml:space="preserve"> — inutile de forcer la DMZ elle-même : il suffit d'un </w:t>
+      </w:r>
+      <w:r>
+        <w:rPr>
+          <w:b/>
+          <w:bCs/>
+        </w:rPr>
+        <w:t xml:space="preserve">point d'accès réseau</w:t>
+      </w:r>
+      <w:r>
+        <w:t xml:space="preserve"> pour tirer la donnée du serveur isolé. Le plus élégant est dans le </w:t>
+      </w:r>
+      <w:r>
+        <w:rPr>
+          <w:b/>
+          <w:bCs/>
+        </w:rPr>
+        <w:t xml:space="preserve">tunnel de maintenance</w:t>
+      </w:r>
+      <w:r>
+        <w:t xml:space="preserve"> (là où se trouve la fresque, indice b) ; sinon </w:t>
+      </w:r>
+      <w:r>
+        <w:rPr>
+          <w:b/>
+          <w:bCs/>
+        </w:rPr>
+        <w:t xml:space="preserve">convaincre Kavarel</w:t>
+      </w:r>
+      <w:r>
+        <w:t xml:space="preserve">, ou une </w:t>
+      </w:r>
+      <w:r>
+        <w:rPr>
+          <w:b/>
+          <w:bCs/>
+        </w:rPr>
+        <w:t xml:space="preserve">effraction</w:t>
+      </w:r>
+      <w:r>
+        <w:t xml:space="preserve"> (badge + code, éviter les caméras). </w:t>
+      </w:r>
+      <w:r>
+        <w:rPr>
+          <w:i/>
+          <w:iCs/>
+        </w:rPr>
+        <w:t xml:space="preserve">Mécanique du casse et de la trace inévitable : voir §5.</w:t>
       </w:r>
     </w:p>
     <w:p>
@@ -7710,7 +7737,66 @@
         <w:pStyle w:val="Heading1"/>
       </w:pPr>
       <w:r>
-        <w:t xml:space="preserve">5. Issues possibles et ouverture</w:t>
+        <w:t xml:space="preserve">5. Le climax et les issues</w:t>
+      </w:r>
+    </w:p>
+    <w:p>
+      <w:pPr>
+        <w:spacing w:after="120" w:line="264"/>
+        <w:jc w:val="both"/>
+      </w:pPr>
+      <w:r>
+        <w:t xml:space="preserve">Le scénario culmine en </w:t>
+      </w:r>
+      <w:r>
+        <w:rPr>
+          <w:b/>
+          <w:bCs/>
+        </w:rPr>
+        <w:t xml:space="preserve">deux goulots</w:t>
+      </w:r>
+      <w:r>
+        <w:t xml:space="preserve"> enchaînés : </w:t>
+      </w:r>
+      <w:r>
+        <w:rPr>
+          <w:b/>
+          <w:bCs/>
+        </w:rPr>
+        <w:t xml:space="preserve">le casse</w:t>
+      </w:r>
+      <w:r>
+        <w:t xml:space="preserve"> (récupérer le journal), puis </w:t>
+      </w:r>
+      <w:r>
+        <w:rPr>
+          <w:b/>
+          <w:bCs/>
+        </w:rPr>
+        <w:t xml:space="preserve">l'extraction</w:t>
+      </w:r>
+      <w:r>
+        <w:t xml:space="preserve"> (fuir la station). Entre les deux, une </w:t>
+      </w:r>
+      <w:r>
+        <w:rPr>
+          <w:b/>
+          <w:bCs/>
+        </w:rPr>
+        <w:t xml:space="preserve">trace inévitable</w:t>
+      </w:r>
+      <w:r>
+        <w:t xml:space="preserve"> lâche l'ISB aux trousses des PJ. Le tout se joue </w:t>
+      </w:r>
+      <w:r>
+        <w:rPr>
+          <w:b/>
+          <w:bCs/>
+        </w:rPr>
+        <w:t xml:space="preserve">au chrono</w:t>
+      </w:r>
+      <w:r>
+        <w:t xml:space="preserve">.</w:t>
       </w:r>
     </w:p>
     <w:p>
@@ -7718,7 +7804,7 @@
         <w:pStyle w:val="Heading2"/>
       </w:pPr>
       <w:r>
-        <w:t xml:space="preserve">Les dénouements</w:t>
+        <w:t xml:space="preserve">Goulot 1 — Le casse</w:t>
       </w:r>
     </w:p>
     <w:p>
@@ -7727,179 +7813,37 @@
         <w:jc w:val="both"/>
       </w:pPr>
       <w:r>
-        <w:t xml:space="preserve">Le scénario se joue sur deux tensions : </w:t>
-      </w:r>
-      <w:r>
-        <w:rPr>
-          <w:b/>
-          <w:bCs/>
-        </w:rPr>
-        <w:t xml:space="preserve">obtenir</w:t>
-      </w:r>
-      <w:r>
-        <w:t xml:space="preserve"> le contenu du journal, et </w:t>
-      </w:r>
-      <w:r>
-        <w:rPr>
-          <w:b/>
-          <w:bCs/>
-        </w:rPr>
-        <w:t xml:space="preserve">repartir</w:t>
-      </w:r>
-      <w:r>
-        <w:t xml:space="preserve"> avant que l'ISB ne verrouille la station. Les issues combinent ces deux axes.</w:t>
-      </w:r>
-    </w:p>
-    <w:p>
-      <w:pPr>
-        <w:spacing w:after="120" w:line="264"/>
-        <w:jc w:val="both"/>
-      </w:pPr>
-      <w:r>
-        <w:rPr>
-          <w:b/>
-          <w:bCs/>
-        </w:rPr>
-        <w:t xml:space="preserve">Réussite discrète (l'idéal).</w:t>
-      </w:r>
-      <w:r>
-        <w:t xml:space="preserve"> Les PJ gagnent la confiance de Tana, réunissent les quatre indices, laissent Bafouille déchiffrer, et </w:t>
-      </w:r>
-      <w:r>
-        <w:rPr>
-          <w:b/>
-          <w:bCs/>
-        </w:rPr>
-        <w:t xml:space="preserve">exfiltrent les coordonnées</w:t>
-      </w:r>
-      <w:r>
-        <w:t xml:space="preserve"> de la base dissidente </w:t>
-      </w:r>
-      <w:r>
-        <w:rPr>
-          <w:b/>
-          <w:bCs/>
-        </w:rPr>
-        <w:t xml:space="preserve">avant</w:t>
-      </w:r>
-      <w:r>
-        <w:t xml:space="preserve"> que Vint ne boucle sa triangulation. La station ignore tout ; l'ISB arrive trop tard. Les PJ tiennent l'avertissement qui peut sauver la base de la grille L-14.</w:t>
-      </w:r>
-    </w:p>
-    <w:p>
-      <w:pPr>
-        <w:spacing w:after="120" w:line="264"/>
-        <w:jc w:val="both"/>
-      </w:pPr>
-      <w:r>
-        <w:rPr>
-          <w:b/>
-          <w:bCs/>
-        </w:rPr>
-        <w:t xml:space="preserve">Réussite coûteuse.</w:t>
-      </w:r>
-      <w:r>
-        <w:t xml:space="preserve"> Les PJ obtiennent l'information mais </w:t>
-      </w:r>
-      <w:r>
-        <w:rPr>
-          <w:b/>
-          <w:bCs/>
-        </w:rPr>
-        <w:t xml:space="preserve">laissent une trace</w:t>
-      </w:r>
-      <w:r>
-        <w:t xml:space="preserve"> : un PNJ alarmé, une effraction repérée, une erreur devant Skarn. L'extraction se fait </w:t>
-      </w:r>
-      <w:r>
-        <w:rPr>
-          <w:b/>
-          <w:bCs/>
-        </w:rPr>
-        <w:t xml:space="preserve">sous tension</w:t>
-      </w:r>
-      <w:r>
-        <w:t xml:space="preserve"> (course-poursuite, fusillade au quai, black-out provoqué au N0 pour couvrir la fuite). Ils repartent avec le journal, mais </w:t>
-      </w:r>
-      <w:r>
-        <w:rPr>
-          <w:b/>
-          <w:bCs/>
-        </w:rPr>
-        <w:t xml:space="preserve">Rennard sait</w:t>
-      </w:r>
-      <w:r>
-        <w:t xml:space="preserve"> désormais où chercher — et retient leurs visages.</w:t>
-      </w:r>
-    </w:p>
-    <w:p>
-      <w:pPr>
-        <w:spacing w:after="120" w:line="264"/>
-        <w:jc w:val="both"/>
-      </w:pPr>
-      <w:r>
-        <w:rPr>
-          <w:b/>
-          <w:bCs/>
-        </w:rPr>
-        <w:t xml:space="preserve">Échec partiel.</w:t>
-      </w:r>
-      <w:r>
-        <w:t xml:space="preserve"> Le déchiffrement échoue ou traîne (indices manqués, Bafouille endommagé, Tana refuse de coopérer). Les PJ repartent les mains vides ou avec des fragments inexploitables ; la base dissidente reste sans avertissement.</w:t>
-      </w:r>
-    </w:p>
-    <w:p>
-      <w:pPr>
-        <w:spacing w:after="120" w:line="264"/>
-        <w:jc w:val="both"/>
-      </w:pPr>
-      <w:r>
-        <w:rPr>
-          <w:b/>
-          <w:bCs/>
-        </w:rPr>
-        <w:t xml:space="preserve">Capture.</w:t>
-      </w:r>
-      <w:r>
-        <w:t xml:space="preserve"> Un PJ ou </w:t>
-      </w:r>
-      <w:r>
-        <w:rPr>
-          <w:b/>
-          <w:bCs/>
-        </w:rPr>
-        <w:t xml:space="preserve">Tana</w:t>
-      </w:r>
-      <w:r>
-        <w:t xml:space="preserve"> tombe entre les mains de Rennard. Le journal est saisi ou détruit ; l'ISB remonte la filière. Si l'ordre </w:t>
-      </w:r>
-      <w:r>
-        <w:rPr>
-          <w:i/>
-          <w:iCs/>
-        </w:rPr>
-        <w:t xml:space="preserve">« exécution immédiate »</w:t>
-      </w:r>
-      <w:r>
-        <w:t xml:space="preserve"> du J199 est confirmé, la </w:t>
-      </w:r>
-      <w:r>
-        <w:rPr>
-          <w:b/>
-          <w:bCs/>
-        </w:rPr>
-        <w:t xml:space="preserve">base de la grille L-14 est frappée</w:t>
-      </w:r>
-      <w:r>
-        <w:t xml:space="preserve"> — conséquence lourde pour la suite.</w:t>
-      </w:r>
-    </w:p>
-    <w:p>
-      <w:pPr>
-        <w:pStyle w:val="Heading2"/>
-      </w:pPr>
-      <w:r>
-        <w:t xml:space="preserve">Le sort de Tana</w:t>
+        <w:t xml:space="preserve">Les données du journal (document d) sont sur le </w:t>
+      </w:r>
+      <w:r>
+        <w:rPr>
+          <w:b/>
+          <w:bCs/>
+        </w:rPr>
+        <w:t xml:space="preserve">serveur isolé</w:t>
+      </w:r>
+      <w:r>
+        <w:t xml:space="preserve"> de la DMZ (N0). Les PJ ont les compétences pour les tirer du réseau ; il leur faut surtout un </w:t>
+      </w:r>
+      <w:r>
+        <w:rPr>
+          <w:b/>
+          <w:bCs/>
+        </w:rPr>
+        <w:t xml:space="preserve">point d'accès</w:t>
+      </w:r>
+      <w:r>
+        <w:t xml:space="preserve"> où se brancher. </w:t>
+      </w:r>
+      <w:r>
+        <w:rPr>
+          <w:b/>
+          <w:bCs/>
+        </w:rPr>
+        <w:t xml:space="preserve">Trois voies</w:t>
+      </w:r>
+      <w:r>
+        <w:t xml:space="preserve">, de la plus propre à la plus risquée :</w:t>
       </w:r>
     </w:p>
     <w:p>
@@ -7917,10 +7861,20 @@
           <w:b/>
           <w:bCs/>
         </w:rPr>
-        <w:t xml:space="preserve">Elle part avec les PJ</w:t>
-      </w:r>
-      <w:r>
-        <w:t xml:space="preserve"> — nouvelle alliée récurrente, précieuse en cryptanalyse et connaissance de l'Empire.</w:t>
+        <w:t xml:space="preserve">Le tunnel de maintenance</w:t>
+      </w:r>
+      <w:r>
+        <w:t xml:space="preserve"> </w:t>
+      </w:r>
+      <w:r>
+        <w:rPr>
+          <w:i/>
+          <w:iCs/>
+        </w:rPr>
+        <w:t xml:space="preserve">(le plus élégant)</w:t>
+      </w:r>
+      <w:r>
+        <w:t xml:space="preserve"> — un point d'accès réseau s'y trouve, là même où ils ont décodé la fresque (indice b). Rappel de décor, aucune effraction.</w:t>
       </w:r>
     </w:p>
     <w:p>
@@ -7938,10 +7892,10 @@
           <w:b/>
           <w:bCs/>
         </w:rPr>
-        <w:t xml:space="preserve">Elle reste</w:t>
-      </w:r>
-      <w:r>
-        <w:t xml:space="preserve"> — pour continuer à écouter depuis Kessel-Tho, source dormante et point de contact futur (au prix d'un risque croissant).</w:t>
+        <w:t xml:space="preserve">Convaincre Dosh Kavarel</w:t>
+      </w:r>
+      <w:r>
+        <w:t xml:space="preserve"> — le technicien qui laisse Tana peindre ; voie sociale, discrète.</w:t>
       </w:r>
     </w:p>
     <w:p>
@@ -7959,10 +7913,69 @@
           <w:b/>
           <w:bCs/>
         </w:rPr>
-        <w:t xml:space="preserve">Elle se sacrifie</w:t>
-      </w:r>
-      <w:r>
-        <w:t xml:space="preserve"> — pour couvrir la fuite des PJ ou détruire le journal avant l'ISB : fin tragique et marquante, dette morale pour les personnages.</w:t>
+        <w:t xml:space="preserve">L'effraction</w:t>
+      </w:r>
+      <w:r>
+        <w:t xml:space="preserve"> — contourner un contrôle d'accès basique (badge + code) et éviter les caméras encore fonctionnelles.</w:t>
+      </w:r>
+    </w:p>
+    <w:p>
+      <w:pPr>
+        <w:spacing w:after="120" w:line="264"/>
+        <w:jc w:val="both"/>
+      </w:pPr>
+      <w:r>
+        <w:t xml:space="preserve">Une fois branchés, les PJ se planquent (n'importe quel cagibi) et </w:t>
+      </w:r>
+      <w:r>
+        <w:rPr>
+          <w:b/>
+          <w:bCs/>
+        </w:rPr>
+        <w:t xml:space="preserve">slicent</w:t>
+      </w:r>
+      <w:r>
+        <w:t xml:space="preserve">. </w:t>
+      </w:r>
+      <w:r>
+        <w:rPr>
+          <w:b/>
+          <w:bCs/>
+        </w:rPr>
+        <w:t xml:space="preserve">Bafouille</w:t>
+      </w:r>
+      <w:r>
+        <w:t xml:space="preserve"> assiste le déchiffrement (RépubliqueRetour + Argon2 + les phrases) — </w:t>
+      </w:r>
+      <w:r>
+        <w:rPr>
+          <w:i/>
+          <w:iCs/>
+        </w:rPr>
+        <w:t xml:space="preserve">sauf s'ils l'ont aliéné en médisant de Tana</w:t>
+      </w:r>
+      <w:r>
+        <w:t xml:space="preserve"> : ils ne sortent alors que la </w:t>
+      </w:r>
+      <w:r>
+        <w:rPr>
+          <w:b/>
+          <w:bCs/>
+        </w:rPr>
+        <w:t xml:space="preserve">donnée brute chiffrée</w:t>
+      </w:r>
+      <w:r>
+        <w:t xml:space="preserve">. La fenêtre du casse ≈ la </w:t>
+      </w:r>
+      <w:r>
+        <w:rPr>
+          <w:b/>
+          <w:bCs/>
+        </w:rPr>
+        <w:t xml:space="preserve">durée de la session</w:t>
+      </w:r>
+      <w:r>
+        <w:t xml:space="preserve"> (~2 h de jeu) : la vraie pression vient d'après.</w:t>
       </w:r>
     </w:p>
     <w:p>
@@ -7970,7 +7983,46 @@
         <w:pStyle w:val="Heading2"/>
       </w:pPr>
       <w:r>
-        <w:t xml:space="preserve">Ouverture vers le futur</w:t>
+        <w:t xml:space="preserve">La trace — pourquoi l'ISB débarque, quoi qu'il arrive</w:t>
+      </w:r>
+    </w:p>
+    <w:p>
+      <w:pPr>
+        <w:spacing w:after="120" w:line="264"/>
+        <w:jc w:val="both"/>
+      </w:pPr>
+      <w:r>
+        <w:t xml:space="preserve">Le serveur héberge le </w:t>
+      </w:r>
+      <w:r>
+        <w:rPr>
+          <w:b/>
+          <w:bCs/>
+        </w:rPr>
+        <w:t xml:space="preserve">journal de facturation illégale de Kallan</w:t>
+      </w:r>
+      <w:r>
+        <w:t xml:space="preserve">. Or l'ISB, en épluchant les échanges des responsables du secteur pour jauger les loyautés, a </w:t>
+      </w:r>
+      <w:r>
+        <w:rPr>
+          <w:b/>
+          <w:bCs/>
+        </w:rPr>
+        <w:t xml:space="preserve">déjà repéré Kallan comme suspect</w:t>
+      </w:r>
+      <w:r>
+        <w:t xml:space="preserve"> (fréquences revendues, pots-de-vin, doc i) et placé son segment sous </w:t>
+      </w:r>
+      <w:r>
+        <w:rPr>
+          <w:b/>
+          <w:bCs/>
+        </w:rPr>
+        <w:t xml:space="preserve">surveillance passive</w:t>
+      </w:r>
+      <w:r>
+        <w:t xml:space="preserve">.</w:t>
       </w:r>
     </w:p>
     <w:p>
@@ -7988,10 +8040,60 @@
           <w:b/>
           <w:bCs/>
         </w:rPr>
-        <w:t xml:space="preserve">L'avertissement.</w:t>
-      </w:r>
-      <w:r>
-        <w:t xml:space="preserve"> Les coordonnées L-14 lancent une course : prévenir la base dissidente avant la frappe — accroche directe pour la suite de campagne.</w:t>
+        <w:t xml:space="preserve">Conséquence :</w:t>
+      </w:r>
+      <w:r>
+        <w:t xml:space="preserve"> </w:t>
+      </w:r>
+      <w:r>
+        <w:rPr>
+          <w:i/>
+          <w:iCs/>
+        </w:rPr>
+        <w:t xml:space="preserve">toute</w:t>
+      </w:r>
+      <w:r>
+        <w:t xml:space="preserve"> extraction de cette donnée — quel que soit le compte, quelle que soit la porte — </w:t>
+      </w:r>
+      <w:r>
+        <w:rPr>
+          <w:b/>
+          <w:bCs/>
+        </w:rPr>
+        <w:t xml:space="preserve">fait tomber le drapeau</w:t>
+      </w:r>
+      <w:r>
+        <w:t xml:space="preserve">. Le casse ne rate pas : c'est </w:t>
+      </w:r>
+      <w:r>
+        <w:rPr>
+          <w:b/>
+          <w:bCs/>
+        </w:rPr>
+        <w:t xml:space="preserve">sa réussite même qui sonne l'alarme</w:t>
+      </w:r>
+      <w:r>
+        <w:t xml:space="preserve">. Utiliser le </w:t>
+      </w:r>
+      <w:r>
+        <w:rPr>
+          <w:b/>
+          <w:bCs/>
+        </w:rPr>
+        <w:t xml:space="preserve">compte de Tana</w:t>
+      </w:r>
+      <w:r>
+        <w:t xml:space="preserve"> (hors service) ou traîner ne fait qu'</w:t>
+      </w:r>
+      <w:r>
+        <w:rPr>
+          <w:b/>
+          <w:bCs/>
+        </w:rPr>
+        <w:t xml:space="preserve">accélérer</w:t>
+      </w:r>
+      <w:r>
+        <w:t xml:space="preserve"> la réaction.</w:t>
       </w:r>
     </w:p>
     <w:p>
@@ -8009,30 +8111,90 @@
           <w:b/>
           <w:bCs/>
         </w:rPr>
-        <w:t xml:space="preserve">La traque commence.</w:t>
-      </w:r>
-      <w:r>
-        <w:t xml:space="preserve"> Ce que les PJ ont entrevu, c'est la </w:t>
-      </w:r>
-      <w:r>
-        <w:rPr>
-          <w:b/>
-          <w:bCs/>
-        </w:rPr>
-        <w:t xml:space="preserve">naissance de l'Escadron de la Mort</w:t>
-      </w:r>
-      <w:r>
-        <w:t xml:space="preserve"> : l'</w:t>
-      </w:r>
-      <w:r>
-        <w:rPr>
-          <w:i/>
-          <w:iCs/>
-        </w:rPr>
-        <w:t xml:space="preserve">Executor</w:t>
-      </w:r>
-      <w:r>
-        <w:t xml:space="preserve"> et sa flotte entrent en scène. Le secteur n'est plus sûr.</w:t>
+        <w:t xml:space="preserve">Déclenchement :</w:t>
+      </w:r>
+      <w:r>
+        <w:t xml:space="preserve"> au moment où le drapeau tombe, </w:t>
+      </w:r>
+      <w:r>
+        <w:rPr>
+          <w:b/>
+          <w:bCs/>
+        </w:rPr>
+        <w:t xml:space="preserve">Rennard est alerté</w:t>
+      </w:r>
+      <w:r>
+        <w:t xml:space="preserve"> et </w:t>
+      </w:r>
+      <w:r>
+        <w:rPr>
+          <w:b/>
+          <w:bCs/>
+        </w:rPr>
+        <w:t xml:space="preserve">signale Kessel</w:t>
+      </w:r>
+      <w:r>
+        <w:t xml:space="preserve"> → une </w:t>
+      </w:r>
+      <w:r>
+        <w:rPr>
+          <w:b/>
+          <w:bCs/>
+        </w:rPr>
+        <w:t xml:space="preserve">corvette</w:t>
+      </w:r>
+      <w:r>
+        <w:t xml:space="preserve"> appareille. L'horloge d'extraction démarre.</w:t>
+      </w:r>
+    </w:p>
+    <w:p>
+      <w:pPr>
+        <w:pStyle w:val="Heading2"/>
+      </w:pPr>
+      <w:r>
+        <w:t xml:space="preserve">Goulot 2 — Le face-à-face au quai</w:t>
+      </w:r>
+    </w:p>
+    <w:p>
+      <w:pPr>
+        <w:spacing w:after="120" w:line="264"/>
+        <w:jc w:val="both"/>
+      </w:pPr>
+      <w:r>
+        <w:rPr>
+          <w:b/>
+          <w:bCs/>
+        </w:rPr>
+        <w:t xml:space="preserve">Décor :</w:t>
+      </w:r>
+      <w:r>
+        <w:t xml:space="preserve"> le quai principal en rue de western — vaisseaux, caisses de fret, devantures qui baissent leurs rideaux, le *</w:t>
+      </w:r>
+      <w:r>
+        <w:rPr>
+          <w:b/>
+          <w:bCs/>
+        </w:rPr>
+        <w:t xml:space="preserve">Murmure</w:t>
+      </w:r>
+      <w:r>
+        <w:t xml:space="preserve">* au bout de la « rue ».</w:t>
+      </w:r>
+    </w:p>
+    <w:p>
+      <w:pPr>
+        <w:spacing w:after="120" w:line="264"/>
+        <w:jc w:val="both"/>
+      </w:pPr>
+      <w:r>
+        <w:rPr>
+          <w:b/>
+          <w:bCs/>
+        </w:rPr>
+        <w:t xml:space="preserve">La posture de Rennard dépend de l'horloge de traque</w:t>
+      </w:r>
+      <w:r>
+        <w:t xml:space="preserve"> (les 6 crans, §Présentation) :</w:t>
       </w:r>
     </w:p>
     <w:p>
@@ -8050,20 +8212,1176 @@
           <w:b/>
           <w:bCs/>
         </w:rPr>
-        <w:t xml:space="preserve">Une némésis.</w:t>
-      </w:r>
-      <w:r>
-        <w:t xml:space="preserve"> Si Rennard a vu leurs visages, il devient un </w:t>
-      </w:r>
-      <w:r>
-        <w:rPr>
-          <w:b/>
-          <w:bCs/>
-        </w:rPr>
-        <w:t xml:space="preserve">antagoniste récurrent</w:t>
-      </w:r>
-      <w:r>
-        <w:t xml:space="preserve"> — patient, méthodique, sans colère et sans oubli.</w:t>
+        <w:t xml:space="preserve">Crans bas</w:t>
+      </w:r>
+      <w:r>
+        <w:t xml:space="preserve"> (PJ rapides, propres) : il est </w:t>
+      </w:r>
+      <w:r>
+        <w:rPr>
+          <w:b/>
+          <w:bCs/>
+        </w:rPr>
+        <w:t xml:space="preserve">pris de court</w:t>
+      </w:r>
+      <w:r>
+        <w:t xml:space="preserve">, seul ou presque. Contraint à l'</w:t>
+      </w:r>
+      <w:r>
+        <w:rPr>
+          <w:b/>
+          <w:bCs/>
+        </w:rPr>
+        <w:t xml:space="preserve">embuscade</w:t>
+      </w:r>
+      <w:r>
+        <w:t xml:space="preserve"> ; il ne parle que s'il se retrouve en désavantage — et seulement </w:t>
+      </w:r>
+      <w:r>
+        <w:rPr>
+          <w:b/>
+          <w:bCs/>
+        </w:rPr>
+        <w:t xml:space="preserve">pour gagner du temps et flouer les PJ</w:t>
+      </w:r>
+      <w:r>
+        <w:t xml:space="preserve">.</w:t>
+      </w:r>
+    </w:p>
+    <w:p>
+      <w:pPr>
+        <w:pStyle w:val="ListParagraph"/>
+        <w:numPr>
+          <w:ilvl w:val="0"/>
+          <w:numId w:val="2"/>
+        </w:numPr>
+        <w:spacing w:after="60" w:line="260"/>
+        <w:jc w:val="both"/>
+      </w:pPr>
+      <w:r>
+        <w:rPr>
+          <w:b/>
+          <w:bCs/>
+        </w:rPr>
+        <w:t xml:space="preserve">Crans hauts</w:t>
+      </w:r>
+      <w:r>
+        <w:t xml:space="preserve"> (PJ lents, repérés) : il a ses </w:t>
+      </w:r>
+      <w:r>
+        <w:rPr>
+          <w:b/>
+          <w:bCs/>
+        </w:rPr>
+        <w:t xml:space="preserve">renforts</w:t>
+      </w:r>
+      <w:r>
+        <w:t xml:space="preserve">, </w:t>
+      </w:r>
+      <w:r>
+        <w:rPr>
+          <w:b/>
+          <w:bCs/>
+        </w:rPr>
+        <w:t xml:space="preserve">bloque la sortie</w:t>
+      </w:r>
+      <w:r>
+        <w:t xml:space="preserve"> et </w:t>
+      </w:r>
+      <w:r>
+        <w:rPr>
+          <w:b/>
+          <w:bCs/>
+        </w:rPr>
+        <w:t xml:space="preserve">parle</w:t>
+      </w:r>
+      <w:r>
+        <w:t xml:space="preserve"> d'emblée (« Je sais ce que vous emportez. Posez-le. »).</w:t>
+      </w:r>
+    </w:p>
+    <w:p>
+      <w:pPr>
+        <w:spacing w:after="120" w:line="264"/>
+        <w:jc w:val="both"/>
+      </w:pPr>
+      <w:r>
+        <w:rPr>
+          <w:b/>
+          <w:bCs/>
+        </w:rPr>
+        <w:t xml:space="preserve">Parler est son arme.</w:t>
+      </w:r>
+      <w:r>
+        <w:t xml:space="preserve"> Rennard « cherche un fait, pas un coupable » : ce n'est pas un boss de tir, c'est un </w:t>
+      </w:r>
+      <w:r>
+        <w:rPr>
+          <w:b/>
+          <w:bCs/>
+        </w:rPr>
+        <w:t xml:space="preserve">retardateur</w:t>
+      </w:r>
+      <w:r>
+        <w:t xml:space="preserve">. Chaque round où il vous tient est un round que la </w:t>
+      </w:r>
+      <w:r>
+        <w:rPr>
+          <w:b/>
+          <w:bCs/>
+        </w:rPr>
+        <w:t xml:space="preserve">corvette</w:t>
+      </w:r>
+      <w:r>
+        <w:t xml:space="preserve"> gagne — confrontation et extraction sont </w:t>
+      </w:r>
+      <w:r>
+        <w:rPr>
+          <w:b/>
+          <w:bCs/>
+        </w:rPr>
+        <w:t xml:space="preserve">une seule séquence sous chrono</w:t>
+      </w:r>
+      <w:r>
+        <w:t xml:space="preserve">.</w:t>
+      </w:r>
+    </w:p>
+    <w:p>
+      <w:pPr>
+        <w:pStyle w:val="ListParagraph"/>
+        <w:numPr>
+          <w:ilvl w:val="0"/>
+          <w:numId w:val="2"/>
+        </w:numPr>
+        <w:spacing w:after="60" w:line="260"/>
+        <w:jc w:val="both"/>
+      </w:pPr>
+      <w:r>
+        <w:rPr>
+          <w:b/>
+          <w:bCs/>
+        </w:rPr>
+        <w:t xml:space="preserve">Le baratin est à double tranchant :</w:t>
+      </w:r>
+      <w:r>
+        <w:t xml:space="preserve"> tenter de le berner (Holt, code-cylindre impérial + Autorité) peut lui coûter un round s'il doute — mais s'il </w:t>
+      </w:r>
+      <w:r>
+        <w:rPr>
+          <w:b/>
+          <w:bCs/>
+        </w:rPr>
+        <w:t xml:space="preserve">ne mord pas</w:t>
+      </w:r>
+      <w:r>
+        <w:t xml:space="preserve"> (il ne bluffe pas et se fait rarement avoir), il le </w:t>
+      </w:r>
+      <w:r>
+        <w:rPr>
+          <w:b/>
+          <w:bCs/>
+        </w:rPr>
+        <w:t xml:space="preserve">note</w:t>
+      </w:r>
+      <w:r>
+        <w:t xml:space="preserve"> et durcit (renforts, fenêtre réduite).</w:t>
+      </w:r>
+    </w:p>
+    <w:p>
+      <w:pPr>
+        <w:pStyle w:val="ListParagraph"/>
+        <w:numPr>
+          <w:ilvl w:val="0"/>
+          <w:numId w:val="2"/>
+        </w:numPr>
+        <w:spacing w:after="60" w:line="260"/>
+        <w:jc w:val="both"/>
+      </w:pPr>
+      <w:r>
+        <w:rPr>
+          <w:b/>
+          <w:bCs/>
+        </w:rPr>
+        <w:t xml:space="preserve">Rennard est jetable</w:t>
+      </w:r>
+      <w:r>
+        <w:t xml:space="preserve"> (one-shot) : le </w:t>
+      </w:r>
+      <w:r>
+        <w:rPr>
+          <w:b/>
+          <w:bCs/>
+        </w:rPr>
+        <w:t xml:space="preserve">tuer</w:t>
+      </w:r>
+      <w:r>
+        <w:t xml:space="preserve"> est un </w:t>
+      </w:r>
+      <w:r>
+        <w:rPr>
+          <w:b/>
+          <w:bCs/>
+        </w:rPr>
+        <w:t xml:space="preserve">bonus</w:t>
+      </w:r>
+      <w:r>
+        <w:t xml:space="preserve"> (un agent brillant et loyal de moins pour l'ISB) — mais ne stoppe pas la corvette déjà signalée.</w:t>
+      </w:r>
+    </w:p>
+    <w:p>
+      <w:pPr>
+        <w:pStyle w:val="Heading2"/>
+      </w:pPr>
+      <w:r>
+        <w:t xml:space="preserve">Le chrono corvette et la fuite</w:t>
+      </w:r>
+    </w:p>
+    <w:p>
+      <w:pPr>
+        <w:spacing w:after="120" w:line="264"/>
+        <w:jc w:val="both"/>
+      </w:pPr>
+      <w:r>
+        <w:rPr>
+          <w:b/>
+          <w:bCs/>
+        </w:rPr>
+        <w:t xml:space="preserve">Fenêtre d'extraction : 10 rounds</w:t>
+      </w:r>
+      <w:r>
+        <w:t xml:space="preserve"> au quai pour rejoindre le </w:t>
+      </w:r>
+      <w:r>
+        <w:rPr>
+          <w:i/>
+          <w:iCs/>
+        </w:rPr>
+        <w:t xml:space="preserve">Murmure</w:t>
+      </w:r>
+      <w:r>
+        <w:t xml:space="preserve"> et décoller ; </w:t>
+      </w:r>
+      <w:r>
+        <w:rPr>
+          <w:b/>
+          <w:bCs/>
+        </w:rPr>
+        <w:t xml:space="preserve">+5 rounds si la météo est mauvaise</w:t>
+      </w:r>
+      <w:r>
+        <w:t xml:space="preserve"> (la tempête freine aussi la corvette) ; </w:t>
+      </w:r>
+      <w:r>
+        <w:rPr>
+          <w:b/>
+          <w:bCs/>
+        </w:rPr>
+        <w:t xml:space="preserve">+5 rounds si les PJ ont été rapides et propres</w:t>
+      </w:r>
+      <w:r>
+        <w:t xml:space="preserve"> (crans bas). Au-delà, la corvette est en position d'</w:t>
+      </w:r>
+      <w:r>
+        <w:rPr>
+          <w:b/>
+          <w:bCs/>
+        </w:rPr>
+        <w:t xml:space="preserve">interception</w:t>
+      </w:r>
+      <w:r>
+        <w:t xml:space="preserve">.</w:t>
+      </w:r>
+    </w:p>
+    <w:p>
+      <w:pPr>
+        <w:spacing w:after="120" w:line="264"/>
+        <w:jc w:val="both"/>
+      </w:pPr>
+      <w:r>
+        <w:rPr>
+          <w:b/>
+          <w:bCs/>
+        </w:rPr>
+        <w:t xml:space="preserve">Décoller ne suffit pas.</w:t>
+      </w:r>
+      <w:r>
+        <w:t xml:space="preserve"> Les PJ sont des rebelles : ils </w:t>
+      </w:r>
+      <w:r>
+        <w:rPr>
+          <w:b/>
+          <w:bCs/>
+        </w:rPr>
+        <w:t xml:space="preserve">forcent le départ</w:t>
+      </w:r>
+      <w:r>
+        <w:t xml:space="preserve"> et enchaînent, en vol, des </w:t>
+      </w:r>
+      <w:r>
+        <w:rPr>
+          <w:b/>
+          <w:bCs/>
+        </w:rPr>
+        <w:t xml:space="preserve">jets de Piloter vaisseaux et de Réparation (Transports)</w:t>
+      </w:r>
+      <w:r>
+        <w:t xml:space="preserve"> pour survivre à la turbulence (aggravée en tempête, annexe C). La fuite est </w:t>
+      </w:r>
+      <w:r>
+        <w:rPr>
+          <w:b/>
+          <w:bCs/>
+        </w:rPr>
+        <w:t xml:space="preserve">une scène active</w:t>
+      </w:r>
+      <w:r>
+        <w:t xml:space="preserve">, pas une transition.</w:t>
+      </w:r>
+    </w:p>
+    <w:p>
+      <w:pPr>
+        <w:spacing w:after="120" w:line="264"/>
+        <w:jc w:val="both"/>
+      </w:pPr>
+      <w:r>
+        <w:rPr>
+          <w:b/>
+          <w:bCs/>
+        </w:rPr>
+        <w:t xml:space="preserve">BAD END :</w:t>
+      </w:r>
+      <w:r>
+        <w:t xml:space="preserve"> trop lents → la corvette intercepte, et l'Empire </w:t>
+      </w:r>
+      <w:r>
+        <w:rPr>
+          <w:b/>
+          <w:bCs/>
+        </w:rPr>
+        <w:t xml:space="preserve">ne fait pas de quartier</w:t>
+      </w:r>
+      <w:r>
+        <w:t xml:space="preserve">. </w:t>
+      </w:r>
+      <w:r>
+        <w:rPr>
+          <w:i/>
+          <w:iCs/>
+        </w:rPr>
+        <w:t xml:space="preserve">(Mais nous sommes en space opera — voir « Gradient de fins ».)</w:t>
+      </w:r>
+    </w:p>
+    <w:p>
+      <w:pPr>
+        <w:pStyle w:val="Heading2"/>
+      </w:pPr>
+      <w:r>
+        <w:t xml:space="preserve">Les quatre axes de fin</w:t>
+      </w:r>
+    </w:p>
+    <w:p>
+      <w:pPr>
+        <w:spacing w:after="120" w:line="264"/>
+        <w:jc w:val="both"/>
+      </w:pPr>
+      <w:r>
+        <w:t xml:space="preserve">Les issues se combinent sur </w:t>
+      </w:r>
+      <w:r>
+        <w:rPr>
+          <w:b/>
+          <w:bCs/>
+        </w:rPr>
+        <w:t xml:space="preserve">quatre axes indépendants</w:t>
+      </w:r>
+      <w:r>
+        <w:t xml:space="preserve">, chacun un oui/non avec son bonus :</w:t>
+      </w:r>
+    </w:p>
+    <w:p>
+      <w:pPr>
+        <w:pStyle w:val="ListParagraph"/>
+        <w:numPr>
+          <w:ilvl w:val="0"/>
+          <w:numId w:val="3"/>
+        </w:numPr>
+        <w:spacing w:after="60" w:line="260"/>
+        <w:jc w:val="both"/>
+      </w:pPr>
+      <w:r>
+        <w:rPr>
+          <w:b/>
+          <w:bCs/>
+        </w:rPr>
+        <w:t xml:space="preserve">Données déchiffrées ?</w:t>
+      </w:r>
+      <w:r>
+        <w:t xml:space="preserve"> </w:t>
+      </w:r>
+      <w:r>
+        <w:rPr>
+          <w:i/>
+          <w:iCs/>
+        </w:rPr>
+        <w:t xml:space="preserve">Bonus : l'Alliance peut préparer sa riposte — la base L-14 est prévenue.</w:t>
+      </w:r>
+      <w:r>
+        <w:t xml:space="preserve"> Sinon : donnée brute à casser plus tard (course contre la frappe).</w:t>
+      </w:r>
+    </w:p>
+    <w:p>
+      <w:pPr>
+        <w:pStyle w:val="ListParagraph"/>
+        <w:numPr>
+          <w:ilvl w:val="0"/>
+          <w:numId w:val="3"/>
+        </w:numPr>
+        <w:spacing w:after="60" w:line="260"/>
+        <w:jc w:val="both"/>
+      </w:pPr>
+      <w:r>
+        <w:rPr>
+          <w:b/>
+          <w:bCs/>
+        </w:rPr>
+        <w:t xml:space="preserve">Tana (et Bafouille) embarquent ?</w:t>
+      </w:r>
+      <w:r>
+        <w:t xml:space="preserve"> </w:t>
+      </w:r>
+      <w:r>
+        <w:rPr>
+          <w:i/>
+          <w:iCs/>
+        </w:rPr>
+        <w:t xml:space="preserve">Bonus : l'Alliance gagne une alliée honnête, motivée et compétente.</w:t>
+      </w:r>
+    </w:p>
+    <w:p>
+      <w:pPr>
+        <w:pStyle w:val="ListParagraph"/>
+        <w:numPr>
+          <w:ilvl w:val="0"/>
+          <w:numId w:val="3"/>
+        </w:numPr>
+        <w:spacing w:after="60" w:line="260"/>
+        <w:jc w:val="both"/>
+      </w:pPr>
+      <w:r>
+        <w:rPr>
+          <w:b/>
+          <w:bCs/>
+        </w:rPr>
+        <w:t xml:space="preserve">Matériel récupéré ?</w:t>
+      </w:r>
+      <w:r>
+        <w:t xml:space="preserve"> </w:t>
+      </w:r>
+      <w:r>
+        <w:rPr>
+          <w:i/>
+          <w:iCs/>
+        </w:rPr>
+        <w:t xml:space="preserve">Bonus : les PJ ont rempli leur contrat d'origine — ils étaient là pour ça.</w:t>
+      </w:r>
+    </w:p>
+    <w:p>
+      <w:pPr>
+        <w:pStyle w:val="ListParagraph"/>
+        <w:numPr>
+          <w:ilvl w:val="0"/>
+          <w:numId w:val="3"/>
+        </w:numPr>
+        <w:spacing w:after="60" w:line="260"/>
+        <w:jc w:val="both"/>
+      </w:pPr>
+      <w:r>
+        <w:rPr>
+          <w:b/>
+          <w:bCs/>
+        </w:rPr>
+        <w:t xml:space="preserve">Assez rapides ?</w:t>
+      </w:r>
+      <w:r>
+        <w:t xml:space="preserve"> Sinon : interception → </w:t>
+      </w:r>
+      <w:r>
+        <w:rPr>
+          <w:b/>
+          <w:bCs/>
+        </w:rPr>
+        <w:t xml:space="preserve">BAD END</w:t>
+      </w:r>
+      <w:r>
+        <w:t xml:space="preserve">, atténué par le ton space opera.</w:t>
+      </w:r>
+    </w:p>
+    <w:tbl>
+      <w:tblPr>
+        <w:tblW w:type="dxa" w:w="4592"/>
+        <w:tblBorders>
+          <w:top w:val="single" w:color="D8D2BE" w:sz="4"/>
+          <w:left w:val="single" w:color="8A1C1C" w:sz="28"/>
+          <w:bottom w:val="single" w:color="D8D2BE" w:sz="4"/>
+          <w:right w:val="single" w:color="D8D2BE" w:sz="4"/>
+          <w:insideH w:val="none"/>
+          <w:insideV w:val="none"/>
+        </w:tblBorders>
+      </w:tblPr>
+      <w:tblGrid>
+        <w:gridCol w:w="4592"/>
+      </w:tblGrid>
+      <w:tr>
+        <w:tc>
+          <w:tcPr>
+            <w:tcW w:type="dxa" w:w="4592"/>
+            <w:shd w:fill="F4F1E8" w:color="auto" w:val="clear"/>
+            <w:tcMar>
+              <w:top w:type="dxa" w:w="100"/>
+              <w:left w:type="dxa" w:w="160"/>
+              <w:bottom w:type="dxa" w:w="100"/>
+              <w:right w:type="dxa" w:w="140"/>
+            </w:tcMar>
+          </w:tcPr>
+          <w:p>
+            <w:pPr>
+              <w:spacing w:after="80"/>
+            </w:pPr>
+            <w:r>
+              <w:rPr>
+                <w:b/>
+                <w:bCs/>
+                <w:color w:val="8A1C1C"/>
+                <w:sz w:val="19"/>
+                <w:szCs w:val="19"/>
+              </w:rPr>
+              <w:t xml:space="preserve">Encart MJ — Soupapes de sacrifice (transformer un « game over » en fin héroïque)</w:t>
+            </w:r>
+          </w:p>
+          <w:p>
+            <w:pPr>
+              <w:pStyle w:val="ListParagraph"/>
+              <w:numPr>
+                <w:ilvl w:val="0"/>
+                <w:numId w:val="2"/>
+              </w:numPr>
+              <w:spacing w:after="40" w:line="252"/>
+            </w:pPr>
+            <w:r>
+              <w:rPr>
+                <w:b/>
+                <w:bCs/>
+              </w:rPr>
+              <w:t xml:space="preserve">Larguer le matériel / la cargaison</w:t>
+            </w:r>
+            <w:r>
+              <w:t xml:space="preserve"> — le </w:t>
+            </w:r>
+            <w:r>
+              <w:rPr>
+                <w:i/>
+                <w:iCs/>
+              </w:rPr>
+              <w:t xml:space="preserve">Murmure</w:t>
+            </w:r>
+            <w:r>
+              <w:t xml:space="preserve"> s'allège : </w:t>
+            </w:r>
+            <w:r>
+              <w:rPr>
+                <w:b/>
+                <w:bCs/>
+              </w:rPr>
+              <w:t xml:space="preserve">+3 rounds</w:t>
+            </w:r>
+            <w:r>
+              <w:t xml:space="preserve"> / bonus au décollage. </w:t>
+            </w:r>
+            <w:r>
+              <w:rPr>
+                <w:i/>
+                <w:iCs/>
+              </w:rPr>
+              <w:t xml:space="preserve">Prix : on repart bredouilles (axe 3 perdu) — la cupidité punie.</w:t>
+            </w:r>
+          </w:p>
+          <w:p>
+            <w:pPr>
+              <w:pStyle w:val="ListParagraph"/>
+              <w:numPr>
+                <w:ilvl w:val="0"/>
+                <w:numId w:val="2"/>
+              </w:numPr>
+              <w:spacing w:after="40" w:line="252"/>
+            </w:pPr>
+            <w:r>
+              <w:rPr>
+                <w:b/>
+                <w:bCs/>
+              </w:rPr>
+              <w:t xml:space="preserve">Un PJ reste en couverture</w:t>
+            </w:r>
+            <w:r>
+              <w:t xml:space="preserve"> (tir de suppression, verrouille un sas, sabote une passerelle) — les autres embarquent sans être suivis. </w:t>
+            </w:r>
+            <w:r>
+              <w:rPr>
+                <w:i/>
+                <w:iCs/>
+              </w:rPr>
+              <w:t xml:space="preserve">Prix : capturé ou tombé — accroche « évasion ».</w:t>
+            </w:r>
+          </w:p>
+          <w:p>
+            <w:pPr>
+              <w:pStyle w:val="ListParagraph"/>
+              <w:numPr>
+                <w:ilvl w:val="0"/>
+                <w:numId w:val="2"/>
+              </w:numPr>
+              <w:spacing w:after="40" w:line="252"/>
+            </w:pPr>
+            <w:r>
+              <w:rPr>
+                <w:b/>
+                <w:bCs/>
+              </w:rPr>
+              <w:t xml:space="preserve">Tana se rend / fait diversion</w:t>
+            </w:r>
+            <w:r>
+              <w:t xml:space="preserve"> — c'est </w:t>
+            </w:r>
+            <w:r>
+              <w:rPr>
+                <w:b/>
+                <w:bCs/>
+              </w:rPr>
+              <w:t xml:space="preserve">elle</w:t>
+            </w:r>
+            <w:r>
+              <w:t xml:space="preserve"> que Rennard veut ; il la prend, lâche les PJ. </w:t>
+            </w:r>
+            <w:r>
+              <w:rPr>
+                <w:i/>
+                <w:iCs/>
+              </w:rPr>
+              <w:t xml:space="preserve">Tragique — mais la donnée est déjà partie.</w:t>
+            </w:r>
+          </w:p>
+          <w:p>
+            <w:pPr>
+              <w:pStyle w:val="ListParagraph"/>
+              <w:numPr>
+                <w:ilvl w:val="0"/>
+                <w:numId w:val="2"/>
+              </w:numPr>
+              <w:spacing w:after="40" w:line="252"/>
+            </w:pPr>
+            <w:r>
+              <w:rPr>
+                <w:b/>
+                <w:bCs/>
+              </w:rPr>
+              <w:t xml:space="preserve">Bafouille se sacrifie</w:t>
+            </w:r>
+            <w:r>
+              <w:t xml:space="preserve"> (brouille la corvette, surcharge un relais) — </w:t>
+            </w:r>
+            <w:r>
+              <w:rPr>
+                <w:b/>
+                <w:bCs/>
+              </w:rPr>
+              <w:t xml:space="preserve">−1 palier de poursuite</w:t>
+            </w:r>
+            <w:r>
+              <w:t xml:space="preserve">. </w:t>
+            </w:r>
+            <w:r>
+              <w:rPr>
+                <w:i/>
+                <w:iCs/>
+              </w:rPr>
+              <w:t xml:space="preserve">Le droïde loyal s'éteint sur une dernière vanne.</w:t>
+            </w:r>
+          </w:p>
+          <w:p>
+            <w:pPr>
+              <w:pStyle w:val="ListParagraph"/>
+              <w:numPr>
+                <w:ilvl w:val="0"/>
+                <w:numId w:val="2"/>
+              </w:numPr>
+              <w:spacing w:after="40" w:line="252"/>
+            </w:pPr>
+            <w:r>
+              <w:rPr>
+                <w:b/>
+                <w:bCs/>
+              </w:rPr>
+              <w:t xml:space="preserve">Provoquer le black-out</w:t>
+            </w:r>
+            <w:r>
+              <w:t xml:space="preserve"> (surcharger un générateur, cf. panne C19/J133) — Rennard aveugle </w:t>
+            </w:r>
+            <w:r>
+              <w:rPr>
+                <w:b/>
+                <w:bCs/>
+              </w:rPr>
+              <w:t xml:space="preserve">1 round</w:t>
+            </w:r>
+            <w:r>
+              <w:t xml:space="preserve">, caméras HS. </w:t>
+            </w:r>
+            <w:r>
+              <w:rPr>
+                <w:i/>
+                <w:iCs/>
+              </w:rPr>
+              <w:t xml:space="preserve">Prix : dégâts, station en alerte.</w:t>
+            </w:r>
+          </w:p>
+          <w:p>
+            <w:pPr>
+              <w:pStyle w:val="ListParagraph"/>
+              <w:numPr>
+                <w:ilvl w:val="0"/>
+                <w:numId w:val="2"/>
+              </w:numPr>
+              <w:spacing w:after="40" w:line="252"/>
+            </w:pPr>
+            <w:r>
+              <w:rPr>
+                <w:b/>
+                <w:bCs/>
+              </w:rPr>
+              <w:t xml:space="preserve">Larguer une nacelle-leurre / balise</w:t>
+            </w:r>
+            <w:r>
+              <w:t xml:space="preserve"> — la corvette vérifie la fausse piste : </w:t>
+            </w:r>
+            <w:r>
+              <w:rPr>
+                <w:b/>
+                <w:bCs/>
+              </w:rPr>
+              <w:t xml:space="preserve">+5 rounds</w:t>
+            </w:r>
+            <w:r>
+              <w:t xml:space="preserve">. </w:t>
+            </w:r>
+            <w:r>
+              <w:rPr>
+                <w:i/>
+                <w:iCs/>
+              </w:rPr>
+              <w:t xml:space="preserve">Prix : matériel / nacelle perdus.</w:t>
+            </w:r>
+          </w:p>
+        </w:tc>
+      </w:tr>
+    </w:tbl>
+    <w:p>
+      <w:pPr>
+        <w:spacing w:after="80"/>
+      </w:pPr>
+    </w:p>
+    <w:tbl>
+      <w:tblPr>
+        <w:tblW w:type="dxa" w:w="4592"/>
+        <w:tblBorders>
+          <w:top w:val="single" w:color="D8D2BE" w:sz="4"/>
+          <w:left w:val="single" w:color="8A1C1C" w:sz="28"/>
+          <w:bottom w:val="single" w:color="D8D2BE" w:sz="4"/>
+          <w:right w:val="single" w:color="D8D2BE" w:sz="4"/>
+          <w:insideH w:val="none"/>
+          <w:insideV w:val="none"/>
+        </w:tblBorders>
+      </w:tblPr>
+      <w:tblGrid>
+        <w:gridCol w:w="4592"/>
+      </w:tblGrid>
+      <w:tr>
+        <w:tc>
+          <w:tcPr>
+            <w:tcW w:type="dxa" w:w="4592"/>
+            <w:shd w:fill="F4F1E8" w:color="auto" w:val="clear"/>
+            <w:tcMar>
+              <w:top w:type="dxa" w:w="100"/>
+              <w:left w:type="dxa" w:w="160"/>
+              <w:bottom w:type="dxa" w:w="100"/>
+              <w:right w:type="dxa" w:w="140"/>
+            </w:tcMar>
+          </w:tcPr>
+          <w:p>
+            <w:pPr>
+              <w:spacing w:after="80"/>
+            </w:pPr>
+            <w:r>
+              <w:rPr>
+                <w:b/>
+                <w:bCs/>
+                <w:color w:val="8A1C1C"/>
+                <w:sz w:val="19"/>
+                <w:szCs w:val="19"/>
+              </w:rPr>
+              <w:t xml:space="preserve">Encart MJ — Gradient de fins (même le pire garde un fil d'espoir)</w:t>
+            </w:r>
+          </w:p>
+          <w:p>
+            <w:pPr>
+              <w:pStyle w:val="ListParagraph"/>
+              <w:numPr>
+                <w:ilvl w:val="0"/>
+                <w:numId w:val="2"/>
+              </w:numPr>
+              <w:spacing w:after="40" w:line="252"/>
+            </w:pPr>
+            <w:r>
+              <w:rPr>
+                <w:b/>
+                <w:bCs/>
+              </w:rPr>
+              <w:t xml:space="preserve">Triomphe</w:t>
+            </w:r>
+            <w:r>
+              <w:t xml:space="preserve"> — données déchiffrées · Tana + Bafouille · matériel · Rennard mort · saut propre. </w:t>
+            </w:r>
+            <w:r>
+              <w:rPr>
+                <w:i/>
+                <w:iCs/>
+              </w:rPr>
+              <w:t xml:space="preserve">L'Alliance est prévenue et gagne une cryptographe ; L-14 est sauvée.</w:t>
+            </w:r>
+          </w:p>
+          <w:p>
+            <w:pPr>
+              <w:pStyle w:val="ListParagraph"/>
+              <w:numPr>
+                <w:ilvl w:val="0"/>
+                <w:numId w:val="2"/>
+              </w:numPr>
+              <w:spacing w:after="40" w:line="252"/>
+            </w:pPr>
+            <w:r>
+              <w:rPr>
+                <w:b/>
+                <w:bCs/>
+              </w:rPr>
+              <w:t xml:space="preserve">Réussite coûteuse</w:t>
+            </w:r>
+            <w:r>
+              <w:t xml:space="preserve"> — ils sautent, mais blessés / matériel largué / Rennard vivant. </w:t>
+            </w:r>
+            <w:r>
+              <w:rPr>
+                <w:i/>
+                <w:iCs/>
+              </w:rPr>
+              <w:t xml:space="preserve">La donnée passe ; reste une dette et une cicatrice.</w:t>
+            </w:r>
+          </w:p>
+          <w:p>
+            <w:pPr>
+              <w:pStyle w:val="ListParagraph"/>
+              <w:numPr>
+                <w:ilvl w:val="0"/>
+                <w:numId w:val="2"/>
+              </w:numPr>
+              <w:spacing w:after="40" w:line="252"/>
+            </w:pPr>
+            <w:r>
+              <w:rPr>
+                <w:b/>
+                <w:bCs/>
+              </w:rPr>
+              <w:t xml:space="preserve">Demi-échec</w:t>
+            </w:r>
+            <w:r>
+              <w:t xml:space="preserve"> — seule la donnée </w:t>
+            </w:r>
+            <w:r>
+              <w:rPr>
+                <w:b/>
+                <w:bCs/>
+              </w:rPr>
+              <w:t xml:space="preserve">brute (chiffrée)</w:t>
+            </w:r>
+            <w:r>
+              <w:t xml:space="preserve"> est sortie (Bafouille aliéné). </w:t>
+            </w:r>
+            <w:r>
+              <w:rPr>
+                <w:i/>
+                <w:iCs/>
+              </w:rPr>
+              <w:t xml:space="preserve">L'Alliance mettra des semaines à la casser — course contre la frappe.</w:t>
+            </w:r>
+          </w:p>
+          <w:p>
+            <w:pPr>
+              <w:pStyle w:val="ListParagraph"/>
+              <w:numPr>
+                <w:ilvl w:val="0"/>
+                <w:numId w:val="2"/>
+              </w:numPr>
+              <w:spacing w:after="40" w:line="252"/>
+            </w:pPr>
+            <w:r>
+              <w:rPr>
+                <w:b/>
+                <w:bCs/>
+              </w:rPr>
+              <w:t xml:space="preserve">PJ capturé au quai</w:t>
+            </w:r>
+            <w:r>
+              <w:t xml:space="preserve"> — un tombe, les autres sautent avec la donnée. </w:t>
+            </w:r>
+            <w:r>
+              <w:rPr>
+                <w:i/>
+                <w:iCs/>
+              </w:rPr>
+              <w:t xml:space="preserve">Le prisonnier devient l'enjeu d'un futur sauvetage.</w:t>
+            </w:r>
+          </w:p>
+          <w:p>
+            <w:pPr>
+              <w:pStyle w:val="ListParagraph"/>
+              <w:numPr>
+                <w:ilvl w:val="0"/>
+                <w:numId w:val="2"/>
+              </w:numPr>
+              <w:spacing w:after="40" w:line="252"/>
+            </w:pPr>
+            <w:r>
+              <w:rPr>
+                <w:b/>
+                <w:bCs/>
+              </w:rPr>
+              <w:t xml:space="preserve">« BAD END » space opera</w:t>
+            </w:r>
+            <w:r>
+              <w:t xml:space="preserve"> — l'équipe est interceptée. </w:t>
+            </w:r>
+            <w:r>
+              <w:rPr>
+                <w:i/>
+                <w:iCs/>
+              </w:rPr>
+              <w:t xml:space="preserve">Mais Tana ou Bafouille a déjà relayé au Courtier : la mission a réussi sans eux ; une évasion se prépare.</w:t>
+            </w:r>
+          </w:p>
+        </w:tc>
+      </w:tr>
+    </w:tbl>
+    <w:p>
+      <w:pPr>
+        <w:spacing w:after="80"/>
+      </w:pPr>
+    </w:p>
+    <w:p>
+      <w:pPr>
+        <w:pStyle w:val="Heading2"/>
+      </w:pPr>
+      <w:r>
+        <w:t xml:space="preserve">Le sort de Tana</w:t>
+      </w:r>
+    </w:p>
+    <w:p>
+      <w:pPr>
+        <w:pStyle w:val="ListParagraph"/>
+        <w:numPr>
+          <w:ilvl w:val="0"/>
+          <w:numId w:val="2"/>
+        </w:numPr>
+        <w:spacing w:after="60" w:line="260"/>
+        <w:jc w:val="both"/>
+      </w:pPr>
+      <w:r>
+        <w:rPr>
+          <w:b/>
+          <w:bCs/>
+        </w:rPr>
+        <w:t xml:space="preserve">Elle part avec les PJ</w:t>
+      </w:r>
+      <w:r>
+        <w:t xml:space="preserve"> </w:t>
+      </w:r>
+      <w:r>
+        <w:rPr>
+          <w:i/>
+          <w:iCs/>
+        </w:rPr>
+        <w:t xml:space="preserve">(convaincue)</w:t>
+      </w:r>
+      <w:r>
+        <w:t xml:space="preserve"> — nouvelle alliée de la cellule, précieuse en cryptanalyse et connaissance de l'Empire ; Bafouille avec elle.</w:t>
+      </w:r>
+    </w:p>
+    <w:p>
+      <w:pPr>
+        <w:pStyle w:val="ListParagraph"/>
+        <w:numPr>
+          <w:ilvl w:val="0"/>
+          <w:numId w:val="2"/>
+        </w:numPr>
+        <w:spacing w:after="60" w:line="260"/>
+        <w:jc w:val="both"/>
+      </w:pPr>
+      <w:r>
+        <w:rPr>
+          <w:b/>
+          <w:bCs/>
+        </w:rPr>
+        <w:t xml:space="preserve">Elle reste</w:t>
+      </w:r>
+      <w:r>
+        <w:t xml:space="preserve"> — pour continuer à écouter depuis Kessel-Tho, source dormante et point de contact futur (au prix d'un risque croissant).</w:t>
+      </w:r>
+    </w:p>
+    <w:p>
+      <w:pPr>
+        <w:pStyle w:val="ListParagraph"/>
+        <w:numPr>
+          <w:ilvl w:val="0"/>
+          <w:numId w:val="2"/>
+        </w:numPr>
+        <w:spacing w:after="60" w:line="260"/>
+        <w:jc w:val="both"/>
+      </w:pPr>
+      <w:r>
+        <w:rPr>
+          <w:b/>
+          <w:bCs/>
+        </w:rPr>
+        <w:t xml:space="preserve">Elle se sacrifie / se rend</w:t>
+      </w:r>
+      <w:r>
+        <w:t xml:space="preserve"> — pour couvrir la fuite ou détourner Rennard : fin tragique, mais </w:t>
+      </w:r>
+      <w:r>
+        <w:rPr>
+          <w:b/>
+          <w:bCs/>
+        </w:rPr>
+        <w:t xml:space="preserve">la donnée est déjà partie</w:t>
+      </w:r>
+      <w:r>
+        <w:t xml:space="preserve"> (elle ou Bafouille l'a relayée).</w:t>
+      </w:r>
+    </w:p>
+    <w:p>
+      <w:pPr>
+        <w:pStyle w:val="Heading2"/>
+      </w:pPr>
+      <w:r>
+        <w:t xml:space="preserve">Ouverture vers le futur</w:t>
+      </w:r>
+    </w:p>
+    <w:p>
+      <w:pPr>
+        <w:pStyle w:val="ListParagraph"/>
+        <w:numPr>
+          <w:ilvl w:val="0"/>
+          <w:numId w:val="2"/>
+        </w:numPr>
+        <w:spacing w:after="60" w:line="260"/>
+        <w:jc w:val="both"/>
+      </w:pPr>
+      <w:r>
+        <w:rPr>
+          <w:b/>
+          <w:bCs/>
+        </w:rPr>
+        <w:t xml:space="preserve">L'avertissement.</w:t>
+      </w:r>
+      <w:r>
+        <w:t xml:space="preserve"> Les coordonnées L-14 lancent une course : prévenir la base dissidente avant la frappe — accroche directe pour la suite.</w:t>
+      </w:r>
+    </w:p>
+    <w:p>
+      <w:pPr>
+        <w:pStyle w:val="ListParagraph"/>
+        <w:numPr>
+          <w:ilvl w:val="0"/>
+          <w:numId w:val="2"/>
+        </w:numPr>
+        <w:spacing w:after="60" w:line="260"/>
+        <w:jc w:val="both"/>
+      </w:pPr>
+      <w:r>
+        <w:rPr>
+          <w:b/>
+          <w:bCs/>
+        </w:rPr>
+        <w:t xml:space="preserve">La traque commence.</w:t>
+      </w:r>
+      <w:r>
+        <w:t xml:space="preserve"> Ce que les PJ ont entrevu, c'est la </w:t>
+      </w:r>
+      <w:r>
+        <w:rPr>
+          <w:b/>
+          <w:bCs/>
+        </w:rPr>
+        <w:t xml:space="preserve">naissance de l'Escadron de la Mort</w:t>
+      </w:r>
+      <w:r>
+        <w:t xml:space="preserve"> : l'</w:t>
+      </w:r>
+      <w:r>
+        <w:rPr>
+          <w:i/>
+          <w:iCs/>
+        </w:rPr>
+        <w:t xml:space="preserve">Executor</w:t>
+      </w:r>
+      <w:r>
+        <w:t xml:space="preserve"> et sa flotte entrent en scène. Le secteur n'est plus sûr.</w:t>
+      </w:r>
+    </w:p>
+    <w:p>
+      <w:pPr>
+        <w:pStyle w:val="ListParagraph"/>
+        <w:numPr>
+          <w:ilvl w:val="0"/>
+          <w:numId w:val="2"/>
+        </w:numPr>
+        <w:spacing w:after="60" w:line="260"/>
+        <w:jc w:val="both"/>
+      </w:pPr>
+      <w:r>
+        <w:rPr>
+          <w:b/>
+          <w:bCs/>
+        </w:rPr>
+        <w:t xml:space="preserve">Si Rennard a survécu</w:t>
+      </w:r>
+      <w:r>
+        <w:t xml:space="preserve"> </w:t>
+      </w:r>
+      <w:r>
+        <w:rPr>
+          <w:i/>
+          <w:iCs/>
+        </w:rPr>
+        <w:t xml:space="preserve">(crans hauts, fuite sans l'abattre)</w:t>
+      </w:r>
+      <w:r>
+        <w:t xml:space="preserve"> — il devient une </w:t>
+      </w:r>
+      <w:r>
+        <w:rPr>
+          <w:b/>
+          <w:bCs/>
+        </w:rPr>
+        <w:t xml:space="preserve">némésis</w:t>
+      </w:r>
+      <w:r>
+        <w:t xml:space="preserve"> possible : patient, méthodique, sans colère et sans oubli. Sinon, l'ISB a perdu son meilleur limier.</w:t>
       </w:r>
     </w:p>
     <w:p>

</xml_diff>

<commit_message>
TODO #6 & #7 — Nomenclature + références orphelines
#6 Nomenclature :
- collision « (d) » levée : le journal devient « le journal-trésor » dans toute
  la prose (jamais « (d) ») ; les 4 énigmes restent (a)-(d) ; encart
  « Convention de nommage » remplace l'avertissement.
- tableau des indices §1 réordonné dans l'ordre de visite (a -> d -> b -> c).

#7 Références orphelines :
- index des handouts (d)->(j) ajouté en Présentation (fichier, contenu,
  où le trouver en jeu ; message 0 = annexe D).
- toute mention de bafouille.exe supprimée (le droïde Bafouille calcule).
- bonus cohérence : skill « Bureaucratie impériale » de l'horloge ISB
  renommée « Administration » (système visions de légendes).

Co-Authored-By: Claude Opus 4.8 <noreply@anthropic.com>
</commit_message>
<xml_diff>
--- a/star-wars/scenarios/birth-of-the-death-squadron/docs/scenario_signal_detresse_FUSION.docx
+++ b/star-wars/scenarios/birth-of-the-death-squadron/docs/scenario_signal_detresse_FUSION.docx
@@ -538,7 +538,17 @@
         <w:t xml:space="preserve">indices</w:t>
       </w:r>
       <w:r>
-        <w:t xml:space="preserve"> physiques que Tana a dissimulés :</w:t>
+        <w:t xml:space="preserve"> physiques que Tana a dissimulés </w:t>
+      </w:r>
+      <w:r>
+        <w:rPr>
+          <w:i/>
+          <w:iCs/>
+        </w:rPr>
+        <w:t xml:space="preserve">(présentés ici dans l'ordre de visite le plus probable — l'ordre de résolution n'a pas d'importance mécanique)</w:t>
+      </w:r>
+      <w:r>
+        <w:t xml:space="preserve"> :</w:t>
       </w:r>
     </w:p>
     <w:p>
@@ -569,7 +579,7 @@
         <w:t xml:space="preserve">3 alias</w:t>
       </w:r>
       <w:r>
-        <w:t xml:space="preserve"> à cibler dans le journal.</w:t>
+        <w:t xml:space="preserve"> à cibler dans le journal-trésor.</w:t>
       </w:r>
     </w:p>
     <w:p>
@@ -587,20 +597,30 @@
           <w:b/>
           <w:bCs/>
         </w:rPr>
-        <w:t xml:space="preserve">(b) Fresque</w:t>
-      </w:r>
-      <w:r>
-        <w:t xml:space="preserve"> — Galerie de maintenance (Dosh Kavarel) : phrase </w:t>
-      </w:r>
-      <w:r>
-        <w:rPr>
-          <w:b/>
-          <w:bCs/>
-        </w:rPr>
-        <w:t xml:space="preserve">ORPHELINS</w:t>
-      </w:r>
-      <w:r>
-        <w:t xml:space="preserve"> (clé des Coordonnées).</w:t>
+        <w:t xml:space="preserve">(d) Annonces du mess</w:t>
+      </w:r>
+      <w:r>
+        <w:t xml:space="preserve"> — Mess (Kessa Droman) : clé maître </w:t>
+      </w:r>
+      <w:r>
+        <w:rPr>
+          <w:b/>
+          <w:bCs/>
+        </w:rPr>
+        <w:t xml:space="preserve">RépubliqueRetour</w:t>
+      </w:r>
+      <w:r>
+        <w:t xml:space="preserve"> + </w:t>
+      </w:r>
+      <w:r>
+        <w:rPr>
+          <w:b/>
+          <w:bCs/>
+        </w:rPr>
+        <w:t xml:space="preserve">Argon2</w:t>
+      </w:r>
+      <w:r>
+        <w:t xml:space="preserve">.</w:t>
       </w:r>
     </w:p>
     <w:p>
@@ -618,20 +638,20 @@
           <w:b/>
           <w:bCs/>
         </w:rPr>
-        <w:t xml:space="preserve">(c) Pentaminos</w:t>
-      </w:r>
-      <w:r>
-        <w:t xml:space="preserve"> — Centre sportif (Grash Meloi) : phrase </w:t>
-      </w:r>
-      <w:r>
-        <w:rPr>
-          <w:b/>
-          <w:bCs/>
-        </w:rPr>
-        <w:t xml:space="preserve">JENESUISPLUSSEULEICI</w:t>
-      </w:r>
-      <w:r>
-        <w:t xml:space="preserve"> (clé des Messages).</w:t>
+        <w:t xml:space="preserve">(b) Fresque</w:t>
+      </w:r>
+      <w:r>
+        <w:t xml:space="preserve"> — Galerie de maintenance (Dosh Kavarel) : phrase </w:t>
+      </w:r>
+      <w:r>
+        <w:rPr>
+          <w:b/>
+          <w:bCs/>
+        </w:rPr>
+        <w:t xml:space="preserve">ORPHELINS</w:t>
+      </w:r>
+      <w:r>
+        <w:t xml:space="preserve"> (clé des Coordonnées).</w:t>
       </w:r>
     </w:p>
     <w:p>
@@ -649,30 +669,20 @@
           <w:b/>
           <w:bCs/>
         </w:rPr>
-        <w:t xml:space="preserve">(d) Annonces du mess</w:t>
-      </w:r>
-      <w:r>
-        <w:t xml:space="preserve"> — Mess (Kessa Droman) : clé maître </w:t>
-      </w:r>
-      <w:r>
-        <w:rPr>
-          <w:b/>
-          <w:bCs/>
-        </w:rPr>
-        <w:t xml:space="preserve">RépubliqueRetour</w:t>
-      </w:r>
-      <w:r>
-        <w:t xml:space="preserve"> + </w:t>
-      </w:r>
-      <w:r>
-        <w:rPr>
-          <w:b/>
-          <w:bCs/>
-        </w:rPr>
-        <w:t xml:space="preserve">Argon2</w:t>
-      </w:r>
-      <w:r>
-        <w:t xml:space="preserve">.</w:t>
+        <w:t xml:space="preserve">(c) Pentaminos</w:t>
+      </w:r>
+      <w:r>
+        <w:t xml:space="preserve"> — Centre sportif (Grash Meloi) : phrase </w:t>
+      </w:r>
+      <w:r>
+        <w:rPr>
+          <w:b/>
+          <w:bCs/>
+        </w:rPr>
+        <w:t xml:space="preserve">JENESUISPLUSSEULEICI</w:t>
+      </w:r>
+      <w:r>
+        <w:t xml:space="preserve"> (clé des Messages).</w:t>
       </w:r>
     </w:p>
     <w:p>
@@ -691,18 +701,7 @@
         <w:t xml:space="preserve">Bafouille</w:t>
       </w:r>
       <w:r>
-        <w:t xml:space="preserve"> (ou l'outil </w:t>
-      </w:r>
-      <w:r>
-        <w:rPr>
-          <w:sz w:val="18"/>
-          <w:szCs w:val="18"/>
-          <w:rFonts w:ascii="Consolas" w:cs="Consolas" w:eastAsia="Consolas" w:hAnsi="Consolas"/>
-        </w:rPr>
-        <w:t xml:space="preserve">bafouille.exe</w:t>
-      </w:r>
-      <w:r>
-        <w:t xml:space="preserve"> fourni au MJ) qui effectue les calculs et restitue en clair les </w:t>
+        <w:t xml:space="preserve"> qui effectue les calculs et restitue en clair les </w:t>
       </w:r>
       <w:r>
         <w:rPr>
@@ -719,7 +718,7 @@
           <w:b/>
           <w:bCs/>
         </w:rPr>
-        <w:t xml:space="preserve">journal (document d)</w:t>
+        <w:t xml:space="preserve">journal-trésor</w:t>
       </w:r>
       <w:r>
         <w:t xml:space="preserve">, isolé dans la </w:t>
@@ -739,7 +738,7 @@
           <w:i/>
           <w:iCs/>
         </w:rPr>
-        <w:t xml:space="preserve">Le jeu, c'est la résolution des énigmes — pas la cryptographie : les joueurs fournissent les paramètres, la machine calcule.</w:t>
+        <w:t xml:space="preserve">Le jeu, c'est la résolution des énigmes — pas la cryptographie : les joueurs fournissent les paramètres, Bafouille calcule.</w:t>
       </w:r>
     </w:p>
     <w:tbl>
@@ -781,7 +780,7 @@
                 <w:sz w:val="19"/>
                 <w:szCs w:val="19"/>
               </w:rPr>
-              <w:t xml:space="preserve">⚠ Attention à la lettre « (d) »</w:t>
+              <w:t xml:space="preserve">Convention de nommage</w:t>
             </w:r>
           </w:p>
           <w:p>
@@ -790,47 +789,48 @@
               <w:jc w:val="both"/>
             </w:pPr>
             <w:r>
-              <w:t xml:space="preserve">Dans les documents source, « (d) » désigne </w:t>
+              <w:t xml:space="preserve">Les </w:t>
             </w:r>
             <w:r>
               <w:rPr>
                 <w:b/>
                 <w:bCs/>
               </w:rPr>
-              <w:t xml:space="preserve">deux choses distinctes</w:t>
-            </w:r>
-            <w:r>
-              <w:t xml:space="preserve"> : la </w:t>
+              <w:t xml:space="preserve">quatre énigmes</w:t>
+            </w:r>
+            <w:r>
+              <w:t xml:space="preserve"> sont </w:t>
             </w:r>
             <w:r>
               <w:rPr>
                 <w:b/>
                 <w:bCs/>
               </w:rPr>
-              <w:t xml:space="preserve">4ᵉ énigme</w:t>
-            </w:r>
-            <w:r>
-              <w:t xml:space="preserve"> (les annonces du mess) </w:t>
+              <w:t xml:space="preserve">(a) à (d)</w:t>
+            </w:r>
+            <w:r>
+              <w:t xml:space="preserve"> ; le journal chiffré est toujours appelé </w:t>
             </w:r>
             <w:r>
               <w:rPr>
                 <w:b/>
                 <w:bCs/>
               </w:rPr>
-              <w:t xml:space="preserve">et</w:t>
-            </w:r>
-            <w:r>
-              <w:t xml:space="preserve"> le </w:t>
+              <w:t xml:space="preserve">« le journal-trésor »</w:t>
+            </w:r>
+            <w:r>
+              <w:t xml:space="preserve"> (fichiers source </w:t>
             </w:r>
             <w:r>
               <w:rPr>
-                <w:b/>
-                <w:bCs/>
+                <w:sz w:val="18"/>
+                <w:szCs w:val="18"/>
+                <w:rFonts w:ascii="Consolas" w:cs="Consolas" w:eastAsia="Consolas" w:hAnsi="Consolas"/>
               </w:rPr>
-              <w:t xml:space="preserve">journal chiffré</w:t>
-            </w:r>
-            <w:r>
-              <w:t xml:space="preserve"> (document d, le trésor final). Ce document conserve les deux libellés d'origine ; ne les confondez pas en jeu.</w:t>
+              <w:t xml:space="preserve">d_journal_*</w:t>
+            </w:r>
+            <w:r>
+              <w:t xml:space="preserve">), jamais « (d) ». Dans les sources, la lettre d de l'énigme du mess et celle du handout du journal coïncident par hasard — ce document lève l'ambiguïté en nommant le trésor par son nom.</w:t>
             </w:r>
           </w:p>
         </w:tc>
@@ -1295,14 +1295,14 @@
         <w:t xml:space="preserve">Holt Marek de l'intérieur :</w:t>
       </w:r>
       <w:r>
-        <w:t xml:space="preserve"> exploiter les procédures ISB (faux ordre, lenteur administrative provoquée) — −1 sur un jet de </w:t>
-      </w:r>
-      <w:r>
-        <w:rPr>
-          <w:i/>
-          <w:iCs/>
-        </w:rPr>
-        <w:t xml:space="preserve">Bureaucratie impériale</w:t>
+        <w:t xml:space="preserve"> exploiter les procédures ISB (faux ordre, lenteur administrative provoquée) — −1 sur un jet d'</w:t>
+      </w:r>
+      <w:r>
+        <w:rPr>
+          <w:i/>
+          <w:iCs/>
+        </w:rPr>
+        <w:t xml:space="preserve">Administration</w:t>
       </w:r>
       <w:r>
         <w:t xml:space="preserve"> réussi.</w:t>
@@ -1490,7 +1490,396 @@
         <w:t xml:space="preserve">Les handouts (d)→(j)</w:t>
       </w:r>
       <w:r>
-        <w:t xml:space="preserve"> existent comme documents séparés à distribuer selon les fouilles des PJ ; ils ne sont pas reproduits ici.</w:t>
+        <w:t xml:space="preserve"> existent comme documents séparés à distribuer selon les fouilles des PJ (index ci-dessous) ; ils ne sont pas reproduits ici.</w:t>
+      </w:r>
+    </w:p>
+    <w:p>
+      <w:pPr>
+        <w:pStyle w:val="Heading2"/>
+      </w:pPr>
+      <w:r>
+        <w:t xml:space="preserve">Les handouts (documents d → j)</w:t>
+      </w:r>
+    </w:p>
+    <w:p>
+      <w:pPr>
+        <w:spacing w:after="120" w:line="264"/>
+        <w:jc w:val="both"/>
+      </w:pPr>
+      <w:r>
+        <w:t xml:space="preserve">Sept documents à remettre aux joueurs selon leurs fouilles — non reproduits ici (fichiers du dossier </w:t>
+      </w:r>
+      <w:r>
+        <w:rPr>
+          <w:sz w:val="18"/>
+          <w:szCs w:val="18"/>
+          <w:rFonts w:ascii="Consolas" w:cs="Consolas" w:eastAsia="Consolas" w:hAnsi="Consolas"/>
+        </w:rPr>
+        <w:t xml:space="preserve">docs/</w:t>
+      </w:r>
+      <w:r>
+        <w:t xml:space="preserve">). Le </w:t>
+      </w:r>
+      <w:r>
+        <w:rPr>
+          <w:b/>
+          <w:bCs/>
+        </w:rPr>
+        <w:t xml:space="preserve">message initial de Tana</w:t>
+      </w:r>
+      <w:r>
+        <w:t xml:space="preserve"> (« message 0 ») est, lui, reproduit en </w:t>
+      </w:r>
+      <w:r>
+        <w:rPr>
+          <w:b/>
+          <w:bCs/>
+        </w:rPr>
+        <w:t xml:space="preserve">annexe D</w:t>
+      </w:r>
+      <w:r>
+        <w:t xml:space="preserve">.</w:t>
+      </w:r>
+    </w:p>
+    <w:p>
+      <w:pPr>
+        <w:pStyle w:val="ListParagraph"/>
+        <w:numPr>
+          <w:ilvl w:val="0"/>
+          <w:numId w:val="2"/>
+        </w:numPr>
+        <w:spacing w:after="60" w:line="260"/>
+        <w:jc w:val="both"/>
+      </w:pPr>
+      <w:r>
+        <w:rPr>
+          <w:b/>
+          <w:bCs/>
+        </w:rPr>
+        <w:t xml:space="preserve">(d) Le journal-trésor</w:t>
+      </w:r>
+      <w:r>
+        <w:t xml:space="preserve"> </w:t>
+      </w:r>
+      <w:r>
+        <w:rPr>
+          <w:i/>
+          <w:iCs/>
+        </w:rPr>
+        <w:t xml:space="preserve">(`d_journal_</w:t>
+      </w:r>
+      <w:r>
+        <w:t xml:space="preserve">`)</w:t>
+      </w:r>
+      <w:r>
+        <w:rPr>
+          <w:i/>
+          <w:iCs/>
+        </w:rPr>
+        <w:t xml:space="preserve"> — le journal de facturation de Kallan où Tana a caché ses 18 entrées. </w:t>
+      </w:r>
+      <w:r>
+        <w:rPr>
+          <w:i/>
+          <w:iCs/>
+        </w:rPr>
+        <w:t xml:space="preserve">Où :</w:t>
+      </w:r>
+      <w:r>
+        <w:rPr>
+          <w:i/>
+          <w:iCs/>
+        </w:rPr>
+        <w:t xml:space="preserve"> serveur DMZ, via le casse (§5). </w:t>
+      </w:r>
+      <w:r>
+        <w:t xml:space="preserve">Le trésor.*</w:t>
+      </w:r>
+    </w:p>
+    <w:p>
+      <w:pPr>
+        <w:pStyle w:val="ListParagraph"/>
+        <w:numPr>
+          <w:ilvl w:val="0"/>
+          <w:numId w:val="2"/>
+        </w:numPr>
+        <w:spacing w:after="60" w:line="260"/>
+        <w:jc w:val="both"/>
+      </w:pPr>
+      <w:r>
+        <w:rPr>
+          <w:b/>
+          <w:bCs/>
+        </w:rPr>
+        <w:t xml:space="preserve">(e) Note d'analyse de trafic</w:t>
+      </w:r>
+      <w:r>
+        <w:t xml:space="preserve"> </w:t>
+      </w:r>
+      <w:r>
+        <w:rPr>
+          <w:i/>
+          <w:iCs/>
+        </w:rPr>
+        <w:t xml:space="preserve">(`e_note_analyse_trafic`)</w:t>
+      </w:r>
+      <w:r>
+        <w:t xml:space="preserve"> — rapport de l'analyste Renn Okuda (signaux non identifiés ; le </w:t>
+      </w:r>
+      <w:r>
+        <w:rPr>
+          <w:i/>
+          <w:iCs/>
+        </w:rPr>
+        <w:t xml:space="preserve">Long Sillage</w:t>
+      </w:r>
+      <w:r>
+        <w:t xml:space="preserve"> « suspecté »). </w:t>
+      </w:r>
+      <w:r>
+        <w:rPr>
+          <w:b/>
+          <w:bCs/>
+        </w:rPr>
+        <w:t xml:space="preserve">Où :</w:t>
+      </w:r>
+      <w:r>
+        <w:t xml:space="preserve"> capitainerie / recoupements.</w:t>
+      </w:r>
+    </w:p>
+    <w:p>
+      <w:pPr>
+        <w:pStyle w:val="ListParagraph"/>
+        <w:numPr>
+          <w:ilvl w:val="0"/>
+          <w:numId w:val="2"/>
+        </w:numPr>
+        <w:spacing w:after="60" w:line="260"/>
+        <w:jc w:val="both"/>
+      </w:pPr>
+      <w:r>
+        <w:rPr>
+          <w:b/>
+          <w:bCs/>
+        </w:rPr>
+        <w:t xml:space="preserve">(f) Audit CCS-4</w:t>
+      </w:r>
+      <w:r>
+        <w:t xml:space="preserve"> </w:t>
+      </w:r>
+      <w:r>
+        <w:rPr>
+          <w:i/>
+          <w:iCs/>
+        </w:rPr>
+        <w:t xml:space="preserve">(`f_audit_ccs4`)</w:t>
+      </w:r>
+      <w:r>
+        <w:t xml:space="preserve"> — audit sectoriel (conformité de la DMZ, bornes WN). </w:t>
+      </w:r>
+      <w:r>
+        <w:rPr>
+          <w:b/>
+          <w:bCs/>
+        </w:rPr>
+        <w:t xml:space="preserve">Où :</w:t>
+      </w:r>
+      <w:r>
+        <w:t xml:space="preserve"> administration / réseau.</w:t>
+      </w:r>
+    </w:p>
+    <w:p>
+      <w:pPr>
+        <w:pStyle w:val="ListParagraph"/>
+        <w:numPr>
+          <w:ilvl w:val="0"/>
+          <w:numId w:val="2"/>
+        </w:numPr>
+        <w:spacing w:after="60" w:line="260"/>
+        <w:jc w:val="both"/>
+      </w:pPr>
+      <w:r>
+        <w:rPr>
+          <w:b/>
+          <w:bCs/>
+        </w:rPr>
+        <w:t xml:space="preserve">(g) Journal de nuit</w:t>
+      </w:r>
+      <w:r>
+        <w:t xml:space="preserve"> </w:t>
+      </w:r>
+      <w:r>
+        <w:rPr>
+          <w:i/>
+          <w:iCs/>
+        </w:rPr>
+        <w:t xml:space="preserve">(`g_journal_nuit`)</w:t>
+      </w:r>
+      <w:r>
+        <w:t xml:space="preserve"> — journal de bord du contremaître Bregman (incidents récents, cf. Chronologie). </w:t>
+      </w:r>
+      <w:r>
+        <w:rPr>
+          <w:b/>
+          <w:bCs/>
+        </w:rPr>
+        <w:t xml:space="preserve">Où :</w:t>
+      </w:r>
+      <w:r>
+        <w:t xml:space="preserve"> salle de passation.</w:t>
+      </w:r>
+    </w:p>
+    <w:p>
+      <w:pPr>
+        <w:pStyle w:val="ListParagraph"/>
+        <w:numPr>
+          <w:ilvl w:val="0"/>
+          <w:numId w:val="2"/>
+        </w:numPr>
+        <w:spacing w:after="60" w:line="260"/>
+        <w:jc w:val="both"/>
+      </w:pPr>
+      <w:r>
+        <w:rPr>
+          <w:b/>
+          <w:bCs/>
+        </w:rPr>
+        <w:t xml:space="preserve">(h) Registre des antennes</w:t>
+      </w:r>
+      <w:r>
+        <w:t xml:space="preserve"> </w:t>
+      </w:r>
+      <w:r>
+        <w:rPr>
+          <w:i/>
+          <w:iCs/>
+        </w:rPr>
+        <w:t xml:space="preserve">(`h_registre_antennes`)</w:t>
+      </w:r>
+      <w:r>
+        <w:t xml:space="preserve"> — maintenance des antennes AD/HN (incidents cycles 13-19). </w:t>
+      </w:r>
+      <w:r>
+        <w:rPr>
+          <w:b/>
+          <w:bCs/>
+        </w:rPr>
+        <w:t xml:space="preserve">Où :</w:t>
+      </w:r>
+      <w:r>
+        <w:t xml:space="preserve"> N4 / Kavarel.</w:t>
+      </w:r>
+    </w:p>
+    <w:p>
+      <w:pPr>
+        <w:pStyle w:val="ListParagraph"/>
+        <w:numPr>
+          <w:ilvl w:val="0"/>
+          <w:numId w:val="2"/>
+        </w:numPr>
+        <w:spacing w:after="60" w:line="260"/>
+        <w:jc w:val="both"/>
+      </w:pPr>
+      <w:r>
+        <w:rPr>
+          <w:b/>
+          <w:bCs/>
+        </w:rPr>
+        <w:t xml:space="preserve">(i) Correspondance licence</w:t>
+      </w:r>
+      <w:r>
+        <w:t xml:space="preserve"> </w:t>
+      </w:r>
+      <w:r>
+        <w:rPr>
+          <w:i/>
+          <w:iCs/>
+        </w:rPr>
+        <w:t xml:space="preserve">(`i_correspondance_licence`)</w:t>
+      </w:r>
+      <w:r>
+        <w:t xml:space="preserve"> — l'échange qui révèle le pot-de-vin de Kallan — </w:t>
+      </w:r>
+      <w:r>
+        <w:rPr>
+          <w:b/>
+          <w:bCs/>
+        </w:rPr>
+        <w:t xml:space="preserve">la clé de la trace ISB</w:t>
+      </w:r>
+      <w:r>
+        <w:t xml:space="preserve"> (§5). </w:t>
+      </w:r>
+      <w:r>
+        <w:rPr>
+          <w:b/>
+          <w:bCs/>
+        </w:rPr>
+        <w:t xml:space="preserve">Où :</w:t>
+      </w:r>
+      <w:r>
+        <w:t xml:space="preserve"> bureau Kallan.</w:t>
+      </w:r>
+    </w:p>
+    <w:p>
+      <w:pPr>
+        <w:pStyle w:val="ListParagraph"/>
+        <w:numPr>
+          <w:ilvl w:val="0"/>
+          <w:numId w:val="2"/>
+        </w:numPr>
+        <w:spacing w:after="60" w:line="260"/>
+        <w:jc w:val="both"/>
+      </w:pPr>
+      <w:r>
+        <w:rPr>
+          <w:b/>
+          <w:bCs/>
+        </w:rPr>
+        <w:t xml:space="preserve">(j) Manifeste de fret</w:t>
+      </w:r>
+      <w:r>
+        <w:t xml:space="preserve"> </w:t>
+      </w:r>
+      <w:r>
+        <w:rPr>
+          <w:i/>
+          <w:iCs/>
+        </w:rPr>
+        <w:t xml:space="preserve">(`j_manifeste_fret`)</w:t>
+      </w:r>
+      <w:r>
+        <w:t xml:space="preserve"> — mouvements de vaisseaux et équipages de passage (</w:t>
+      </w:r>
+      <w:r>
+        <w:rPr>
+          <w:i/>
+          <w:iCs/>
+        </w:rPr>
+        <w:t xml:space="preserve">Widowmaker</w:t>
+      </w:r>
+      <w:r>
+        <w:t xml:space="preserve">, </w:t>
+      </w:r>
+      <w:r>
+        <w:rPr>
+          <w:i/>
+          <w:iCs/>
+        </w:rPr>
+        <w:t xml:space="preserve">Bacta Express</w:t>
+      </w:r>
+      <w:r>
+        <w:t xml:space="preserve">…). </w:t>
+      </w:r>
+      <w:r>
+        <w:rPr>
+          <w:b/>
+          <w:bCs/>
+        </w:rPr>
+        <w:t xml:space="preserve">Où :</w:t>
+      </w:r>
+      <w:r>
+        <w:t xml:space="preserve"> zone de fret / capitainerie.</w:t>
       </w:r>
     </w:p>
     <w:p>
@@ -6135,7 +6524,7 @@
           <w:sz w:val="19"/>
           <w:szCs w:val="19"/>
         </w:rPr>
-        <w:t xml:space="preserve">Éléments-clés — LE JOURNAL (document d)</w:t>
+        <w:t xml:space="preserve">Éléments-clés — LE JOURNAL-TRÉSOR</w:t>
       </w:r>
     </w:p>
     <w:p>
@@ -7813,7 +8202,17 @@
         <w:jc w:val="both"/>
       </w:pPr>
       <w:r>
-        <w:t xml:space="preserve">Les données du journal (document d) sont sur le </w:t>
+        <w:t xml:space="preserve">Les données du </w:t>
+      </w:r>
+      <w:r>
+        <w:rPr>
+          <w:b/>
+          <w:bCs/>
+        </w:rPr>
+        <w:t xml:space="preserve">journal-trésor</w:t>
+      </w:r>
+      <w:r>
+        <w:t xml:space="preserve"> sont sur le </w:t>
       </w:r>
       <w:r>
         <w:rPr>

</xml_diff>

<commit_message>
TODO #8 & #9 — Front-matter + fiche-solution
#8 : encarts « En bref » (système visions de légendes, 3-6 joueurs, ~3-4 h,
ton space opera, pitch) et « À lire aux joueurs » (accroche prête à lire,
le Courtier + arrivée du Murmure) en tête de la Présentation.
#9 : encart « Fiche-solution — la chaîne d'un coup d'œil » (a/b/c/d -> clés ->
résultat) + trim léger du pitch.

Co-Authored-By: Claude Opus 4.8 <noreply@anthropic.com>
</commit_message>
<xml_diff>
--- a/star-wars/scenarios/birth-of-the-death-squadron/docs/scenario_signal_detresse_FUSION.docx
+++ b/star-wars/scenarios/birth-of-the-death-squadron/docs/scenario_signal_detresse_FUSION.docx
@@ -172,148 +172,6 @@
       </w:pPr>
       <w:r>
         <w:t xml:space="preserve">1. Présentation</w:t>
-      </w:r>
-    </w:p>
-    <w:p>
-      <w:pPr>
-        <w:pStyle w:val="Heading2"/>
-      </w:pPr>
-      <w:r>
-        <w:t xml:space="preserve">Le pitch</w:t>
-      </w:r>
-    </w:p>
-    <w:p>
-      <w:pPr>
-        <w:spacing w:after="120" w:line="264"/>
-        <w:jc w:val="both"/>
-      </w:pPr>
-      <w:r>
-        <w:t xml:space="preserve">Un signal de détresse chiffré a fini par atteindre les personnages-joueurs. Il ne vient pas d'un vaisseau en perte de puissance, mais d'une femme qui sait quelque chose que l'Empire tuerait pour enterrer. Sur une petite station-relais oubliée en bordure du secteur de Kessel, une technicienne du nom de </w:t>
-      </w:r>
-      <w:r>
-        <w:rPr>
-          <w:b/>
-          <w:bCs/>
-        </w:rPr>
-        <w:t xml:space="preserve">Tana Wrey</w:t>
-      </w:r>
-      <w:r>
-        <w:t xml:space="preserve"> a intercepté, quart après quart, les fragments d'une opération militaire de très grande ampleur : le </w:t>
-      </w:r>
-      <w:r>
-        <w:rPr>
-          <w:b/>
-          <w:bCs/>
-        </w:rPr>
-        <w:t xml:space="preserve">Projet Faucheur</w:t>
-      </w:r>
-      <w:r>
-        <w:t xml:space="preserve">.</w:t>
-      </w:r>
-    </w:p>
-    <w:p>
-      <w:pPr>
-        <w:spacing w:after="120" w:line="264"/>
-        <w:jc w:val="both"/>
-      </w:pPr>
-      <w:r>
-        <w:t xml:space="preserve">Traquée par ses propres soupçons autant que par ceux de son supérieur, Tana s'est effacée derrière un alias — </w:t>
-      </w:r>
-      <w:r>
-        <w:rPr>
-          <w:b/>
-          <w:bCs/>
-        </w:rPr>
-        <w:t xml:space="preserve">Doiron</w:t>
-      </w:r>
-      <w:r>
-        <w:t xml:space="preserve">, tenancière d'une modeste échoppe du quai. Elle a dispersé aux quatre coins de la station les clés qui permettent de lire ce qu'elle a caché, de sorte que personne — pas même elle — ne puisse tout livrer sous la contrainte. Les PJ devront gagner sa confiance, reconstituer ces clés en résolvant quatre énigmes physiques, et exfiltrer l'information </w:t>
-      </w:r>
-      <w:r>
-        <w:rPr>
-          <w:b/>
-          <w:bCs/>
-        </w:rPr>
-        <w:t xml:space="preserve">avant</w:t>
-      </w:r>
-      <w:r>
-        <w:t xml:space="preserve"> qu'une équipe du Bureau de Sécurité Impériale (ISB), déjà en route, ne remonte la trace du signal jusqu'à eux.</w:t>
-      </w:r>
-    </w:p>
-    <w:p>
-      <w:pPr>
-        <w:pStyle w:val="Heading2"/>
-      </w:pPr>
-      <w:r>
-        <w:t xml:space="preserve">Le contexte : le Projet Faucheur</w:t>
-      </w:r>
-    </w:p>
-    <w:p>
-      <w:pPr>
-        <w:spacing w:after="120" w:line="264"/>
-        <w:jc w:val="both"/>
-      </w:pPr>
-      <w:r>
-        <w:t xml:space="preserve">Ce que Tana a assemblé sans le vouloir, c'est le portrait en creux de la </w:t>
-      </w:r>
-      <w:r>
-        <w:rPr>
-          <w:b/>
-          <w:bCs/>
-        </w:rPr>
-        <w:t xml:space="preserve">naissance de l'Escadron de la Mort</w:t>
-      </w:r>
-      <w:r>
-        <w:t xml:space="preserve"> : la sortie de chantier d'un bâtiment « hors normes, aucune désignation officielle » en orbite de </w:t>
-      </w:r>
-      <w:r>
-        <w:rPr>
-          <w:b/>
-          <w:bCs/>
-        </w:rPr>
-        <w:t xml:space="preserve">Fondor</w:t>
-      </w:r>
-      <w:r>
-        <w:t xml:space="preserve"> — le Super Destroyer Stellaire </w:t>
-      </w:r>
-      <w:r>
-        <w:rPr>
-          <w:i/>
-          <w:iCs/>
-        </w:rPr>
-        <w:t xml:space="preserve">Executor</w:t>
-      </w:r>
-      <w:r>
-        <w:t xml:space="preserve"> — et le déploiement d'une flotte chargée de ratisser méthodiquement une portion de la Bordure Extérieure à la recherche d'une </w:t>
-      </w:r>
-      <w:r>
-        <w:rPr>
-          <w:b/>
-          <w:bCs/>
-        </w:rPr>
-        <w:t xml:space="preserve">base dissidente</w:t>
-      </w:r>
-      <w:r>
-        <w:t xml:space="preserve">. Les entrées les plus récentes parlent d'une flotte « maintenue en position, prête à exécution sur ordre », puis d'un dernier fragment avant brouillage : </w:t>
-      </w:r>
-      <w:r>
-        <w:rPr>
-          <w:i/>
-          <w:iCs/>
-        </w:rPr>
-        <w:t xml:space="preserve">« …si confirmation reçue, exécution immédiate… »</w:t>
-      </w:r>
-      <w:r>
-        <w:t xml:space="preserve">.</w:t>
-      </w:r>
-    </w:p>
-    <w:p>
-      <w:pPr>
-        <w:spacing w:after="120" w:line="264"/>
-        <w:jc w:val="both"/>
-      </w:pPr>
-      <w:r>
-        <w:t xml:space="preserve">Autrement dit : les coordonnées cachées dans le journal de Tana pointent vers une cible que l'Empire s'apprête à frapper. Les PJ ne mettent pas seulement la main sur un secret — ils tiennent peut-être le seul avertissement capable de sauver une base entière.</w:t>
       </w:r>
     </w:p>
     <w:tbl>
@@ -355,16 +213,7 @@
                 <w:sz w:val="19"/>
                 <w:szCs w:val="19"/>
               </w:rPr>
-              <w:t xml:space="preserve">La station Kessel-Tho</w:t>
-            </w:r>
-          </w:p>
-          <w:p>
-            <w:pPr>
-              <w:spacing w:after="60" w:line="258"/>
-              <w:jc w:val="both"/>
-            </w:pPr>
-            <w:r>
-              <w:t xml:space="preserve">Station-relais de communication de la Bordure Extérieure, sur une route commerciale secondaire de Kessel. Cinq niveaux superposés :</w:t>
+              <w:t xml:space="preserve">En bref</w:t>
             </w:r>
           </w:p>
           <w:p>
@@ -381,10 +230,20 @@
                 <w:b/>
                 <w:bCs/>
               </w:rPr>
-              <w:t xml:space="preserve">N4</w:t>
-            </w:r>
-            <w:r>
-              <w:t xml:space="preserve"> — Communications</w:t>
+              <w:t xml:space="preserve">Système</w:t>
+            </w:r>
+            <w:r>
+              <w:t xml:space="preserve"> — Star Wars D6, variante </w:t>
+            </w:r>
+            <w:r>
+              <w:rPr>
+                <w:i/>
+                <w:iCs/>
+              </w:rPr>
+              <w:t xml:space="preserve">« visions de légendes »</w:t>
+            </w:r>
+            <w:r>
+              <w:t xml:space="preserve">.</w:t>
             </w:r>
           </w:p>
           <w:p>
@@ -401,10 +260,10 @@
                 <w:b/>
                 <w:bCs/>
               </w:rPr>
-              <w:t xml:space="preserve">N3</w:t>
-            </w:r>
-            <w:r>
-              <w:t xml:space="preserve"> — Administration &amp; sécurité</w:t>
+              <w:t xml:space="preserve">Joueurs</w:t>
+            </w:r>
+            <w:r>
+              <w:t xml:space="preserve"> — 3 à 6, avec les pré-tirés fournis (§3).</w:t>
             </w:r>
           </w:p>
           <w:p>
@@ -421,10 +280,10 @@
                 <w:b/>
                 <w:bCs/>
               </w:rPr>
-              <w:t xml:space="preserve">N2</w:t>
-            </w:r>
-            <w:r>
-              <w:t xml:space="preserve"> — Vie quotidienne</w:t>
+              <w:t xml:space="preserve">Durée</w:t>
+            </w:r>
+            <w:r>
+              <w:t xml:space="preserve"> — une session dense (~3-4 h) ; le casse ≈ la durée de la session.</w:t>
             </w:r>
           </w:p>
           <w:p>
@@ -441,10 +300,10 @@
                 <w:b/>
                 <w:bCs/>
               </w:rPr>
-              <w:t xml:space="preserve">N1</w:t>
-            </w:r>
-            <w:r>
-              <w:t xml:space="preserve"> — Amarrage &amp; commerce</w:t>
+              <w:t xml:space="preserve">Ton</w:t>
+            </w:r>
+            <w:r>
+              <w:t xml:space="preserve"> — space opera : enquête et infiltration feutrées, tension montante, final sous chrono.</w:t>
             </w:r>
           </w:p>
           <w:p>
@@ -461,19 +320,10 @@
                 <w:b/>
                 <w:bCs/>
               </w:rPr>
-              <w:t xml:space="preserve">N0</w:t>
-            </w:r>
-            <w:r>
-              <w:t xml:space="preserve"> — Soubassement technique</w:t>
-            </w:r>
-          </w:p>
-          <w:p>
-            <w:pPr>
-              <w:spacing w:after="60" w:line="258"/>
-              <w:jc w:val="both"/>
-            </w:pPr>
-            <w:r>
-              <w:t xml:space="preserve">Une colonne de sécurité blindée relie directement le commandement (N4/N3) au niveau technique (N0) sans traverser les niveaux civils.</w:t>
+              <w:t xml:space="preserve">Pitch</w:t>
+            </w:r>
+            <w:r>
+              <w:t xml:space="preserve"> — sur une station-relais impériale aux confins de Kessel, une réfugiée d'Alderaan a percé la naissance de l'Escadron de la Mort ; les PJ doivent extraire sa preuve avant l'ISB.</w:t>
             </w:r>
           </w:p>
         </w:tc>
@@ -483,263 +333,6 @@
       <w:pPr>
         <w:spacing w:after="80"/>
       </w:pPr>
-    </w:p>
-    <w:p>
-      <w:pPr>
-        <w:pStyle w:val="Heading2"/>
-      </w:pPr>
-      <w:r>
-        <w:t xml:space="preserve">Comment fonctionne l'enquête</w:t>
-      </w:r>
-    </w:p>
-    <w:p>
-      <w:pPr>
-        <w:spacing w:after="120" w:line="264"/>
-        <w:jc w:val="both"/>
-      </w:pPr>
-      <w:r>
-        <w:t xml:space="preserve">Le point de départ est la </w:t>
-      </w:r>
-      <w:r>
-        <w:rPr>
-          <w:b/>
-          <w:bCs/>
-        </w:rPr>
-        <w:t xml:space="preserve">boutique de Doiron</w:t>
-      </w:r>
-      <w:r>
-        <w:t xml:space="preserve"> (N1). Tana y a laissé un </w:t>
-      </w:r>
-      <w:r>
-        <w:rPr>
-          <w:b/>
-          <w:bCs/>
-        </w:rPr>
-        <w:t xml:space="preserve">message (0)</w:t>
-      </w:r>
-      <w:r>
-        <w:t xml:space="preserve"> — un datapad — qui, une fois consulté, oriente vers </w:t>
-      </w:r>
-      <w:r>
-        <w:rPr>
-          <w:b/>
-          <w:bCs/>
-        </w:rPr>
-        <w:t xml:space="preserve">quatre contacts</w:t>
-      </w:r>
-      <w:r>
-        <w:t xml:space="preserve">. Chaque contact garde, sans le savoir, l'un des quatre </w:t>
-      </w:r>
-      <w:r>
-        <w:rPr>
-          <w:b/>
-          <w:bCs/>
-        </w:rPr>
-        <w:t xml:space="preserve">indices</w:t>
-      </w:r>
-      <w:r>
-        <w:t xml:space="preserve"> physiques que Tana a dissimulés </w:t>
-      </w:r>
-      <w:r>
-        <w:rPr>
-          <w:i/>
-          <w:iCs/>
-        </w:rPr>
-        <w:t xml:space="preserve">(présentés ici dans l'ordre de visite le plus probable — l'ordre de résolution n'a pas d'importance mécanique)</w:t>
-      </w:r>
-      <w:r>
-        <w:t xml:space="preserve"> :</w:t>
-      </w:r>
-    </w:p>
-    <w:p>
-      <w:pPr>
-        <w:pStyle w:val="ListParagraph"/>
-        <w:numPr>
-          <w:ilvl w:val="0"/>
-          <w:numId w:val="2"/>
-        </w:numPr>
-        <w:spacing w:after="60" w:line="260"/>
-        <w:jc w:val="both"/>
-      </w:pPr>
-      <w:r>
-        <w:rPr>
-          <w:b/>
-          <w:bCs/>
-        </w:rPr>
-        <w:t xml:space="preserve">(a) Faux clients</w:t>
-      </w:r>
-      <w:r>
-        <w:t xml:space="preserve"> — Centre culturel (Maren Estil) : donne les </w:t>
-      </w:r>
-      <w:r>
-        <w:rPr>
-          <w:b/>
-          <w:bCs/>
-        </w:rPr>
-        <w:t xml:space="preserve">3 alias</w:t>
-      </w:r>
-      <w:r>
-        <w:t xml:space="preserve"> à cibler dans le journal-trésor.</w:t>
-      </w:r>
-    </w:p>
-    <w:p>
-      <w:pPr>
-        <w:pStyle w:val="ListParagraph"/>
-        <w:numPr>
-          <w:ilvl w:val="0"/>
-          <w:numId w:val="2"/>
-        </w:numPr>
-        <w:spacing w:after="60" w:line="260"/>
-        <w:jc w:val="both"/>
-      </w:pPr>
-      <w:r>
-        <w:rPr>
-          <w:b/>
-          <w:bCs/>
-        </w:rPr>
-        <w:t xml:space="preserve">(d) Annonces du mess</w:t>
-      </w:r>
-      <w:r>
-        <w:t xml:space="preserve"> — Mess (Kessa Droman) : clé maître </w:t>
-      </w:r>
-      <w:r>
-        <w:rPr>
-          <w:b/>
-          <w:bCs/>
-        </w:rPr>
-        <w:t xml:space="preserve">RépubliqueRetour</w:t>
-      </w:r>
-      <w:r>
-        <w:t xml:space="preserve"> + </w:t>
-      </w:r>
-      <w:r>
-        <w:rPr>
-          <w:b/>
-          <w:bCs/>
-        </w:rPr>
-        <w:t xml:space="preserve">Argon2</w:t>
-      </w:r>
-      <w:r>
-        <w:t xml:space="preserve">.</w:t>
-      </w:r>
-    </w:p>
-    <w:p>
-      <w:pPr>
-        <w:pStyle w:val="ListParagraph"/>
-        <w:numPr>
-          <w:ilvl w:val="0"/>
-          <w:numId w:val="2"/>
-        </w:numPr>
-        <w:spacing w:after="60" w:line="260"/>
-        <w:jc w:val="both"/>
-      </w:pPr>
-      <w:r>
-        <w:rPr>
-          <w:b/>
-          <w:bCs/>
-        </w:rPr>
-        <w:t xml:space="preserve">(b) Fresque</w:t>
-      </w:r>
-      <w:r>
-        <w:t xml:space="preserve"> — Galerie de maintenance (Dosh Kavarel) : phrase </w:t>
-      </w:r>
-      <w:r>
-        <w:rPr>
-          <w:b/>
-          <w:bCs/>
-        </w:rPr>
-        <w:t xml:space="preserve">ORPHELINS</w:t>
-      </w:r>
-      <w:r>
-        <w:t xml:space="preserve"> (clé des Coordonnées).</w:t>
-      </w:r>
-    </w:p>
-    <w:p>
-      <w:pPr>
-        <w:pStyle w:val="ListParagraph"/>
-        <w:numPr>
-          <w:ilvl w:val="0"/>
-          <w:numId w:val="2"/>
-        </w:numPr>
-        <w:spacing w:after="60" w:line="260"/>
-        <w:jc w:val="both"/>
-      </w:pPr>
-      <w:r>
-        <w:rPr>
-          <w:b/>
-          <w:bCs/>
-        </w:rPr>
-        <w:t xml:space="preserve">(c) Pentaminos</w:t>
-      </w:r>
-      <w:r>
-        <w:t xml:space="preserve"> — Centre sportif (Grash Meloi) : phrase </w:t>
-      </w:r>
-      <w:r>
-        <w:rPr>
-          <w:b/>
-          <w:bCs/>
-        </w:rPr>
-        <w:t xml:space="preserve">JENESUISPLUSSEULEICI</w:t>
-      </w:r>
-      <w:r>
-        <w:t xml:space="preserve"> (clé des Messages).</w:t>
-      </w:r>
-    </w:p>
-    <w:p>
-      <w:pPr>
-        <w:spacing w:after="120" w:line="264"/>
-        <w:jc w:val="both"/>
-      </w:pPr>
-      <w:r>
-        <w:t xml:space="preserve">Une fois les paramètres réunis, c'est le droïde </w:t>
-      </w:r>
-      <w:r>
-        <w:rPr>
-          <w:b/>
-          <w:bCs/>
-        </w:rPr>
-        <w:t xml:space="preserve">Bafouille</w:t>
-      </w:r>
-      <w:r>
-        <w:t xml:space="preserve"> qui effectue les calculs et restitue en clair les </w:t>
-      </w:r>
-      <w:r>
-        <w:rPr>
-          <w:b/>
-          <w:bCs/>
-        </w:rPr>
-        <w:t xml:space="preserve">18 entrées</w:t>
-      </w:r>
-      <w:r>
-        <w:t xml:space="preserve"> cachées de Tana parmi les 78 lignes du </w:t>
-      </w:r>
-      <w:r>
-        <w:rPr>
-          <w:b/>
-          <w:bCs/>
-        </w:rPr>
-        <w:t xml:space="preserve">journal-trésor</w:t>
-      </w:r>
-      <w:r>
-        <w:t xml:space="preserve">, isolé dans la </w:t>
-      </w:r>
-      <w:r>
-        <w:rPr>
-          <w:b/>
-          <w:bCs/>
-        </w:rPr>
-        <w:t xml:space="preserve">DMZ</w:t>
-      </w:r>
-      <w:r>
-        <w:t xml:space="preserve"> du niveau 0. </w:t>
-      </w:r>
-      <w:r>
-        <w:rPr>
-          <w:i/>
-          <w:iCs/>
-        </w:rPr>
-        <w:t xml:space="preserve">Le jeu, c'est la résolution des énigmes — pas la cryptographie : les joueurs fournissent les paramètres, Bafouille calcule.</w:t>
-      </w:r>
     </w:p>
     <w:tbl>
       <w:tblPr>
@@ -780,7 +373,7 @@
                 <w:sz w:val="19"/>
                 <w:szCs w:val="19"/>
               </w:rPr>
-              <w:t xml:space="preserve">Convention de nommage</w:t>
+              <w:t xml:space="preserve">À lire aux joueurs — l'accroche</w:t>
             </w:r>
           </w:p>
           <w:p>
@@ -789,6 +382,646 @@
               <w:jc w:val="both"/>
             </w:pPr>
             <w:r>
+              <w:rPr>
+                <w:i/>
+                <w:iCs/>
+              </w:rPr>
+              <w:t xml:space="preserve">Depuis des semaines, une annonce codée tourne sur un canal privé du secteur Kessel. Un intermédiaire — le Courtier — vous l'a fait suivre : sous la brocante banale, une ligne sur deux hurle un avertissement. « Le Faucheur est de sortie. » Quelqu'un, sur une station-relais impériale perdue aux confins de Kessel, sait ce que l'Empire tuerait pour enterrer — et vous supplie de faire vite. Votre cargo, le Murmure, sort de l'hyperespace en vue de Kessel-Tho. L'horloge tourne déjà.</w:t>
+            </w:r>
+          </w:p>
+        </w:tc>
+      </w:tr>
+    </w:tbl>
+    <w:p>
+      <w:pPr>
+        <w:spacing w:after="80"/>
+      </w:pPr>
+    </w:p>
+    <w:p>
+      <w:pPr>
+        <w:pStyle w:val="Heading2"/>
+      </w:pPr>
+      <w:r>
+        <w:t xml:space="preserve">Le pitch</w:t>
+      </w:r>
+    </w:p>
+    <w:p>
+      <w:pPr>
+        <w:spacing w:after="120" w:line="264"/>
+        <w:jc w:val="both"/>
+      </w:pPr>
+      <w:r>
+        <w:t xml:space="preserve">Un signal de détresse chiffré a fini par atteindre les personnages-joueurs. Il ne vient pas d'un vaisseau en perte de puissance, mais d'une femme qui sait quelque chose que l'Empire tuerait pour enterrer. Sur une petite station-relais oubliée en bordure du secteur de Kessel, une technicienne du nom de </w:t>
+      </w:r>
+      <w:r>
+        <w:rPr>
+          <w:b/>
+          <w:bCs/>
+        </w:rPr>
+        <w:t xml:space="preserve">Tana Wrey</w:t>
+      </w:r>
+      <w:r>
+        <w:t xml:space="preserve"> a intercepté, quart après quart, les fragments d'une opération militaire de très grande ampleur : le </w:t>
+      </w:r>
+      <w:r>
+        <w:rPr>
+          <w:b/>
+          <w:bCs/>
+        </w:rPr>
+        <w:t xml:space="preserve">Projet Faucheur</w:t>
+      </w:r>
+      <w:r>
+        <w:t xml:space="preserve">.</w:t>
+      </w:r>
+    </w:p>
+    <w:p>
+      <w:pPr>
+        <w:spacing w:after="120" w:line="264"/>
+        <w:jc w:val="both"/>
+      </w:pPr>
+      <w:r>
+        <w:t xml:space="preserve">Traquée par les soupçons de son supérieur, Tana s'est effacée derrière un alias — </w:t>
+      </w:r>
+      <w:r>
+        <w:rPr>
+          <w:b/>
+          <w:bCs/>
+        </w:rPr>
+        <w:t xml:space="preserve">Doiron</w:t>
+      </w:r>
+      <w:r>
+        <w:t xml:space="preserve">, marchande du quai. Elle a dispersé aux quatre coins de la station les clés de ce qu'elle a caché : personne — pas même elle — ne peut tout livrer sous la contrainte. Aux PJ de gagner sa confiance, de reconstituer ces clés (quatre énigmes physiques) et d'exfiltrer l'information </w:t>
+      </w:r>
+      <w:r>
+        <w:rPr>
+          <w:b/>
+          <w:bCs/>
+        </w:rPr>
+        <w:t xml:space="preserve">avant</w:t>
+      </w:r>
+      <w:r>
+        <w:t xml:space="preserve"> qu'une équipe du </w:t>
+      </w:r>
+      <w:r>
+        <w:rPr>
+          <w:b/>
+          <w:bCs/>
+        </w:rPr>
+        <w:t xml:space="preserve">Bureau de Sécurité Impériale (ISB)</w:t>
+      </w:r>
+      <w:r>
+        <w:t xml:space="preserve">, déjà en route, ne remonte jusqu'à eux.</w:t>
+      </w:r>
+    </w:p>
+    <w:p>
+      <w:pPr>
+        <w:pStyle w:val="Heading2"/>
+      </w:pPr>
+      <w:r>
+        <w:t xml:space="preserve">Le contexte : le Projet Faucheur</w:t>
+      </w:r>
+    </w:p>
+    <w:p>
+      <w:pPr>
+        <w:spacing w:after="120" w:line="264"/>
+        <w:jc w:val="both"/>
+      </w:pPr>
+      <w:r>
+        <w:t xml:space="preserve">Ce que Tana a assemblé sans le vouloir, c'est le portrait en creux de la </w:t>
+      </w:r>
+      <w:r>
+        <w:rPr>
+          <w:b/>
+          <w:bCs/>
+        </w:rPr>
+        <w:t xml:space="preserve">naissance de l'Escadron de la Mort</w:t>
+      </w:r>
+      <w:r>
+        <w:t xml:space="preserve"> : la sortie de chantier d'un bâtiment « hors normes, aucune désignation officielle » en orbite de </w:t>
+      </w:r>
+      <w:r>
+        <w:rPr>
+          <w:b/>
+          <w:bCs/>
+        </w:rPr>
+        <w:t xml:space="preserve">Fondor</w:t>
+      </w:r>
+      <w:r>
+        <w:t xml:space="preserve"> — le Super Destroyer Stellaire </w:t>
+      </w:r>
+      <w:r>
+        <w:rPr>
+          <w:i/>
+          <w:iCs/>
+        </w:rPr>
+        <w:t xml:space="preserve">Executor</w:t>
+      </w:r>
+      <w:r>
+        <w:t xml:space="preserve"> — et le déploiement d'une flotte chargée de ratisser méthodiquement une portion de la Bordure Extérieure à la recherche d'une </w:t>
+      </w:r>
+      <w:r>
+        <w:rPr>
+          <w:b/>
+          <w:bCs/>
+        </w:rPr>
+        <w:t xml:space="preserve">base dissidente</w:t>
+      </w:r>
+      <w:r>
+        <w:t xml:space="preserve">. Les entrées les plus récentes parlent d'une flotte « maintenue en position, prête à exécution sur ordre », puis d'un dernier fragment avant brouillage : </w:t>
+      </w:r>
+      <w:r>
+        <w:rPr>
+          <w:i/>
+          <w:iCs/>
+        </w:rPr>
+        <w:t xml:space="preserve">« …si confirmation reçue, exécution immédiate… »</w:t>
+      </w:r>
+      <w:r>
+        <w:t xml:space="preserve">.</w:t>
+      </w:r>
+    </w:p>
+    <w:p>
+      <w:pPr>
+        <w:spacing w:after="120" w:line="264"/>
+        <w:jc w:val="both"/>
+      </w:pPr>
+      <w:r>
+        <w:t xml:space="preserve">Autrement dit : les coordonnées cachées dans le journal de Tana pointent vers une cible que l'Empire s'apprête à frapper. Les PJ ne mettent pas seulement la main sur un secret — ils tiennent peut-être le seul avertissement capable de sauver une base entière.</w:t>
+      </w:r>
+    </w:p>
+    <w:tbl>
+      <w:tblPr>
+        <w:tblW w:type="dxa" w:w="4592"/>
+        <w:tblBorders>
+          <w:top w:val="single" w:color="D8D2BE" w:sz="4"/>
+          <w:left w:val="single" w:color="8A1C1C" w:sz="28"/>
+          <w:bottom w:val="single" w:color="D8D2BE" w:sz="4"/>
+          <w:right w:val="single" w:color="D8D2BE" w:sz="4"/>
+          <w:insideH w:val="none"/>
+          <w:insideV w:val="none"/>
+        </w:tblBorders>
+      </w:tblPr>
+      <w:tblGrid>
+        <w:gridCol w:w="4592"/>
+      </w:tblGrid>
+      <w:tr>
+        <w:tc>
+          <w:tcPr>
+            <w:tcW w:type="dxa" w:w="4592"/>
+            <w:shd w:fill="F4F1E8" w:color="auto" w:val="clear"/>
+            <w:tcMar>
+              <w:top w:type="dxa" w:w="100"/>
+              <w:left w:type="dxa" w:w="160"/>
+              <w:bottom w:type="dxa" w:w="100"/>
+              <w:right w:type="dxa" w:w="140"/>
+            </w:tcMar>
+          </w:tcPr>
+          <w:p>
+            <w:pPr>
+              <w:spacing w:after="80"/>
+            </w:pPr>
+            <w:r>
+              <w:rPr>
+                <w:b/>
+                <w:bCs/>
+                <w:color w:val="8A1C1C"/>
+                <w:sz w:val="19"/>
+                <w:szCs w:val="19"/>
+              </w:rPr>
+              <w:t xml:space="preserve">La station Kessel-Tho</w:t>
+            </w:r>
+          </w:p>
+          <w:p>
+            <w:pPr>
+              <w:spacing w:after="60" w:line="258"/>
+              <w:jc w:val="both"/>
+            </w:pPr>
+            <w:r>
+              <w:t xml:space="preserve">Station-relais de communication de la Bordure Extérieure, sur une route commerciale secondaire de Kessel. Cinq niveaux superposés :</w:t>
+            </w:r>
+          </w:p>
+          <w:p>
+            <w:pPr>
+              <w:pStyle w:val="ListParagraph"/>
+              <w:numPr>
+                <w:ilvl w:val="0"/>
+                <w:numId w:val="2"/>
+              </w:numPr>
+              <w:spacing w:after="40" w:line="252"/>
+            </w:pPr>
+            <w:r>
+              <w:rPr>
+                <w:b/>
+                <w:bCs/>
+              </w:rPr>
+              <w:t xml:space="preserve">N4</w:t>
+            </w:r>
+            <w:r>
+              <w:t xml:space="preserve"> — Communications</w:t>
+            </w:r>
+          </w:p>
+          <w:p>
+            <w:pPr>
+              <w:pStyle w:val="ListParagraph"/>
+              <w:numPr>
+                <w:ilvl w:val="0"/>
+                <w:numId w:val="2"/>
+              </w:numPr>
+              <w:spacing w:after="40" w:line="252"/>
+            </w:pPr>
+            <w:r>
+              <w:rPr>
+                <w:b/>
+                <w:bCs/>
+              </w:rPr>
+              <w:t xml:space="preserve">N3</w:t>
+            </w:r>
+            <w:r>
+              <w:t xml:space="preserve"> — Administration &amp; sécurité</w:t>
+            </w:r>
+          </w:p>
+          <w:p>
+            <w:pPr>
+              <w:pStyle w:val="ListParagraph"/>
+              <w:numPr>
+                <w:ilvl w:val="0"/>
+                <w:numId w:val="2"/>
+              </w:numPr>
+              <w:spacing w:after="40" w:line="252"/>
+            </w:pPr>
+            <w:r>
+              <w:rPr>
+                <w:b/>
+                <w:bCs/>
+              </w:rPr>
+              <w:t xml:space="preserve">N2</w:t>
+            </w:r>
+            <w:r>
+              <w:t xml:space="preserve"> — Vie quotidienne</w:t>
+            </w:r>
+          </w:p>
+          <w:p>
+            <w:pPr>
+              <w:pStyle w:val="ListParagraph"/>
+              <w:numPr>
+                <w:ilvl w:val="0"/>
+                <w:numId w:val="2"/>
+              </w:numPr>
+              <w:spacing w:after="40" w:line="252"/>
+            </w:pPr>
+            <w:r>
+              <w:rPr>
+                <w:b/>
+                <w:bCs/>
+              </w:rPr>
+              <w:t xml:space="preserve">N1</w:t>
+            </w:r>
+            <w:r>
+              <w:t xml:space="preserve"> — Amarrage &amp; commerce</w:t>
+            </w:r>
+          </w:p>
+          <w:p>
+            <w:pPr>
+              <w:pStyle w:val="ListParagraph"/>
+              <w:numPr>
+                <w:ilvl w:val="0"/>
+                <w:numId w:val="2"/>
+              </w:numPr>
+              <w:spacing w:after="40" w:line="252"/>
+            </w:pPr>
+            <w:r>
+              <w:rPr>
+                <w:b/>
+                <w:bCs/>
+              </w:rPr>
+              <w:t xml:space="preserve">N0</w:t>
+            </w:r>
+            <w:r>
+              <w:t xml:space="preserve"> — Soubassement technique</w:t>
+            </w:r>
+          </w:p>
+          <w:p>
+            <w:pPr>
+              <w:spacing w:after="60" w:line="258"/>
+              <w:jc w:val="both"/>
+            </w:pPr>
+            <w:r>
+              <w:t xml:space="preserve">Une colonne de sécurité blindée relie directement le commandement (N4/N3) au niveau technique (N0) sans traverser les niveaux civils.</w:t>
+            </w:r>
+          </w:p>
+        </w:tc>
+      </w:tr>
+    </w:tbl>
+    <w:p>
+      <w:pPr>
+        <w:spacing w:after="80"/>
+      </w:pPr>
+    </w:p>
+    <w:p>
+      <w:pPr>
+        <w:pStyle w:val="Heading2"/>
+      </w:pPr>
+      <w:r>
+        <w:t xml:space="preserve">Comment fonctionne l'enquête</w:t>
+      </w:r>
+    </w:p>
+    <w:p>
+      <w:pPr>
+        <w:spacing w:after="120" w:line="264"/>
+        <w:jc w:val="both"/>
+      </w:pPr>
+      <w:r>
+        <w:t xml:space="preserve">Le point de départ est la </w:t>
+      </w:r>
+      <w:r>
+        <w:rPr>
+          <w:b/>
+          <w:bCs/>
+        </w:rPr>
+        <w:t xml:space="preserve">boutique de Doiron</w:t>
+      </w:r>
+      <w:r>
+        <w:t xml:space="preserve"> (N1). Tana y a laissé un </w:t>
+      </w:r>
+      <w:r>
+        <w:rPr>
+          <w:b/>
+          <w:bCs/>
+        </w:rPr>
+        <w:t xml:space="preserve">message (0)</w:t>
+      </w:r>
+      <w:r>
+        <w:t xml:space="preserve"> — un datapad — qui, une fois consulté, oriente vers </w:t>
+      </w:r>
+      <w:r>
+        <w:rPr>
+          <w:b/>
+          <w:bCs/>
+        </w:rPr>
+        <w:t xml:space="preserve">quatre contacts</w:t>
+      </w:r>
+      <w:r>
+        <w:t xml:space="preserve">. Chaque contact garde, sans le savoir, l'un des quatre </w:t>
+      </w:r>
+      <w:r>
+        <w:rPr>
+          <w:b/>
+          <w:bCs/>
+        </w:rPr>
+        <w:t xml:space="preserve">indices</w:t>
+      </w:r>
+      <w:r>
+        <w:t xml:space="preserve"> physiques que Tana a dissimulés </w:t>
+      </w:r>
+      <w:r>
+        <w:rPr>
+          <w:i/>
+          <w:iCs/>
+        </w:rPr>
+        <w:t xml:space="preserve">(présentés ici dans l'ordre de visite le plus probable — l'ordre de résolution n'a pas d'importance mécanique)</w:t>
+      </w:r>
+      <w:r>
+        <w:t xml:space="preserve"> :</w:t>
+      </w:r>
+    </w:p>
+    <w:p>
+      <w:pPr>
+        <w:pStyle w:val="ListParagraph"/>
+        <w:numPr>
+          <w:ilvl w:val="0"/>
+          <w:numId w:val="2"/>
+        </w:numPr>
+        <w:spacing w:after="60" w:line="260"/>
+        <w:jc w:val="both"/>
+      </w:pPr>
+      <w:r>
+        <w:rPr>
+          <w:b/>
+          <w:bCs/>
+        </w:rPr>
+        <w:t xml:space="preserve">(a) Faux clients</w:t>
+      </w:r>
+      <w:r>
+        <w:t xml:space="preserve"> — Centre culturel (Maren Estil) : donne les </w:t>
+      </w:r>
+      <w:r>
+        <w:rPr>
+          <w:b/>
+          <w:bCs/>
+        </w:rPr>
+        <w:t xml:space="preserve">3 alias</w:t>
+      </w:r>
+      <w:r>
+        <w:t xml:space="preserve"> à cibler dans le journal-trésor.</w:t>
+      </w:r>
+    </w:p>
+    <w:p>
+      <w:pPr>
+        <w:pStyle w:val="ListParagraph"/>
+        <w:numPr>
+          <w:ilvl w:val="0"/>
+          <w:numId w:val="2"/>
+        </w:numPr>
+        <w:spacing w:after="60" w:line="260"/>
+        <w:jc w:val="both"/>
+      </w:pPr>
+      <w:r>
+        <w:rPr>
+          <w:b/>
+          <w:bCs/>
+        </w:rPr>
+        <w:t xml:space="preserve">(d) Annonces du mess</w:t>
+      </w:r>
+      <w:r>
+        <w:t xml:space="preserve"> — Mess (Kessa Droman) : clé maître </w:t>
+      </w:r>
+      <w:r>
+        <w:rPr>
+          <w:b/>
+          <w:bCs/>
+        </w:rPr>
+        <w:t xml:space="preserve">RépubliqueRetour</w:t>
+      </w:r>
+      <w:r>
+        <w:t xml:space="preserve"> + </w:t>
+      </w:r>
+      <w:r>
+        <w:rPr>
+          <w:b/>
+          <w:bCs/>
+        </w:rPr>
+        <w:t xml:space="preserve">Argon2</w:t>
+      </w:r>
+      <w:r>
+        <w:t xml:space="preserve">.</w:t>
+      </w:r>
+    </w:p>
+    <w:p>
+      <w:pPr>
+        <w:pStyle w:val="ListParagraph"/>
+        <w:numPr>
+          <w:ilvl w:val="0"/>
+          <w:numId w:val="2"/>
+        </w:numPr>
+        <w:spacing w:after="60" w:line="260"/>
+        <w:jc w:val="both"/>
+      </w:pPr>
+      <w:r>
+        <w:rPr>
+          <w:b/>
+          <w:bCs/>
+        </w:rPr>
+        <w:t xml:space="preserve">(b) Fresque</w:t>
+      </w:r>
+      <w:r>
+        <w:t xml:space="preserve"> — Galerie de maintenance (Dosh Kavarel) : phrase </w:t>
+      </w:r>
+      <w:r>
+        <w:rPr>
+          <w:b/>
+          <w:bCs/>
+        </w:rPr>
+        <w:t xml:space="preserve">ORPHELINS</w:t>
+      </w:r>
+      <w:r>
+        <w:t xml:space="preserve"> (clé des Coordonnées).</w:t>
+      </w:r>
+    </w:p>
+    <w:p>
+      <w:pPr>
+        <w:pStyle w:val="ListParagraph"/>
+        <w:numPr>
+          <w:ilvl w:val="0"/>
+          <w:numId w:val="2"/>
+        </w:numPr>
+        <w:spacing w:after="60" w:line="260"/>
+        <w:jc w:val="both"/>
+      </w:pPr>
+      <w:r>
+        <w:rPr>
+          <w:b/>
+          <w:bCs/>
+        </w:rPr>
+        <w:t xml:space="preserve">(c) Pentaminos</w:t>
+      </w:r>
+      <w:r>
+        <w:t xml:space="preserve"> — Centre sportif (Grash Meloi) : phrase </w:t>
+      </w:r>
+      <w:r>
+        <w:rPr>
+          <w:b/>
+          <w:bCs/>
+        </w:rPr>
+        <w:t xml:space="preserve">JENESUISPLUSSEULEICI</w:t>
+      </w:r>
+      <w:r>
+        <w:t xml:space="preserve"> (clé des Messages).</w:t>
+      </w:r>
+    </w:p>
+    <w:p>
+      <w:pPr>
+        <w:spacing w:after="120" w:line="264"/>
+        <w:jc w:val="both"/>
+      </w:pPr>
+      <w:r>
+        <w:t xml:space="preserve">Une fois les paramètres réunis, c'est le droïde </w:t>
+      </w:r>
+      <w:r>
+        <w:rPr>
+          <w:b/>
+          <w:bCs/>
+        </w:rPr>
+        <w:t xml:space="preserve">Bafouille</w:t>
+      </w:r>
+      <w:r>
+        <w:t xml:space="preserve"> qui effectue les calculs et restitue en clair les </w:t>
+      </w:r>
+      <w:r>
+        <w:rPr>
+          <w:b/>
+          <w:bCs/>
+        </w:rPr>
+        <w:t xml:space="preserve">18 entrées</w:t>
+      </w:r>
+      <w:r>
+        <w:t xml:space="preserve"> cachées de Tana parmi les 78 lignes du </w:t>
+      </w:r>
+      <w:r>
+        <w:rPr>
+          <w:b/>
+          <w:bCs/>
+        </w:rPr>
+        <w:t xml:space="preserve">journal-trésor</w:t>
+      </w:r>
+      <w:r>
+        <w:t xml:space="preserve">, isolé dans la </w:t>
+      </w:r>
+      <w:r>
+        <w:rPr>
+          <w:b/>
+          <w:bCs/>
+        </w:rPr>
+        <w:t xml:space="preserve">DMZ</w:t>
+      </w:r>
+      <w:r>
+        <w:t xml:space="preserve"> du niveau 0. </w:t>
+      </w:r>
+      <w:r>
+        <w:rPr>
+          <w:i/>
+          <w:iCs/>
+        </w:rPr>
+        <w:t xml:space="preserve">Le jeu, c'est la résolution des énigmes — pas la cryptographie : les joueurs fournissent les paramètres, Bafouille calcule.</w:t>
+      </w:r>
+    </w:p>
+    <w:tbl>
+      <w:tblPr>
+        <w:tblW w:type="dxa" w:w="4592"/>
+        <w:tblBorders>
+          <w:top w:val="single" w:color="D8D2BE" w:sz="4"/>
+          <w:left w:val="single" w:color="8A1C1C" w:sz="28"/>
+          <w:bottom w:val="single" w:color="D8D2BE" w:sz="4"/>
+          <w:right w:val="single" w:color="D8D2BE" w:sz="4"/>
+          <w:insideH w:val="none"/>
+          <w:insideV w:val="none"/>
+        </w:tblBorders>
+      </w:tblPr>
+      <w:tblGrid>
+        <w:gridCol w:w="4592"/>
+      </w:tblGrid>
+      <w:tr>
+        <w:tc>
+          <w:tcPr>
+            <w:tcW w:type="dxa" w:w="4592"/>
+            <w:shd w:fill="F4F1E8" w:color="auto" w:val="clear"/>
+            <w:tcMar>
+              <w:top w:type="dxa" w:w="100"/>
+              <w:left w:type="dxa" w:w="160"/>
+              <w:bottom w:type="dxa" w:w="100"/>
+              <w:right w:type="dxa" w:w="140"/>
+            </w:tcMar>
+          </w:tcPr>
+          <w:p>
+            <w:pPr>
+              <w:spacing w:after="80"/>
+            </w:pPr>
+            <w:r>
+              <w:rPr>
+                <w:b/>
+                <w:bCs/>
+                <w:color w:val="8A1C1C"/>
+                <w:sz w:val="19"/>
+                <w:szCs w:val="19"/>
+              </w:rPr>
+              <w:t xml:space="preserve">Convention de nommage</w:t>
+            </w:r>
+          </w:p>
+          <w:p>
+            <w:pPr>
+              <w:spacing w:after="60" w:line="258"/>
+              <w:jc w:val="both"/>
+            </w:pPr>
+            <w:r>
               <w:t xml:space="preserve">Les </w:t>
             </w:r>
             <w:r>
@@ -831,6 +1064,296 @@
             </w:r>
             <w:r>
               <w:t xml:space="preserve">), jamais « (d) ». Dans les sources, la lettre d de l'énigme du mess et celle du handout du journal coïncident par hasard — ce document lève l'ambiguïté en nommant le trésor par son nom.</w:t>
+            </w:r>
+          </w:p>
+        </w:tc>
+      </w:tr>
+    </w:tbl>
+    <w:p>
+      <w:pPr>
+        <w:spacing w:after="80"/>
+      </w:pPr>
+    </w:p>
+    <w:tbl>
+      <w:tblPr>
+        <w:tblW w:type="dxa" w:w="4592"/>
+        <w:tblBorders>
+          <w:top w:val="single" w:color="D8D2BE" w:sz="4"/>
+          <w:left w:val="single" w:color="8A1C1C" w:sz="28"/>
+          <w:bottom w:val="single" w:color="D8D2BE" w:sz="4"/>
+          <w:right w:val="single" w:color="D8D2BE" w:sz="4"/>
+          <w:insideH w:val="none"/>
+          <w:insideV w:val="none"/>
+        </w:tblBorders>
+      </w:tblPr>
+      <w:tblGrid>
+        <w:gridCol w:w="4592"/>
+      </w:tblGrid>
+      <w:tr>
+        <w:tc>
+          <w:tcPr>
+            <w:tcW w:type="dxa" w:w="4592"/>
+            <w:shd w:fill="F4F1E8" w:color="auto" w:val="clear"/>
+            <w:tcMar>
+              <w:top w:type="dxa" w:w="100"/>
+              <w:left w:type="dxa" w:w="160"/>
+              <w:bottom w:type="dxa" w:w="100"/>
+              <w:right w:type="dxa" w:w="140"/>
+            </w:tcMar>
+          </w:tcPr>
+          <w:p>
+            <w:pPr>
+              <w:spacing w:after="80"/>
+            </w:pPr>
+            <w:r>
+              <w:rPr>
+                <w:b/>
+                <w:bCs/>
+                <w:color w:val="8A1C1C"/>
+                <w:sz w:val="19"/>
+                <w:szCs w:val="19"/>
+              </w:rPr>
+              <w:t xml:space="preserve">Fiche-solution — la chaîne d'un coup d'œil (MJ)</w:t>
+            </w:r>
+          </w:p>
+          <w:p>
+            <w:pPr>
+              <w:pStyle w:val="ListParagraph"/>
+              <w:numPr>
+                <w:ilvl w:val="0"/>
+                <w:numId w:val="2"/>
+              </w:numPr>
+              <w:spacing w:after="40" w:line="252"/>
+            </w:pPr>
+            <w:r>
+              <w:rPr>
+                <w:b/>
+                <w:bCs/>
+              </w:rPr>
+              <w:t xml:space="preserve">(a)</w:t>
+            </w:r>
+            <w:r>
+              <w:t xml:space="preserve"> Centre culturel → 3 alias : </w:t>
+            </w:r>
+            <w:r>
+              <w:rPr>
+                <w:i/>
+                <w:iCs/>
+              </w:rPr>
+              <w:t xml:space="preserve">Ulic Qel-Droma · Liana Merian · Agrippa Aldrete</w:t>
+            </w:r>
+            <w:r>
+              <w:t xml:space="preserve"> → cible </w:t>
+            </w:r>
+            <w:r>
+              <w:rPr>
+                <w:b/>
+                <w:bCs/>
+              </w:rPr>
+              <w:t xml:space="preserve">18 entrées</w:t>
+            </w:r>
+            <w:r>
+              <w:t xml:space="preserve"> sur 78.</w:t>
+            </w:r>
+          </w:p>
+          <w:p>
+            <w:pPr>
+              <w:pStyle w:val="ListParagraph"/>
+              <w:numPr>
+                <w:ilvl w:val="0"/>
+                <w:numId w:val="2"/>
+              </w:numPr>
+              <w:spacing w:after="40" w:line="252"/>
+            </w:pPr>
+            <w:r>
+              <w:rPr>
+                <w:b/>
+                <w:bCs/>
+              </w:rPr>
+              <w:t xml:space="preserve">(b)</w:t>
+            </w:r>
+            <w:r>
+              <w:t xml:space="preserve"> Galerie de maintenance → </w:t>
+            </w:r>
+            <w:r>
+              <w:rPr>
+                <w:b/>
+                <w:bCs/>
+              </w:rPr>
+              <w:t xml:space="preserve">ORPHELINS</w:t>
+            </w:r>
+            <w:r>
+              <w:t xml:space="preserve"> (fresque + carré de Polybe LOTUS) → clé </w:t>
+            </w:r>
+            <w:r>
+              <w:rPr>
+                <w:b/>
+                <w:bCs/>
+              </w:rPr>
+              <w:t xml:space="preserve">Coordonnées</w:t>
+            </w:r>
+            <w:r>
+              <w:t xml:space="preserve">.</w:t>
+            </w:r>
+          </w:p>
+          <w:p>
+            <w:pPr>
+              <w:pStyle w:val="ListParagraph"/>
+              <w:numPr>
+                <w:ilvl w:val="0"/>
+                <w:numId w:val="2"/>
+              </w:numPr>
+              <w:spacing w:after="40" w:line="252"/>
+            </w:pPr>
+            <w:r>
+              <w:rPr>
+                <w:b/>
+                <w:bCs/>
+              </w:rPr>
+              <w:t xml:space="preserve">(c)</w:t>
+            </w:r>
+            <w:r>
+              <w:t xml:space="preserve"> Centre sportif → </w:t>
+            </w:r>
+            <w:r>
+              <w:rPr>
+                <w:b/>
+                <w:bCs/>
+              </w:rPr>
+              <w:t xml:space="preserve">JENESUISPLUSSEULEICI</w:t>
+            </w:r>
+            <w:r>
+              <w:t xml:space="preserve"> (pentaminos, casier 12-3-20) → clé </w:t>
+            </w:r>
+            <w:r>
+              <w:rPr>
+                <w:b/>
+                <w:bCs/>
+              </w:rPr>
+              <w:t xml:space="preserve">Messages</w:t>
+            </w:r>
+            <w:r>
+              <w:t xml:space="preserve">.</w:t>
+            </w:r>
+          </w:p>
+          <w:p>
+            <w:pPr>
+              <w:pStyle w:val="ListParagraph"/>
+              <w:numPr>
+                <w:ilvl w:val="0"/>
+                <w:numId w:val="2"/>
+              </w:numPr>
+              <w:spacing w:after="40" w:line="252"/>
+            </w:pPr>
+            <w:r>
+              <w:rPr>
+                <w:b/>
+                <w:bCs/>
+              </w:rPr>
+              <w:t xml:space="preserve">(d)</w:t>
+            </w:r>
+            <w:r>
+              <w:t xml:space="preserve"> Mess → </w:t>
+            </w:r>
+            <w:r>
+              <w:rPr>
+                <w:b/>
+                <w:bCs/>
+              </w:rPr>
+              <w:t xml:space="preserve">RépubliqueRetour</w:t>
+            </w:r>
+            <w:r>
+              <w:t xml:space="preserve"> + </w:t>
+            </w:r>
+            <w:r>
+              <w:rPr>
+                <w:b/>
+                <w:bCs/>
+              </w:rPr>
+              <w:t xml:space="preserve">Argon2</w:t>
+            </w:r>
+            <w:r>
+              <w:t xml:space="preserve"> (3 paires d'annonces) → </w:t>
+            </w:r>
+            <w:r>
+              <w:rPr>
+                <w:b/>
+                <w:bCs/>
+              </w:rPr>
+              <w:t xml:space="preserve">clé maître</w:t>
+            </w:r>
+            <w:r>
+              <w:t xml:space="preserve">.</w:t>
+            </w:r>
+          </w:p>
+          <w:p>
+            <w:pPr>
+              <w:pStyle w:val="ListParagraph"/>
+              <w:numPr>
+                <w:ilvl w:val="0"/>
+                <w:numId w:val="2"/>
+              </w:numPr>
+              <w:spacing w:after="40" w:line="252"/>
+            </w:pPr>
+            <w:r>
+              <w:rPr>
+                <w:b/>
+                <w:bCs/>
+              </w:rPr>
+              <w:t xml:space="preserve">Bafouille assemble</w:t>
+            </w:r>
+            <w:r>
+              <w:t xml:space="preserve"> → RépubliqueRetour + Argon2 + ORPHELINS = </w:t>
+            </w:r>
+            <w:r>
+              <w:rPr>
+                <w:i/>
+                <w:iCs/>
+              </w:rPr>
+              <w:t xml:space="preserve">Coordonnées</w:t>
+            </w:r>
+            <w:r>
+              <w:t xml:space="preserve"> ; + JENESUISPLUSSEULEICI = </w:t>
+            </w:r>
+            <w:r>
+              <w:rPr>
+                <w:i/>
+                <w:iCs/>
+              </w:rPr>
+              <w:t xml:space="preserve">Messages</w:t>
+            </w:r>
+            <w:r>
+              <w:t xml:space="preserve">.</w:t>
+            </w:r>
+          </w:p>
+          <w:p>
+            <w:pPr>
+              <w:pStyle w:val="ListParagraph"/>
+              <w:numPr>
+                <w:ilvl w:val="0"/>
+                <w:numId w:val="2"/>
+              </w:numPr>
+              <w:spacing w:after="40" w:line="252"/>
+            </w:pPr>
+            <w:r>
+              <w:rPr>
+                <w:b/>
+                <w:bCs/>
+              </w:rPr>
+              <w:t xml:space="preserve">Résultat</w:t>
+            </w:r>
+            <w:r>
+              <w:t xml:space="preserve"> → le journal-trésor en clair : Projet Faucheur + coordonnées de la base </w:t>
+            </w:r>
+            <w:r>
+              <w:rPr>
+                <w:b/>
+                <w:bCs/>
+              </w:rPr>
+              <w:t xml:space="preserve">L-14</w:t>
+            </w:r>
+            <w:r>
+              <w:t xml:space="preserve">.</w:t>
             </w:r>
           </w:p>
         </w:tc>

</xml_diff>